<commit_message>
Bring the README, publication note, and license current
- README.md at the root now carries the current v0.6.1 GOPEL README
  (183 tests), which had been uploaded as haia_agent/README (1).md, plus
  the repository layout note; the v0.6.0 text it replaces said 171 tests
- haia_agent/gopel/README (1).md is renamed README.md so GitHub shows it
- The second security suite is listed at 29 tests, the number it runs
- PUBLICATION_NOTE.md at the root now matches the current note
- LICENSE, LICENSE.txt, both READMEs, and both publication notes move from
  CC BY-NC 4.0 to CC BY-NC-SA 4.0 with the license statement of
  September 15, 2026
- The HAIA Agents paper moves to v1.3, which links its code section to
  haia_agent/

Co-Authored-By: Claude Opus 5.5 <noreply@anthropic.com>
Claude-Session: https://claude.ai/code/session_014NNjMNksZ3w32AQzpFvQAV
</commit_message>
<xml_diff>
--- a/HAIA Agents From the Definition Problem to Running Code.docx
+++ b/HAIA Agents From the Definition Problem to Running Code.docx
@@ -2534,7 +2534,7 @@
         </w:rPr>
         <w:t xml:space="preserve">Both Alpha releases are published on </w:t>
       </w:r>
-      <w:hyperlink w:history="1" r:id="rIduyijiwibzuuhxwjvopt07">
+      <w:hyperlink w:history="1" r:id="rIdkhr4uydp0khks3btu8mjl">
         <w:r>
           <w:rPr>
             <w:rStyle w:val="Hyperlink"/>
@@ -2551,7 +2551,7 @@
           <w:sz w:val="24"/>
           <w:szCs w:val="24"/>
         </w:rPr>
-        <w:t xml:space="preserve"> in the author’s HAIA repository, the same repository that holds the GOPEL reference code, so the agent models and the enforcement layer that HAIA Agents names sit side by side. Each program sits beside the checks this paper reports, and those checks run offline against canned platforms, search results, and pages, with no live AI provider or account. A reader can rerun the 379 checks for Agent Model 1 and the 386 internal checks and 22 browser checks for Agent Model 2 before connecting anything, and the header of each program states what it needs, how to run it, and what it cannot do.</w:t>
+        <w:t xml:space="preserve"> in the HAIA Agents folder of the author’s HAIA repository, where the agent models and the GOPEL reference code sit side by side in separate subfolders. Each program sits beside the checks this paper reports, and those checks run offline against canned platforms, search results, and pages, with no live AI provider or account. A reader can rerun the 379 checks for Agent Model 1 and the 386 internal checks and 22 browser checks for Agent Model 2 before connecting anything, and the header of each program states what it needs, how to run it, and what it cannot do.</w:t>
       </w:r>
     </w:p>
     <w:p>
@@ -2643,7 +2643,7 @@
         </w:rPr>
         <w:t xml:space="preserve">. basilpuglisi.com. </w:t>
       </w:r>
-      <w:hyperlink w:history="1" r:id="rId5rw-si8kfa91sbcgkmqpk">
+      <w:hyperlink w:history="1" r:id="rIddyus_pnttj3yelifx9kmc">
         <w:r>
           <w:rPr>
             <w:rStyle w:val="Hyperlink"/>
@@ -2690,7 +2690,7 @@
         </w:rPr>
         <w:t xml:space="preserve">. basilpuglisi.com. </w:t>
       </w:r>
-      <w:hyperlink w:history="1" r:id="rIdltkx4srmw34jl6whc_hgt">
+      <w:hyperlink w:history="1" r:id="rIdosdcz47-u5vt4mhj2d8mu">
         <w:r>
           <w:rPr>
             <w:rStyle w:val="Hyperlink"/>
@@ -2737,7 +2737,7 @@
         </w:rPr>
         <w:t xml:space="preserve">. Bradley Law Insights. </w:t>
       </w:r>
-      <w:hyperlink w:history="1" r:id="rIdnta-xc-oztwukr2sun_vx">
+      <w:hyperlink w:history="1" r:id="rIdr2rp1iajctnulxxv9dirs">
         <w:r>
           <w:rPr>
             <w:rStyle w:val="Hyperlink"/>
@@ -2784,7 +2784,7 @@
         </w:rPr>
         <w:t xml:space="preserve">. </w:t>
       </w:r>
-      <w:hyperlink w:history="1" r:id="rIdlfj1aq_ygknha-o5gerpi">
+      <w:hyperlink w:history="1" r:id="rIduurw-85cpp1yab26ckruf">
         <w:r>
           <w:rPr>
             <w:rStyle w:val="Hyperlink"/>
@@ -2831,7 +2831,7 @@
         </w:rPr>
         <w:t xml:space="preserve">. Official Journal of the European Union. </w:t>
       </w:r>
-      <w:hyperlink w:history="1" r:id="rIdibjy8bd34_5lpwhhqq7cu">
+      <w:hyperlink w:history="1" r:id="rIdv5kxd-byexiwjpu_ewfjh">
         <w:r>
           <w:rPr>
             <w:rStyle w:val="Hyperlink"/>
@@ -2878,7 +2878,7 @@
         </w:rPr>
         <w:t xml:space="preserve">. </w:t>
       </w:r>
-      <w:hyperlink w:history="1" r:id="rIdtkofe3gwbstg8sy5l8kxl">
+      <w:hyperlink w:history="1" r:id="rIdi3qbg_oe4_jozqriv-881">
         <w:r>
           <w:rPr>
             <w:rStyle w:val="Hyperlink"/>
@@ -2925,7 +2925,7 @@
         </w:rPr>
         <w:t xml:space="preserve">. ITU Publications. </w:t>
       </w:r>
-      <w:hyperlink w:history="1" r:id="rIdvregnjqgd05w19f3z-jdd">
+      <w:hyperlink w:history="1" r:id="rIdrz4jt3qwji8chmd6gobck">
         <w:r>
           <w:rPr>
             <w:rStyle w:val="Hyperlink"/>
@@ -2972,7 +2972,7 @@
         </w:rPr>
         <w:t xml:space="preserve">(12), 2346-2363. </w:t>
       </w:r>
-      <w:hyperlink w:history="1" r:id="rId_ynv_kpp-ecdoiaxkerdf">
+      <w:hyperlink w:history="1" r:id="rIdsrgljjtvp_dnyi_embeqm">
         <w:r>
           <w:rPr>
             <w:rStyle w:val="Hyperlink"/>
@@ -3019,7 +3019,7 @@
         </w:rPr>
         <w:t xml:space="preserve">. </w:t>
       </w:r>
-      <w:hyperlink w:history="1" r:id="rIdhzrkqcc87o-vq5tg25qpu">
+      <w:hyperlink w:history="1" r:id="rId9aqa5aynnf5tz5v_tsitl">
         <w:r>
           <w:rPr>
             <w:rStyle w:val="Hyperlink"/>
@@ -3066,7 +3066,7 @@
         </w:rPr>
         <w:t xml:space="preserve">. </w:t>
       </w:r>
-      <w:hyperlink w:history="1" r:id="rIdt6z36d4tlnatxehxsmc_g">
+      <w:hyperlink w:history="1" r:id="rIdefx2f3-qokon9cud2aw7a">
         <w:r>
           <w:rPr>
             <w:rStyle w:val="Hyperlink"/>
@@ -3113,7 +3113,7 @@
         </w:rPr>
         <w:t xml:space="preserve">. U.S. Department of Commerce. </w:t>
       </w:r>
-      <w:hyperlink w:history="1" r:id="rIdukxfmggaiomqypoxznzri">
+      <w:hyperlink w:history="1" r:id="rIdblfdflmlpxnrkxskapz5f">
         <w:r>
           <w:rPr>
             <w:rStyle w:val="Hyperlink"/>
@@ -3160,7 +3160,7 @@
         </w:rPr>
         <w:t xml:space="preserve">. </w:t>
       </w:r>
-      <w:hyperlink w:history="1" r:id="rId_-mzwb9-xou65wbafie_5">
+      <w:hyperlink w:history="1" r:id="rId0tndo05nhzprcqtmox2lg">
         <w:r>
           <w:rPr>
             <w:rStyle w:val="Hyperlink"/>
@@ -3207,7 +3207,7 @@
         </w:rPr>
         <w:t xml:space="preserve">. </w:t>
       </w:r>
-      <w:hyperlink w:history="1" r:id="rIdlxvpxdcsripckncwv0igj">
+      <w:hyperlink w:history="1" r:id="rId-jzyxbrvijtzehzn83s5y">
         <w:r>
           <w:rPr>
             <w:rStyle w:val="Hyperlink"/>
@@ -3254,7 +3254,7 @@
         </w:rPr>
         <w:t xml:space="preserve">(3), 381-410. </w:t>
       </w:r>
-      <w:hyperlink w:history="1" r:id="rIdbd1lletdojr1phkcc3gsl">
+      <w:hyperlink w:history="1" r:id="rIdgiereb5eztrbzzdxadvz3">
         <w:r>
           <w:rPr>
             <w:rStyle w:val="Hyperlink"/>
@@ -3301,7 +3301,7 @@
         </w:rPr>
         <w:t xml:space="preserve">. </w:t>
       </w:r>
-      <w:hyperlink w:history="1" r:id="rIdkwb2ms8w8u8sogyw25xq2">
+      <w:hyperlink w:history="1" r:id="rIdxwr6zhs0e_qgbf0_fbyhv">
         <w:r>
           <w:rPr>
             <w:rStyle w:val="Hyperlink"/>
@@ -3348,7 +3348,7 @@
         </w:rPr>
         <w:t xml:space="preserve">. </w:t>
       </w:r>
-      <w:hyperlink w:history="1" r:id="rId3hrigj2ce_0ratedkh2ko">
+      <w:hyperlink w:history="1" r:id="rIdw6okjs22i5ksyyxkw_vae">
         <w:r>
           <w:rPr>
             <w:rStyle w:val="Hyperlink"/>
@@ -3395,7 +3395,7 @@
         </w:rPr>
         <w:t xml:space="preserve">. Stanford University. </w:t>
       </w:r>
-      <w:hyperlink w:history="1" r:id="rIdu6v0ze9j65mecj8_cpb7y">
+      <w:hyperlink w:history="1" r:id="rId9yhhbmesbdf5pikpknycn">
         <w:r>
           <w:rPr>
             <w:rStyle w:val="Hyperlink"/>
@@ -3442,7 +3442,7 @@
         </w:rPr>
         <w:t xml:space="preserve">. </w:t>
       </w:r>
-      <w:hyperlink w:history="1" r:id="rIdui_zjcp6yghejcj4lw3l7">
+      <w:hyperlink w:history="1" r:id="rIdrlewi_n8eilgktcm3vsmn">
         <w:r>
           <w:rPr>
             <w:rStyle w:val="Hyperlink"/>
@@ -3489,7 +3489,7 @@
         </w:rPr>
         <w:t xml:space="preserve"> </w:t>
       </w:r>
-      <w:hyperlink w:history="1" r:id="rIdgvwjkf31pqu6lukyk4jvl">
+      <w:hyperlink w:history="1" r:id="rIdtey1kcssjd512dakhorck">
         <w:r>
           <w:rPr>
             <w:rStyle w:val="Hyperlink"/>
@@ -3536,7 +3536,7 @@
         </w:rPr>
         <w:t xml:space="preserve">. </w:t>
       </w:r>
-      <w:hyperlink w:history="1" r:id="rIdqahw2rrf60iw9noe7njwg">
+      <w:hyperlink w:history="1" r:id="rIdqieyqmmmgt8qg9q2fzi0u">
         <w:r>
           <w:rPr>
             <w:rStyle w:val="Hyperlink"/>
@@ -3580,7 +3580,7 @@
         </w:rPr>
         <w:t xml:space="preserve">. Medium. </w:t>
       </w:r>
-      <w:hyperlink w:history="1" r:id="rIdgjtgicbzpfw2dux9uh4ko">
+      <w:hyperlink w:history="1" r:id="rIdqmxzkvylfobyrxa4fjjqr">
         <w:r>
           <w:rPr>
             <w:rStyle w:val="Hyperlink"/>
@@ -3627,7 +3627,7 @@
         </w:rPr>
         <w:t xml:space="preserve">. basilpuglisi.com. </w:t>
       </w:r>
-      <w:hyperlink w:history="1" r:id="rId6cxtl4sz3ki7uqxr7jm3z">
+      <w:hyperlink w:history="1" r:id="rIdrdpykmcdwajwrkha34gnc">
         <w:r>
           <w:rPr>
             <w:rStyle w:val="Hyperlink"/>
@@ -3674,7 +3674,7 @@
         </w:rPr>
         <w:t xml:space="preserve">. </w:t>
       </w:r>
-      <w:hyperlink w:history="1" r:id="rIdvkiqkaw1ph2hopafrq1-y">
+      <w:hyperlink w:history="1" r:id="rIdezaqylamqnzrtmeqivmue">
         <w:r>
           <w:rPr>
             <w:rStyle w:val="Hyperlink"/>
@@ -3721,7 +3721,7 @@
         </w:rPr>
         <w:t xml:space="preserve">(7), 100779. </w:t>
       </w:r>
-      <w:hyperlink w:history="1" r:id="rIdq5feqsrxy8jjlafq4d-yt">
+      <w:hyperlink w:history="1" r:id="rId_adhmqkto1ko8srpjhuej">
         <w:r>
           <w:rPr>
             <w:rStyle w:val="Hyperlink"/>
@@ -3768,7 +3768,7 @@
         </w:rPr>
         <w:t xml:space="preserve">, Article 26. </w:t>
       </w:r>
-      <w:hyperlink w:history="1" r:id="rIdxkk6uvr6fnbsv219pwji-">
+      <w:hyperlink w:history="1" r:id="rId0ax3_r0qxoh3ge36_ewey">
         <w:r>
           <w:rPr>
             <w:rStyle w:val="Hyperlink"/>
@@ -3812,7 +3812,7 @@
         </w:rPr>
         <w:t xml:space="preserve">. basilpuglisi.com. </w:t>
       </w:r>
-      <w:hyperlink w:history="1" r:id="rIdoxzpep-gzs6fvuf5744pt">
+      <w:hyperlink w:history="1" r:id="rIdeye4ej7vugrpucoztg4u1">
         <w:r>
           <w:rPr>
             <w:rStyle w:val="Hyperlink"/>
@@ -3859,7 +3859,7 @@
         </w:rPr>
         <w:t xml:space="preserve">. basilpuglisi.com. </w:t>
       </w:r>
-      <w:hyperlink w:history="1" r:id="rIdbuufae_tjtlvz99ithgbi">
+      <w:hyperlink w:history="1" r:id="rIdwcqqrjmvfvqqspclaqn4d">
         <w:r>
           <w:rPr>
             <w:rStyle w:val="Hyperlink"/>
@@ -3906,7 +3906,7 @@
         </w:rPr>
         <w:t xml:space="preserve">, 3265-3279. </w:t>
       </w:r>
-      <w:hyperlink w:history="1" r:id="rIdq1_afcghgmo-k5i_liplz">
+      <w:hyperlink w:history="1" r:id="rIdxwcopbsepv3ugu4qwx2nt">
         <w:r>
           <w:rPr>
             <w:rStyle w:val="Hyperlink"/>
@@ -3989,7 +3989,7 @@
         </w:rPr>
         <w:t xml:space="preserve">. </w:t>
       </w:r>
-      <w:hyperlink w:history="1" r:id="rIdvlxkoik_jggry6qgd28vy">
+      <w:hyperlink w:history="1" r:id="rIdhqhcezpzjvt68vyd5s6ij">
         <w:r>
           <w:rPr>
             <w:rStyle w:val="Hyperlink"/>
@@ -4036,7 +4036,7 @@
         </w:rPr>
         <w:t xml:space="preserve">. </w:t>
       </w:r>
-      <w:hyperlink w:history="1" r:id="rIdyk33a8-u6hfvw6d4r7wax">
+      <w:hyperlink w:history="1" r:id="rId2cihrufbp214feavk-itc">
         <w:r>
           <w:rPr>
             <w:rStyle w:val="Hyperlink"/>
@@ -4083,7 +4083,7 @@
         </w:rPr>
         <w:t xml:space="preserve">(2). </w:t>
       </w:r>
-      <w:hyperlink w:history="1" r:id="rIdwbyilroq_qkbrohvcztnr">
+      <w:hyperlink w:history="1" r:id="rIdubvys-mfdo45xyrze-pgm">
         <w:r>
           <w:rPr>
             <w:rStyle w:val="Hyperlink"/>
@@ -4166,7 +4166,7 @@
         </w:rPr>
         <w:t xml:space="preserve">. </w:t>
       </w:r>
-      <w:hyperlink w:history="1" r:id="rId6rx4rj8w1wjvoymlgzy08">
+      <w:hyperlink w:history="1" r:id="rId0ltss3waocscjrjtcauai">
         <w:r>
           <w:rPr>
             <w:rStyle w:val="Hyperlink"/>
@@ -4213,7 +4213,7 @@
         </w:rPr>
         <w:t xml:space="preserve">. </w:t>
       </w:r>
-      <w:hyperlink w:history="1" r:id="rIdfucosc1idyu1pwlv7ytd0">
+      <w:hyperlink w:history="1" r:id="rIdxftwo75fiwsmimkgodqt6">
         <w:r>
           <w:rPr>
             <w:rStyle w:val="Hyperlink"/>
@@ -4260,7 +4260,7 @@
         </w:rPr>
         <w:t xml:space="preserve">. </w:t>
       </w:r>
-      <w:hyperlink w:history="1" r:id="rIdz_i4glckcd0x_lyw-7y9d">
+      <w:hyperlink w:history="1" r:id="rIdzyhpg_pew01x-zpfvuvjm">
         <w:r>
           <w:rPr>
             <w:rStyle w:val="Hyperlink"/>
@@ -4307,7 +4307,7 @@
         </w:rPr>
         <w:t xml:space="preserve">, 389-399. </w:t>
       </w:r>
-      <w:hyperlink w:history="1" r:id="rId3fiverbzzuicfsejlpq-o">
+      <w:hyperlink w:history="1" r:id="rIdt5jvrssptyon0rqsnwqtm">
         <w:r>
           <w:rPr>
             <w:rStyle w:val="Hyperlink"/>
@@ -4354,7 +4354,7 @@
         </w:rPr>
         <w:t xml:space="preserve">. Oxford Academic. </w:t>
       </w:r>
-      <w:hyperlink w:history="1" r:id="rIdo3z-zldww_a0vfy7vzqmi">
+      <w:hyperlink w:history="1" r:id="rId_44sohynntegxrwuu3tro">
         <w:r>
           <w:rPr>
             <w:rStyle w:val="Hyperlink"/>
@@ -4401,7 +4401,7 @@
         </w:rPr>
         <w:t xml:space="preserve">. </w:t>
       </w:r>
-      <w:hyperlink w:history="1" r:id="rIdi3iel4yvw9ovdsxx75ryt">
+      <w:hyperlink w:history="1" r:id="rId1lzul83y6dkhywkvi_maz">
         <w:r>
           <w:rPr>
             <w:rStyle w:val="Hyperlink"/>
@@ -4448,7 +4448,7 @@
         </w:rPr>
         <w:t xml:space="preserve">. </w:t>
       </w:r>
-      <w:hyperlink w:history="1" r:id="rId32vvrqkmwza7r_nunt7fe">
+      <w:hyperlink w:history="1" r:id="rIdomns1ey_oefavpktell2u">
         <w:r>
           <w:rPr>
             <w:rStyle w:val="Hyperlink"/>
@@ -4495,7 +4495,7 @@
         </w:rPr>
         <w:t xml:space="preserve">. </w:t>
       </w:r>
-      <w:hyperlink w:history="1" r:id="rIdmat3_fwprklvchznjzsqq">
+      <w:hyperlink w:history="1" r:id="rIdirq3hltg4bvqa7ylhsho5">
         <w:r>
           <w:rPr>
             <w:rStyle w:val="Hyperlink"/>
@@ -4542,7 +4542,7 @@
         </w:rPr>
         <w:t xml:space="preserve"> (OECD/LEGAL/0449, amended 2024). </w:t>
       </w:r>
-      <w:hyperlink w:history="1" r:id="rIdyxq6xxm_qifemkzp49bat">
+      <w:hyperlink w:history="1" r:id="rId5vl1wx_dyp_zwrkgvqxat">
         <w:r>
           <w:rPr>
             <w:rStyle w:val="Hyperlink"/>
@@ -4589,7 +4589,7 @@
         </w:rPr>
         <w:t xml:space="preserve">. </w:t>
       </w:r>
-      <w:hyperlink w:history="1" r:id="rIdmvcpudlco32x08kcyv3zg">
+      <w:hyperlink w:history="1" r:id="rIdp_uvbtllsaekg_edu4jsq">
         <w:r>
           <w:rPr>
             <w:rStyle w:val="Hyperlink"/>
@@ -4636,7 +4636,7 @@
         </w:rPr>
         <w:t xml:space="preserve">(26). </w:t>
       </w:r>
-      <w:hyperlink w:history="1" r:id="rIdi4upawwr_zolgvlhup0qv">
+      <w:hyperlink w:history="1" r:id="rId0-rqayxgx9nrfsymc_li8">
         <w:r>
           <w:rPr>
             <w:rStyle w:val="Hyperlink"/>
@@ -4683,7 +4683,7 @@
         </w:rPr>
         <w:t xml:space="preserve">. </w:t>
       </w:r>
-      <w:hyperlink w:history="1" r:id="rIdy5funk9bsiqrkkxj9xnpt">
+      <w:hyperlink w:history="1" r:id="rIdsc9jhh44kkwreogxijpml">
         <w:r>
           <w:rPr>
             <w:rStyle w:val="Hyperlink"/>
@@ -4763,7 +4763,7 @@
         </w:rPr>
         <w:t xml:space="preserve">. basilpuglisi.com. </w:t>
       </w:r>
-      <w:hyperlink w:history="1" r:id="rId08zhimtuhbj8_u_gunxtz">
+      <w:hyperlink w:history="1" r:id="rIdt_of-_quygu8w_7ccqaqo">
         <w:r>
           <w:rPr>
             <w:rStyle w:val="Hyperlink"/>
@@ -5187,7 +5187,7 @@
         </w:rPr>
         <w:t xml:space="preserve">. basilpuglisi.com. </w:t>
       </w:r>
-      <w:hyperlink w:history="1" r:id="rIdw-zu0zbter68cpl5i9w6f">
+      <w:hyperlink w:history="1" r:id="rIdrnnuhrc3wh8bl8-ju4gyw">
         <w:r>
           <w:rPr>
             <w:rStyle w:val="Hyperlink"/>
@@ -5234,7 +5234,7 @@
         </w:rPr>
         <w:t xml:space="preserve">(9), 1-18. </w:t>
       </w:r>
-      <w:hyperlink w:history="1" r:id="rIdu_wfp8uvemxau6brfwwkv">
+      <w:hyperlink w:history="1" r:id="rIdl9mckpiypb4oevswydgpd">
         <w:r>
           <w:rPr>
             <w:rStyle w:val="Hyperlink"/>
@@ -5353,7 +5353,7 @@
         </w:rPr>
         <w:t xml:space="preserve">(1), 121-127. </w:t>
       </w:r>
-      <w:hyperlink w:history="1" r:id="rIdl8svsfs_-7xgwbo0hq2et">
+      <w:hyperlink w:history="1" r:id="rId-1bv6kbpqdumcqqirhhkr">
         <w:r>
           <w:rPr>
             <w:rStyle w:val="Hyperlink"/>
@@ -5433,7 +5433,7 @@
         </w:rPr>
         <w:t xml:space="preserve">. basilpuglisi.com. </w:t>
       </w:r>
-      <w:hyperlink w:history="1" r:id="rIdg6kpsfwowvrlgnfchqrxt">
+      <w:hyperlink w:history="1" r:id="rId8t150_ytfxnx0tdy-1epz">
         <w:r>
           <w:rPr>
             <w:rStyle w:val="Hyperlink"/>
@@ -5480,7 +5480,7 @@
         </w:rPr>
         <w:t xml:space="preserve">. </w:t>
       </w:r>
-      <w:hyperlink w:history="1" r:id="rIdprr2aodmohm55qbqplle2">
+      <w:hyperlink w:history="1" r:id="rIdf9xdsobaag0acodfnmm_s">
         <w:r>
           <w:rPr>
             <w:rStyle w:val="Hyperlink"/>
@@ -5527,7 +5527,7 @@
         </w:rPr>
         <w:t xml:space="preserve"> (arXiv:2212.08073). </w:t>
       </w:r>
-      <w:hyperlink w:history="1" r:id="rIdscitpk9l_gdzr3qqb0see">
+      <w:hyperlink w:history="1" r:id="rIdrkamyb5qtsdvhe0sr7ei-">
         <w:r>
           <w:rPr>
             <w:rStyle w:val="Hyperlink"/>
@@ -5610,7 +5610,7 @@
         </w:rPr>
         <w:t xml:space="preserve">. </w:t>
       </w:r>
-      <w:hyperlink w:history="1" r:id="rId8disjku93rlzvthrfcghe">
+      <w:hyperlink w:history="1" r:id="rIdiebgb7f1geyk72ecx6z_f">
         <w:r>
           <w:rPr>
             <w:rStyle w:val="Hyperlink"/>
@@ -5639,7 +5639,7 @@
         </w:rPr>
         <w:t xml:space="preserve">EU AI Act, Article 14 (Human oversight by natural persons for high-risk systems). </w:t>
       </w:r>
-      <w:hyperlink w:history="1" r:id="rId_e2trw_c9rnisnpzhvl8-">
+      <w:hyperlink w:history="1" r:id="rIdjebgomxlhzdfowjsajrjj">
         <w:r>
           <w:rPr>
             <w:rStyle w:val="Hyperlink"/>
@@ -5758,7 +5758,7 @@
         </w:rPr>
         <w:t xml:space="preserve">. </w:t>
       </w:r>
-      <w:hyperlink w:history="1" r:id="rIdmjharktp_8_puoe4jlyoy">
+      <w:hyperlink w:history="1" r:id="rId1wo_nrmkjck5gpxgtsryg">
         <w:r>
           <w:rPr>
             <w:rStyle w:val="Hyperlink"/>
@@ -5805,7 +5805,7 @@
         </w:rPr>
         <w:t xml:space="preserve">. </w:t>
       </w:r>
-      <w:hyperlink w:history="1" r:id="rIdz_ggigbuhcu-0i2j1d7mx">
+      <w:hyperlink w:history="1" r:id="rIdnuic9exyakua2exr5u1j4">
         <w:r>
           <w:rPr>
             <w:rStyle w:val="Hyperlink"/>
@@ -5834,7 +5834,7 @@
         </w:rPr>
         <w:t xml:space="preserve">ISO 37000:2021 (Governance as accountability, decision-making authority, stakeholder expectations). </w:t>
       </w:r>
-      <w:hyperlink w:history="1" r:id="rIdrnggbmm-dx7d36jomyti0">
+      <w:hyperlink w:history="1" r:id="rIddlgzhzsxmb3afsfnqozhy">
         <w:r>
           <w:rPr>
             <w:rStyle w:val="Hyperlink"/>
@@ -5863,7 +5863,7 @@
         </w:rPr>
         <w:t xml:space="preserve">ISO/IEC 38500:2024 (IT governance framework, decision-making structures). </w:t>
       </w:r>
-      <w:hyperlink w:history="1" r:id="rIdmwuhuvsoy0knzmshjdtyo">
+      <w:hyperlink w:history="1" r:id="rIdkizdcpb8lwwg5q6gqbfbn">
         <w:r>
           <w:rPr>
             <w:rStyle w:val="Hyperlink"/>
@@ -5892,7 +5892,7 @@
         </w:rPr>
         <w:t xml:space="preserve">ISO/IEC 38500:2024 White Paper (Governance framework definition from ISO 37000). </w:t>
       </w:r>
-      <w:hyperlink w:history="1" r:id="rId4csv_akffylmjigucka1j">
+      <w:hyperlink w:history="1" r:id="rIdirw3n1ekvycvbuxbibfpt">
         <w:r>
           <w:rPr>
             <w:rStyle w:val="Hyperlink"/>
@@ -5921,7 +5921,7 @@
         </w:rPr>
         <w:t xml:space="preserve">ISO/IEC 38507:2022 (Governance implications of AI use). </w:t>
       </w:r>
-      <w:hyperlink w:history="1" r:id="rId0bvnp92wjsuxvoukbang8">
+      <w:hyperlink w:history="1" r:id="rIdgdobscejulbzgd6nosy46">
         <w:r>
           <w:rPr>
             <w:rStyle w:val="Hyperlink"/>
@@ -5950,7 +5950,7 @@
         </w:rPr>
         <w:t xml:space="preserve">ISO/IEC 42001:2023 (AI management systems). </w:t>
       </w:r>
-      <w:hyperlink w:history="1" r:id="rIdtcurb9o_nkghu4mbdzp9b">
+      <w:hyperlink w:history="1" r:id="rIdpc9ogonlnlugnnj97bfil">
         <w:r>
           <w:rPr>
             <w:rStyle w:val="Hyperlink"/>
@@ -5979,7 +5979,7 @@
         </w:rPr>
         <w:t xml:space="preserve">Jobin, A., Ienca, M., &amp; Vayena, E. (2019). Global landscape of 84 AI ethics guidelines. </w:t>
       </w:r>
-      <w:hyperlink w:history="1" r:id="rIdgalvzjc9qhpb9ai_pv6pb">
+      <w:hyperlink w:history="1" r:id="rIdv6fmnh4dxtrrkl6uoa5yr">
         <w:r>
           <w:rPr>
             <w:rStyle w:val="Hyperlink"/>
@@ -6008,7 +6008,7 @@
         </w:rPr>
         <w:t xml:space="preserve">Maas, M. (2025). Global AI governance architecture. Oxford Academic. </w:t>
       </w:r>
-      <w:hyperlink w:history="1" r:id="rIdf-g6laexwq1cbtqtkmqvf">
+      <w:hyperlink w:history="1" r:id="rId9jxp9gozucxxg4no_naye">
         <w:r>
           <w:rPr>
             <w:rStyle w:val="Hyperlink"/>
@@ -6037,7 +6037,7 @@
         </w:rPr>
         <w:t xml:space="preserve">NIST AI 600-1 Generative AI Profile. </w:t>
       </w:r>
-      <w:hyperlink w:history="1" r:id="rId8xwud36wkyqwgbgydodq-">
+      <w:hyperlink w:history="1" r:id="rIdj1kohfoccuaeogrotit5g">
         <w:r>
           <w:rPr>
             <w:rStyle w:val="Hyperlink"/>
@@ -6066,7 +6066,7 @@
         </w:rPr>
         <w:t xml:space="preserve">NIST AI RMF 1.0. </w:t>
       </w:r>
-      <w:hyperlink w:history="1" r:id="rId7mmzg-xh2ymehvogqdlax">
+      <w:hyperlink w:history="1" r:id="rIdy48gzuceitkhumrz-smtm">
         <w:r>
           <w:rPr>
             <w:rStyle w:val="Hyperlink"/>
@@ -6095,7 +6095,7 @@
         </w:rPr>
         <w:t xml:space="preserve">OECD AI Principles. </w:t>
       </w:r>
-      <w:hyperlink w:history="1" r:id="rIdfqoztmd5rfjlli-yo-vmw">
+      <w:hyperlink w:history="1" r:id="rIdingwz63z8xrs4phz5bdjc">
         <w:r>
           <w:rPr>
             <w:rStyle w:val="Hyperlink"/>
@@ -6124,7 +6124,7 @@
         </w:rPr>
         <w:t xml:space="preserve">PMC. (2021). Companies committed to responsible AI. </w:t>
       </w:r>
-      <w:hyperlink w:history="1" r:id="rId6bsbx0qrlhw6kuz1_2ycl">
+      <w:hyperlink w:history="1" r:id="rIdre5-lbrduebyzpbmau9sm">
         <w:r>
           <w:rPr>
             <w:rStyle w:val="Hyperlink"/>
@@ -6153,7 +6153,7 @@
         </w:rPr>
         <w:t xml:space="preserve">Stix, C. (2022). Terminological history of trustworthy, ethical, and responsible AI. </w:t>
       </w:r>
-      <w:hyperlink w:history="1" r:id="rIdl5ilnmxt94hhqrm_joosw">
+      <w:hyperlink w:history="1" r:id="rIdx9bgkrv3nlm3fowejsw6r">
         <w:r>
           <w:rPr>
             <w:rStyle w:val="Hyperlink"/>
@@ -6182,7 +6182,7 @@
         </w:rPr>
         <w:t xml:space="preserve">UNESCO Recommendation on the Ethics of AI. </w:t>
       </w:r>
-      <w:hyperlink w:history="1" r:id="rIdkepvi1j_c51nwqbedeo4t">
+      <w:hyperlink w:history="1" r:id="rIdp2yb7vrsdohgtqrkxi9id">
         <w:r>
           <w:rPr>
             <w:rStyle w:val="Hyperlink"/>
@@ -6226,7 +6226,7 @@
         </w:rPr>
         <w:t xml:space="preserve">. basilpuglisi.com. </w:t>
       </w:r>
-      <w:hyperlink w:history="1" r:id="rIdxv_q_fjdmcgcvuq3hvi_g">
+      <w:hyperlink w:history="1" r:id="rId8n2qgzelddob_magrcwig">
         <w:r>
           <w:rPr>
             <w:rStyle w:val="Hyperlink"/>
@@ -6273,7 +6273,7 @@
         </w:rPr>
         <w:t xml:space="preserve">. basilpuglisi.com. </w:t>
       </w:r>
-      <w:hyperlink w:history="1" r:id="rId1vqmy6bn-z8sjopc2uhyc">
+      <w:hyperlink w:history="1" r:id="rIdpy6b7osjoszkk3jwk9-6u">
         <w:r>
           <w:rPr>
             <w:rStyle w:val="Hyperlink"/>
@@ -6533,7 +6533,7 @@
         </w:rPr>
         <w:t xml:space="preserve">. basilpuglisi.com. </w:t>
       </w:r>
-      <w:hyperlink w:history="1" r:id="rIdkdz4sub9p57tzor4ahpfu">
+      <w:hyperlink w:history="1" r:id="rIdyg3h8er4sqvefqe6g8vh-">
         <w:r>
           <w:rPr>
             <w:rStyle w:val="Hyperlink"/>
@@ -6652,7 +6652,7 @@
         </w:rPr>
         <w:t xml:space="preserve">(9), 1-18. </w:t>
       </w:r>
-      <w:hyperlink w:history="1" r:id="rIdgcqufam8-l8yempuy9jy8">
+      <w:hyperlink w:history="1" r:id="rIderufo_9cncquefvlattcu">
         <w:r>
           <w:rPr>
             <w:rStyle w:val="Hyperlink"/>
@@ -6699,7 +6699,7 @@
         </w:rPr>
         <w:t xml:space="preserve">. Cambridge Elements. </w:t>
       </w:r>
-      <w:hyperlink w:history="1" r:id="rIdjwmgfn4ntuenpdkimzlf8">
+      <w:hyperlink w:history="1" r:id="rIdjmj7c_68xtso3cmzuxj7s">
         <w:r>
           <w:rPr>
             <w:rStyle w:val="Hyperlink"/>
@@ -6872,7 +6872,7 @@
         </w:rPr>
         <w:t xml:space="preserve">, Articles 12 and 14. Official Journal of the European Union. </w:t>
       </w:r>
-      <w:hyperlink w:history="1" r:id="rIdaat4mozsfkmaeuwujigv9">
+      <w:hyperlink w:history="1" r:id="rIdh3a1eu7kh8ngrqtqwcbt0">
         <w:r>
           <w:rPr>
             <w:rStyle w:val="Hyperlink"/>
@@ -6919,7 +6919,7 @@
         </w:rPr>
         <w:t xml:space="preserve">. </w:t>
       </w:r>
-      <w:hyperlink w:history="1" r:id="rIdmw6ccosjj5a-zqqimlxws">
+      <w:hyperlink w:history="1" r:id="rIdjvsqczd8ol7xuwfng9bqd">
         <w:r>
           <w:rPr>
             <w:rStyle w:val="Hyperlink"/>
@@ -7038,7 +7038,7 @@
         </w:rPr>
         <w:t xml:space="preserve">(1), 121-127. </w:t>
       </w:r>
-      <w:hyperlink w:history="1" r:id="rIdnena-1in9vgf_mfp7fy19">
+      <w:hyperlink w:history="1" r:id="rId1xom-icmfac2yyj1lcu7t">
         <w:r>
           <w:rPr>
             <w:rStyle w:val="Hyperlink"/>
@@ -7157,7 +7157,7 @@
         </w:rPr>
         <w:t xml:space="preserve">(2-3), 61-83. </w:t>
       </w:r>
-      <w:hyperlink w:history="1" r:id="rIdwpfeze1rvgyv2mhdo01jj">
+      <w:hyperlink w:history="1" r:id="rIdb35uaokvhvzguapxbkv_f">
         <w:r>
           <w:rPr>
             <w:rStyle w:val="Hyperlink"/>
@@ -7258,7 +7258,7 @@
         </w:rPr>
         <w:t xml:space="preserve">(2), sqae020. </w:t>
       </w:r>
-      <w:hyperlink w:history="1" r:id="rIduj_0lyv7z8or13cyri8hu">
+      <w:hyperlink w:history="1" r:id="rIdb9dt6vaf14yh-asg3pkk3">
         <w:r>
           <w:rPr>
             <w:rStyle w:val="Hyperlink"/>
@@ -7377,7 +7377,7 @@
         </w:rPr>
         <w:t xml:space="preserve">(5), 311-325. </w:t>
       </w:r>
-      <w:hyperlink w:history="1" r:id="rIdnfyjh-teypff4iur8wdnu">
+      <w:hyperlink w:history="1" r:id="rIdgubcmwpnxj-drxenmrccv">
         <w:r>
           <w:rPr>
             <w:rStyle w:val="Hyperlink"/>
@@ -7540,7 +7540,7 @@
         </w:rPr>
         <w:t xml:space="preserve">(3), 381-410. </w:t>
       </w:r>
-      <w:hyperlink w:history="1" r:id="rIdcgflffg4z_40uwv7eykmt">
+      <w:hyperlink w:history="1" r:id="rId9fw8v8xg52wmbgzq7ioqm">
         <w:r>
           <w:rPr>
             <w:rStyle w:val="Hyperlink"/>
@@ -7659,7 +7659,7 @@
         </w:rPr>
         <w:t xml:space="preserve">(3), 374-412. </w:t>
       </w:r>
-      <w:hyperlink w:history="1" r:id="rId7vou87e2rsjupknrra8r_">
+      <w:hyperlink w:history="1" r:id="rIdnm8vj_g0nvlizr06yt4vl">
         <w:r>
           <w:rPr>
             <w:rStyle w:val="Hyperlink"/>
@@ -7796,7 +7796,7 @@
         </w:rPr>
         <w:t xml:space="preserve">(9), pgae346. </w:t>
       </w:r>
-      <w:hyperlink w:history="1" r:id="rIdgnc7dg_qtul0qyjsaoppi">
+      <w:hyperlink w:history="1" r:id="rIdnx4c-iw9y57-0chu9kyzd">
         <w:r>
           <w:rPr>
             <w:rStyle w:val="Hyperlink"/>
@@ -7987,7 +7987,7 @@
         </w:rPr>
         <w:t xml:space="preserve">. </w:t>
       </w:r>
-      <w:hyperlink w:history="1" r:id="rIdwzhoingoo5hiyae2ms40a">
+      <w:hyperlink w:history="1" r:id="rIdti3mwgzbptfaswcssmx9y">
         <w:r>
           <w:rPr>
             <w:rStyle w:val="Hyperlink"/>
@@ -8067,7 +8067,7 @@
         </w:rPr>
         <w:t xml:space="preserve">. basilpuglisi.com. </w:t>
       </w:r>
-      <w:hyperlink w:history="1" r:id="rIdf_wih7llod-eeh9ves5j7">
+      <w:hyperlink w:history="1" r:id="rIdwqx-2yenierilzugvhclf">
         <w:r>
           <w:rPr>
             <w:rStyle w:val="Hyperlink"/>
@@ -8114,7 +8114,7 @@
         </w:rPr>
         <w:t xml:space="preserve">. Google. </w:t>
       </w:r>
-      <w:hyperlink w:history="1" r:id="rIddosxuqxz3s762edupz2jg">
+      <w:hyperlink w:history="1" r:id="rIdzozknwh66q89llmtykgwk">
         <w:r>
           <w:rPr>
             <w:rStyle w:val="Hyperlink"/>
@@ -8158,7 +8158,7 @@
         </w:rPr>
         <w:t xml:space="preserve">. basilpuglisi.com. </w:t>
       </w:r>
-      <w:hyperlink w:history="1" r:id="rIdcdyma_3xfunfaidmgm8od">
+      <w:hyperlink w:history="1" r:id="rIdqcktw3bbk0ny6j9edvpbq">
         <w:r>
           <w:rPr>
             <w:rStyle w:val="Hyperlink"/>
@@ -8205,7 +8205,7 @@
         </w:rPr>
         <w:t xml:space="preserve"> (arXiv:2605.29800). </w:t>
       </w:r>
-      <w:hyperlink w:history="1" r:id="rIdmt2y8en9hixem_ahw8r-_">
+      <w:hyperlink w:history="1" r:id="rIdjkqsd-hq5spx2pepa3qlr">
         <w:r>
           <w:rPr>
             <w:rStyle w:val="Hyperlink"/>
@@ -8252,7 +8252,7 @@
         </w:rPr>
         <w:t xml:space="preserve"> (arXiv:2605.00844). </w:t>
       </w:r>
-      <w:hyperlink w:history="1" r:id="rId3-exr8tnfl5yhoarkjx35">
+      <w:hyperlink w:history="1" r:id="rIdxie8km9b9oqarcg4aapsr">
         <w:r>
           <w:rPr>
             <w:rStyle w:val="Hyperlink"/>
@@ -8296,7 +8296,7 @@
         </w:rPr>
         <w:t xml:space="preserve">. basilpuglisi.com. </w:t>
       </w:r>
-      <w:hyperlink w:history="1" r:id="rIdelmgqrrfrc0rat-llsunb">
+      <w:hyperlink w:history="1" r:id="rIdkgro2tg8ks5puf_4ki3lx">
         <w:r>
           <w:rPr>
             <w:rStyle w:val="Hyperlink"/>
@@ -8340,7 +8340,7 @@
         </w:rPr>
         <w:t xml:space="preserve">. basilpuglisi.com. </w:t>
       </w:r>
-      <w:hyperlink w:history="1" r:id="rIdiycgxfax7uz7-swm16kpp">
+      <w:hyperlink w:history="1" r:id="rIdjzryla0wfsjo62gswfo3f">
         <w:r>
           <w:rPr>
             <w:rStyle w:val="Hyperlink"/>
@@ -8387,7 +8387,7 @@
         </w:rPr>
         <w:t xml:space="preserve">. arXiv. </w:t>
       </w:r>
-      <w:hyperlink w:history="1" r:id="rIdojj_uagwwknmg4uvasjgc">
+      <w:hyperlink w:history="1" r:id="rIdiomtmfxgw8gz5vjxwd2rm">
         <w:r>
           <w:rPr>
             <w:rStyle w:val="Hyperlink"/>
@@ -8434,7 +8434,7 @@
         </w:rPr>
         <w:t xml:space="preserve">. </w:t>
       </w:r>
-      <w:hyperlink w:history="1" r:id="rIdonmaheyh3zfdhmm2tzuf8">
+      <w:hyperlink w:history="1" r:id="rIdlxf8mbttul04qcjhw_zyi">
         <w:r>
           <w:rPr>
             <w:rStyle w:val="Hyperlink"/>
@@ -8481,7 +8481,7 @@
         </w:rPr>
         <w:t xml:space="preserve">. </w:t>
       </w:r>
-      <w:hyperlink w:history="1" r:id="rId502yoryxzu-az_vvjon7e">
+      <w:hyperlink w:history="1" r:id="rIdclnuc3cfeo4w5pqom-7xu">
         <w:r>
           <w:rPr>
             <w:rStyle w:val="Hyperlink"/>
@@ -8528,7 +8528,7 @@
         </w:rPr>
         <w:t xml:space="preserve"> (pp. 1-15). Springer. </w:t>
       </w:r>
-      <w:hyperlink w:history="1" r:id="rIdyrkxpa-8kww53djabod7p">
+      <w:hyperlink w:history="1" r:id="rIdi0m_2mwmu8ccmftzzpyp3">
         <w:r>
           <w:rPr>
             <w:rStyle w:val="Hyperlink"/>
@@ -8575,7 +8575,7 @@
         </w:rPr>
         <w:t xml:space="preserve">. High-Level Expert Group on Artificial Intelligence. </w:t>
       </w:r>
-      <w:hyperlink w:history="1" r:id="rIdiienz9w-c0pszbacms6oe">
+      <w:hyperlink w:history="1" r:id="rId_u9ywn4kel0c4uwsna_mz">
         <w:r>
           <w:rPr>
             <w:rStyle w:val="Hyperlink"/>
@@ -8622,7 +8622,7 @@
         </w:rPr>
         <w:t xml:space="preserve">. Official Journal of the European Union. </w:t>
       </w:r>
-      <w:hyperlink w:history="1" r:id="rId8czizlypmq852iysao7qi">
+      <w:hyperlink w:history="1" r:id="rIdpsaavszlxc0mxlsqhd8mg">
         <w:r>
           <w:rPr>
             <w:rStyle w:val="Hyperlink"/>
@@ -8669,7 +8669,7 @@
         </w:rPr>
         <w:t xml:space="preserve">. </w:t>
       </w:r>
-      <w:hyperlink w:history="1" r:id="rIdngomnlutihtph61sctvlk">
+      <w:hyperlink w:history="1" r:id="rIdqxovhuslqsb8g7vg19omy">
         <w:r>
           <w:rPr>
             <w:rStyle w:val="Hyperlink"/>
@@ -8716,7 +8716,7 @@
         </w:rPr>
         <w:t xml:space="preserve">(2-3), 61-83. </w:t>
       </w:r>
-      <w:hyperlink w:history="1" r:id="rId4zgc0uxidofbtwf9zeip6">
+      <w:hyperlink w:history="1" r:id="rIdngff-eg3y_pcgbdndwcmw">
         <w:r>
           <w:rPr>
             <w:rStyle w:val="Hyperlink"/>
@@ -8763,7 +8763,7 @@
         </w:rPr>
         <w:t xml:space="preserve">. IBM Think. </w:t>
       </w:r>
-      <w:hyperlink w:history="1" r:id="rIdiay9bswfadu7jxjsuxw5v">
+      <w:hyperlink w:history="1" r:id="rId4q0utg3k8z847sea1crny">
         <w:r>
           <w:rPr>
             <w:rStyle w:val="Hyperlink"/>
@@ -8810,7 +8810,7 @@
         </w:rPr>
         <w:t xml:space="preserve">. </w:t>
       </w:r>
-      <w:hyperlink w:history="1" r:id="rIdp6eo8eirxvx5vyrqzkzab">
+      <w:hyperlink w:history="1" r:id="rIdmab7qbdi49ranzlj2ivyx">
         <w:r>
           <w:rPr>
             <w:rStyle w:val="Hyperlink"/>
@@ -8857,7 +8857,7 @@
         </w:rPr>
         <w:t xml:space="preserve">. </w:t>
       </w:r>
-      <w:hyperlink w:history="1" r:id="rId4iyxpy_ewuw19ovl6laak">
+      <w:hyperlink w:history="1" r:id="rId7gfqnduuw0hbmnt8vzkdo">
         <w:r>
           <w:rPr>
             <w:rStyle w:val="Hyperlink"/>
@@ -8904,7 +8904,7 @@
         </w:rPr>
         <w:t xml:space="preserve">. arXiv. </w:t>
       </w:r>
-      <w:hyperlink w:history="1" r:id="rId7jy7mt39mrpizd3zfzhhk">
+      <w:hyperlink w:history="1" r:id="rId5jl_xhaeysjyxcsosquez">
         <w:r>
           <w:rPr>
             <w:rStyle w:val="Hyperlink"/>
@@ -8951,7 +8951,7 @@
         </w:rPr>
         <w:t xml:space="preserve">. </w:t>
       </w:r>
-      <w:hyperlink w:history="1" r:id="rIdjvnvuctolrzwzr6glb4c7">
+      <w:hyperlink w:history="1" r:id="rId6kcm8gdjoflto1mdlydws">
         <w:r>
           <w:rPr>
             <w:rStyle w:val="Hyperlink"/>
@@ -8998,7 +8998,7 @@
         </w:rPr>
         <w:t xml:space="preserve">. </w:t>
       </w:r>
-      <w:hyperlink w:history="1" r:id="rIdbsdh0zage4xgnt_1oqalr">
+      <w:hyperlink w:history="1" r:id="rId-wtbuzyd_ey41dbcu5g2p">
         <w:r>
           <w:rPr>
             <w:rStyle w:val="Hyperlink"/>
@@ -9045,7 +9045,7 @@
         </w:rPr>
         <w:t xml:space="preserve">. </w:t>
       </w:r>
-      <w:hyperlink w:history="1" r:id="rIdzkzrx1pit2og-kolhmeva">
+      <w:hyperlink w:history="1" r:id="rId1zmlpesuiselswivm6aep">
         <w:r>
           <w:rPr>
             <w:rStyle w:val="Hyperlink"/>
@@ -9092,7 +9092,7 @@
         </w:rPr>
         <w:t xml:space="preserve">. </w:t>
       </w:r>
-      <w:hyperlink w:history="1" r:id="rIdaiaji8kbx4nkizt0slgxr">
+      <w:hyperlink w:history="1" r:id="rIdrtfezfbsdsvwviiorsh33">
         <w:r>
           <w:rPr>
             <w:rStyle w:val="Hyperlink"/>
@@ -9139,7 +9139,7 @@
         </w:rPr>
         <w:t xml:space="preserve">. U.S. Department of Commerce. </w:t>
       </w:r>
-      <w:hyperlink w:history="1" r:id="rIdpswbw6avnmg71wv-bfqu7">
+      <w:hyperlink w:history="1" r:id="rIdvyf_sroymte4qwh02khwv">
         <w:r>
           <w:rPr>
             <w:rStyle w:val="Hyperlink"/>
@@ -9186,7 +9186,7 @@
         </w:rPr>
         <w:t xml:space="preserve">. U.S. Department of Commerce. </w:t>
       </w:r>
-      <w:hyperlink w:history="1" r:id="rIdqt8ngb3vdleg6k1-jh9gj">
+      <w:hyperlink w:history="1" r:id="rId7mejfqhxhihyobsbrux1t">
         <w:r>
           <w:rPr>
             <w:rStyle w:val="Hyperlink"/>
@@ -9233,7 +9233,7 @@
         </w:rPr>
         <w:t xml:space="preserve">. </w:t>
       </w:r>
-      <w:hyperlink w:history="1" r:id="rIdsyg8zz0grmadmudbmzcgd">
+      <w:hyperlink w:history="1" r:id="rIdr6djjwmu2cs1s5rruwh5n">
         <w:r>
           <w:rPr>
             <w:rStyle w:val="Hyperlink"/>
@@ -9280,7 +9280,7 @@
         </w:rPr>
         <w:t xml:space="preserve">. </w:t>
       </w:r>
-      <w:hyperlink w:history="1" r:id="rId8xjrese_mgweg300noncl">
+      <w:hyperlink w:history="1" r:id="rIdjcoipshvebrdvlaoqcul-">
         <w:r>
           <w:rPr>
             <w:rStyle w:val="Hyperlink"/>
@@ -9327,7 +9327,7 @@
         </w:rPr>
         <w:t xml:space="preserve">. Oxford University Press. </w:t>
       </w:r>
-      <w:hyperlink w:history="1" r:id="rId509u6c09gazf7t_vkh75m">
+      <w:hyperlink w:history="1" r:id="rIdtuese8du40bwpmaiszmcm">
         <w:r>
           <w:rPr>
             <w:rStyle w:val="Hyperlink"/>
@@ -9374,7 +9374,7 @@
         </w:rPr>
         <w:t xml:space="preserve">. Amanpour and Company. </w:t>
       </w:r>
-      <w:hyperlink w:history="1" r:id="rIdy5kh5y_m7gunjvxcjcqy9">
+      <w:hyperlink w:history="1" r:id="rId_tfeckvpqbqrtwu98bo8w">
         <w:r>
           <w:rPr>
             <w:rStyle w:val="Hyperlink"/>
@@ -9421,7 +9421,7 @@
         </w:rPr>
         <w:t xml:space="preserve">(9), pgae346. </w:t>
       </w:r>
-      <w:hyperlink w:history="1" r:id="rIdttexur3aqhc6ffzvdb34t">
+      <w:hyperlink w:history="1" r:id="rIdygfeujur9zxuf-2t6o2gc">
         <w:r>
           <w:rPr>
             <w:rStyle w:val="Hyperlink"/>
@@ -9468,7 +9468,7 @@
         </w:rPr>
         <w:t xml:space="preserve">. </w:t>
       </w:r>
-      <w:hyperlink w:history="1" r:id="rIdubdpkprbb20rgxendds2o">
+      <w:hyperlink w:history="1" r:id="rIdonnipfgn7mzy_ah5qnmto">
         <w:r>
           <w:rPr>
             <w:rStyle w:val="Hyperlink"/>

</xml_diff>

<commit_message>
Update the HAIA Agents paper to v1.4 with verified references
Correct the reference entries that failed verification, after registry
checks (Crossref, ISO Open Data) and cross-platform review with Grok and
ChatGPT, as ruled by the author on October 9, 2026.

- Remove entries that could not be verified: Floridi and Cowan (2025),
  Banovic et al. (2023, two entries), and Nexastack (2025)
- Correct authors, titles, and DOIs: Sanches de Oliveira and Baggs (2023),
  Horowitz and Kahn (2024), Skitka, Mosier, and Burdick (1999),
  Schrepel (2025), Zheng (2025, Computer Law & Security Review),
  Orozco y Villa and Menendez (2025), and the Maas (2025) book
- Replace dead or wrong URLs for the EC ethics guidelines, ISO 37000,
  Visa, and the UNESCO Recommendation
- Name HAIA Agents in the Abstract
- Rebuild the public .docx from v1.4

Co-Authored-By: Claude Opus 5.5 <noreply@anthropic.com>
Claude-Session: https://claude.ai/code/session_014NNjMNksZ3w32AQzpFvQAV
</commit_message>
<xml_diff>
--- a/HAIA Agents From the Definition Problem to Running Code.docx
+++ b/HAIA Agents From the Definition Problem to Running Code.docx
@@ -116,7 +116,7 @@
           <w:sz w:val="24"/>
           <w:szCs w:val="24"/>
         </w:rPr>
-        <w:t xml:space="preserve">The year 2026 opened on a definition problem. The field used one vocabulary for automation and for human-centered control, so a system that only watched itself could be sold as governed, and a person who only watched a screen could be counted as a governor. On January 1, 2026, the author separated Ethical AI, Responsible AI, and AI Governance as distinct layers. On February 3, 2026, the original paper turned that separation into three agent models that differ by where the human stands: an agent that runs the whole pipeline, an agent that stops for a human at every functional role, and no agent at all. On February 23, 2026, a non-cognitive enforcement layer, which the author calls GOPEL, showed that the mechanical layer could be written as code that performs no cognitive work, and on March 14, 2026, the definition of AI Governance named who answers. This rebuild carries that path forward to working software. It introduces the Alpha release of code for Agent Model 1, which is Responsible AI written as code that checks the machine with other machines and passes nothing without a gate, and for Agent Model 2, the hybrid in which the machine runs through to AI Governance at a signed human checkpoint after every role. It then revisits Agent Model 3, Manual Human AI Governance, which remains the default in use and which produced both releases. Both releases are published with the checks they pass in the author’s HAIA repository on GitHub. Neither is deployed, and in the build record neither has yet called a live AI provider.</w:t>
+        <w:t xml:space="preserve">The year 2026 opened on a definition problem. The field used one vocabulary for automation and for human-centered control, so a system that only watched itself could be sold as governed, and a person who only watched a screen could be counted as a governor. On January 1, 2026, the author separated Ethical AI, Responsible AI, and AI Governance as distinct layers. On February 3, 2026, the original paper turned that separation into three agent models that differ by where the human stands: an agent that runs the whole pipeline, an agent that stops for a human at every functional role, and no agent at all. On February 23, 2026, a non-cognitive enforcement layer, which the author calls GOPEL, showed that the mechanical layer could be written as code that performs no cognitive work, and on March 14, 2026, the definition of AI Governance named who answers. This rebuild carries that path forward to working software for the agent layer, now named HAIA Agents. It introduces the Alpha release of code for Agent Model 1, which is Responsible AI written as code that checks the machine with other machines and passes nothing without a gate, and for Agent Model 2, the hybrid in which the machine runs through to AI Governance at a signed human checkpoint after every role. It then revisits Agent Model 3, Manual Human AI Governance, which remains the default in use and which produced both releases. Both releases are published with the checks they pass in the author’s HAIA repository on GitHub. Neither is deployed, and in the build record neither has yet called a live AI provider.</w:t>
       </w:r>
     </w:p>
     <w:p>
@@ -2534,7 +2534,7 @@
         </w:rPr>
         <w:t xml:space="preserve">Both Alpha releases are published on </w:t>
       </w:r>
-      <w:hyperlink w:history="1" r:id="rIdkhr4uydp0khks3btu8mjl">
+      <w:hyperlink w:history="1" r:id="rIdkadkx97qzn6ftutteyneo">
         <w:r>
           <w:rPr>
             <w:rStyle w:val="Hyperlink"/>
@@ -2643,7 +2643,7 @@
         </w:rPr>
         <w:t xml:space="preserve">. basilpuglisi.com. </w:t>
       </w:r>
-      <w:hyperlink w:history="1" r:id="rIddyus_pnttj3yelifx9kmc">
+      <w:hyperlink w:history="1" r:id="rIdrqtjcye3dzqtkxh3vvw8-">
         <w:r>
           <w:rPr>
             <w:rStyle w:val="Hyperlink"/>
@@ -2690,7 +2690,7 @@
         </w:rPr>
         <w:t xml:space="preserve">. basilpuglisi.com. </w:t>
       </w:r>
-      <w:hyperlink w:history="1" r:id="rIdosdcz47-u5vt4mhj2d8mu">
+      <w:hyperlink w:history="1" r:id="rIdtyxrtlqm5qcltnor9az7s">
         <w:r>
           <w:rPr>
             <w:rStyle w:val="Hyperlink"/>
@@ -2737,7 +2737,7 @@
         </w:rPr>
         <w:t xml:space="preserve">. Bradley Law Insights. </w:t>
       </w:r>
-      <w:hyperlink w:history="1" r:id="rIdr2rp1iajctnulxxv9dirs">
+      <w:hyperlink w:history="1" r:id="rIddo7-6sbd2jghp1doz8gyp">
         <w:r>
           <w:rPr>
             <w:rStyle w:val="Hyperlink"/>
@@ -2784,7 +2784,7 @@
         </w:rPr>
         <w:t xml:space="preserve">. </w:t>
       </w:r>
-      <w:hyperlink w:history="1" r:id="rIduurw-85cpp1yab26ckruf">
+      <w:hyperlink w:history="1" r:id="rIdrt__5xlixdlnfb72h5sh2">
         <w:r>
           <w:rPr>
             <w:rStyle w:val="Hyperlink"/>
@@ -2831,7 +2831,7 @@
         </w:rPr>
         <w:t xml:space="preserve">. Official Journal of the European Union. </w:t>
       </w:r>
-      <w:hyperlink w:history="1" r:id="rIdv5kxd-byexiwjpu_ewfjh">
+      <w:hyperlink w:history="1" r:id="rIdwpz2bkp9ksegfom1aaihl">
         <w:r>
           <w:rPr>
             <w:rStyle w:val="Hyperlink"/>
@@ -2878,7 +2878,7 @@
         </w:rPr>
         <w:t xml:space="preserve">. </w:t>
       </w:r>
-      <w:hyperlink w:history="1" r:id="rIdi3qbg_oe4_jozqriv-881">
+      <w:hyperlink w:history="1" r:id="rIdaddgaenlors1higug3ade">
         <w:r>
           <w:rPr>
             <w:rStyle w:val="Hyperlink"/>
@@ -2925,7 +2925,7 @@
         </w:rPr>
         <w:t xml:space="preserve">. ITU Publications. </w:t>
       </w:r>
-      <w:hyperlink w:history="1" r:id="rIdrz4jt3qwji8chmd6gobck">
+      <w:hyperlink w:history="1" r:id="rIdqactsuqnk3ocdl6kogg0n">
         <w:r>
           <w:rPr>
             <w:rStyle w:val="Hyperlink"/>
@@ -2972,7 +2972,7 @@
         </w:rPr>
         <w:t xml:space="preserve">(12), 2346-2363. </w:t>
       </w:r>
-      <w:hyperlink w:history="1" r:id="rIdsrgljjtvp_dnyi_embeqm">
+      <w:hyperlink w:history="1" r:id="rIdqbnhdswccbr47gdtzbju1">
         <w:r>
           <w:rPr>
             <w:rStyle w:val="Hyperlink"/>
@@ -3019,7 +3019,7 @@
         </w:rPr>
         <w:t xml:space="preserve">. </w:t>
       </w:r>
-      <w:hyperlink w:history="1" r:id="rId9aqa5aynnf5tz5v_tsitl">
+      <w:hyperlink w:history="1" r:id="rIdckxr3e0dakqoguc4dwevg">
         <w:r>
           <w:rPr>
             <w:rStyle w:val="Hyperlink"/>
@@ -3066,7 +3066,7 @@
         </w:rPr>
         <w:t xml:space="preserve">. </w:t>
       </w:r>
-      <w:hyperlink w:history="1" r:id="rIdefx2f3-qokon9cud2aw7a">
+      <w:hyperlink w:history="1" r:id="rId3x4wrxwhougyy83ujxpyr">
         <w:r>
           <w:rPr>
             <w:rStyle w:val="Hyperlink"/>
@@ -3113,7 +3113,7 @@
         </w:rPr>
         <w:t xml:space="preserve">. U.S. Department of Commerce. </w:t>
       </w:r>
-      <w:hyperlink w:history="1" r:id="rIdblfdflmlpxnrkxskapz5f">
+      <w:hyperlink w:history="1" r:id="rIdwm4yyxfticx_b51dj0k_g">
         <w:r>
           <w:rPr>
             <w:rStyle w:val="Hyperlink"/>
@@ -3140,17 +3140,17 @@
           <w:sz w:val="20"/>
           <w:szCs w:val="20"/>
         </w:rPr>
-        <w:t xml:space="preserve">Nexastack. (2025). </w:t>
-      </w:r>
-      <w:r>
-        <w:rPr>
-          <w:rFonts w:ascii="Georgia" w:cs="Georgia" w:eastAsia="Georgia" w:hAnsi="Georgia"/>
-          <w:i/>
-          <w:iCs/>
-          <w:sz w:val="20"/>
-          <w:szCs w:val="20"/>
-        </w:rPr>
-        <w:t xml:space="preserve">Agent governance at scale</w:t>
+        <w:t xml:space="preserve">OECD. (2025). </w:t>
+      </w:r>
+      <w:r>
+        <w:rPr>
+          <w:rFonts w:ascii="Georgia" w:cs="Georgia" w:eastAsia="Georgia" w:hAnsi="Georgia"/>
+          <w:i/>
+          <w:iCs/>
+          <w:sz w:val="20"/>
+          <w:szCs w:val="20"/>
+        </w:rPr>
+        <w:t xml:space="preserve">Steering AI’s future: Strategies for anticipatory governance</w:t>
       </w:r>
       <w:r>
         <w:rPr>
@@ -3160,44 +3160,91 @@
         </w:rPr>
         <w:t xml:space="preserve">. </w:t>
       </w:r>
-      <w:hyperlink w:history="1" r:id="rId0tndo05nhzprcqtmox2lg">
-        <w:r>
-          <w:rPr>
-            <w:rStyle w:val="Hyperlink"/>
-            <w:rFonts w:ascii="Georgia" w:cs="Georgia" w:eastAsia="Georgia" w:hAnsi="Georgia"/>
-            <w:sz w:val="20"/>
-            <w:szCs w:val="20"/>
-          </w:rPr>
-          <w:t xml:space="preserve">https://www.nexastack.ai/blog/agent-governance-at-scale</w:t>
-        </w:r>
-      </w:hyperlink>
-    </w:p>
-    <w:p>
-      <w:pPr>
-        <w:pStyle w:val="ListParagraph"/>
-        <w:numPr>
-          <w:ilvl w:val="0"/>
-          <w:numId w:val="4"/>
-        </w:numPr>
-        <w:spacing w:after="60" w:before="0" w:line="240" w:lineRule="auto"/>
-      </w:pPr>
-      <w:r>
-        <w:rPr>
-          <w:rFonts w:ascii="Georgia" w:cs="Georgia" w:eastAsia="Georgia" w:hAnsi="Georgia"/>
-          <w:sz w:val="20"/>
-          <w:szCs w:val="20"/>
-        </w:rPr>
-        <w:t xml:space="preserve">OECD. (2025). </w:t>
-      </w:r>
-      <w:r>
-        <w:rPr>
-          <w:rFonts w:ascii="Georgia" w:cs="Georgia" w:eastAsia="Georgia" w:hAnsi="Georgia"/>
-          <w:i/>
-          <w:iCs/>
-          <w:sz w:val="20"/>
-          <w:szCs w:val="20"/>
-        </w:rPr>
-        <w:t xml:space="preserve">Steering AI’s future: Strategies for anticipatory governance</w:t>
+      <w:hyperlink w:history="1" r:id="rIdhkp-7zxrduek428uyqazt">
+        <w:r>
+          <w:rPr>
+            <w:rStyle w:val="Hyperlink"/>
+            <w:rFonts w:ascii="Georgia" w:cs="Georgia" w:eastAsia="Georgia" w:hAnsi="Georgia"/>
+            <w:sz w:val="20"/>
+            <w:szCs w:val="20"/>
+          </w:rPr>
+          <w:t xml:space="preserve">https://www.oecd.org/content/dam/oecd/en/publications/reports/2025/02/steering-ai-s-future_70e4a856/5480ff0a-en.pdf</w:t>
+        </w:r>
+      </w:hyperlink>
+    </w:p>
+    <w:p>
+      <w:pPr>
+        <w:pStyle w:val="ListParagraph"/>
+        <w:numPr>
+          <w:ilvl w:val="0"/>
+          <w:numId w:val="4"/>
+        </w:numPr>
+        <w:spacing w:after="60" w:before="0" w:line="240" w:lineRule="auto"/>
+      </w:pPr>
+      <w:r>
+        <w:rPr>
+          <w:rFonts w:ascii="Georgia" w:cs="Georgia" w:eastAsia="Georgia" w:hAnsi="Georgia"/>
+          <w:sz w:val="20"/>
+          <w:szCs w:val="20"/>
+        </w:rPr>
+        <w:t xml:space="preserve">Parasuraman, R., &amp; Manzey, D. H. (2010). Complacency and bias in human use of automation: An attentional integration. </w:t>
+      </w:r>
+      <w:r>
+        <w:rPr>
+          <w:rFonts w:ascii="Georgia" w:cs="Georgia" w:eastAsia="Georgia" w:hAnsi="Georgia"/>
+          <w:i/>
+          <w:iCs/>
+          <w:sz w:val="20"/>
+          <w:szCs w:val="20"/>
+        </w:rPr>
+        <w:t xml:space="preserve">Human Factors, 52</w:t>
+      </w:r>
+      <w:r>
+        <w:rPr>
+          <w:rFonts w:ascii="Georgia" w:cs="Georgia" w:eastAsia="Georgia" w:hAnsi="Georgia"/>
+          <w:sz w:val="20"/>
+          <w:szCs w:val="20"/>
+        </w:rPr>
+        <w:t xml:space="preserve">(3), 381-410. </w:t>
+      </w:r>
+      <w:hyperlink w:history="1" r:id="rIdtbjlbczbtw4_uvxxtwybr">
+        <w:r>
+          <w:rPr>
+            <w:rStyle w:val="Hyperlink"/>
+            <w:rFonts w:ascii="Georgia" w:cs="Georgia" w:eastAsia="Georgia" w:hAnsi="Georgia"/>
+            <w:sz w:val="20"/>
+            <w:szCs w:val="20"/>
+          </w:rPr>
+          <w:t xml:space="preserve">https://doi.org/10.1177/0018720810376055</w:t>
+        </w:r>
+      </w:hyperlink>
+    </w:p>
+    <w:p>
+      <w:pPr>
+        <w:pStyle w:val="ListParagraph"/>
+        <w:numPr>
+          <w:ilvl w:val="0"/>
+          <w:numId w:val="4"/>
+        </w:numPr>
+        <w:spacing w:after="60" w:before="0" w:line="240" w:lineRule="auto"/>
+      </w:pPr>
+      <w:r>
+        <w:rPr>
+          <w:rFonts w:ascii="Georgia" w:cs="Georgia" w:eastAsia="Georgia" w:hAnsi="Georgia"/>
+          <w:sz w:val="20"/>
+          <w:szCs w:val="20"/>
+        </w:rPr>
+        <w:t xml:space="preserve">Precisely. (2025, August 11). </w:t>
+      </w:r>
+      <w:r>
+        <w:rPr>
+          <w:rFonts w:ascii="Georgia" w:cs="Georgia" w:eastAsia="Georgia" w:hAnsi="Georgia"/>
+          <w:i/>
+          <w:iCs/>
+          <w:sz w:val="20"/>
+          <w:szCs w:val="20"/>
+        </w:rPr>
+        <w:t xml:space="preserve">AI governance frameworks: Cutting through the chaos</w:t>
       </w:r>
       <w:r>
         <w:rPr>
@@ -3207,91 +3254,44 @@
         </w:rPr>
         <w:t xml:space="preserve">. </w:t>
       </w:r>
-      <w:hyperlink w:history="1" r:id="rId-jzyxbrvijtzehzn83s5y">
-        <w:r>
-          <w:rPr>
-            <w:rStyle w:val="Hyperlink"/>
-            <w:rFonts w:ascii="Georgia" w:cs="Georgia" w:eastAsia="Georgia" w:hAnsi="Georgia"/>
-            <w:sz w:val="20"/>
-            <w:szCs w:val="20"/>
-          </w:rPr>
-          <w:t xml:space="preserve">https://www.oecd.org/content/dam/oecd/en/publications/reports/2025/02/steering-ai-s-future_70e4a856/5480ff0a-en.pdf</w:t>
-        </w:r>
-      </w:hyperlink>
-    </w:p>
-    <w:p>
-      <w:pPr>
-        <w:pStyle w:val="ListParagraph"/>
-        <w:numPr>
-          <w:ilvl w:val="0"/>
-          <w:numId w:val="4"/>
-        </w:numPr>
-        <w:spacing w:after="60" w:before="0" w:line="240" w:lineRule="auto"/>
-      </w:pPr>
-      <w:r>
-        <w:rPr>
-          <w:rFonts w:ascii="Georgia" w:cs="Georgia" w:eastAsia="Georgia" w:hAnsi="Georgia"/>
-          <w:sz w:val="20"/>
-          <w:szCs w:val="20"/>
-        </w:rPr>
-        <w:t xml:space="preserve">Parasuraman, R., &amp; Manzey, D. H. (2010). Complacency and bias in human use of automation: An attentional integration. </w:t>
-      </w:r>
-      <w:r>
-        <w:rPr>
-          <w:rFonts w:ascii="Georgia" w:cs="Georgia" w:eastAsia="Georgia" w:hAnsi="Georgia"/>
-          <w:i/>
-          <w:iCs/>
-          <w:sz w:val="20"/>
-          <w:szCs w:val="20"/>
-        </w:rPr>
-        <w:t xml:space="preserve">Human Factors, 52</w:t>
-      </w:r>
-      <w:r>
-        <w:rPr>
-          <w:rFonts w:ascii="Georgia" w:cs="Georgia" w:eastAsia="Georgia" w:hAnsi="Georgia"/>
-          <w:sz w:val="20"/>
-          <w:szCs w:val="20"/>
-        </w:rPr>
-        <w:t xml:space="preserve">(3), 381-410. </w:t>
-      </w:r>
-      <w:hyperlink w:history="1" r:id="rIdgiereb5eztrbzzdxadvz3">
-        <w:r>
-          <w:rPr>
-            <w:rStyle w:val="Hyperlink"/>
-            <w:rFonts w:ascii="Georgia" w:cs="Georgia" w:eastAsia="Georgia" w:hAnsi="Georgia"/>
-            <w:sz w:val="20"/>
-            <w:szCs w:val="20"/>
-          </w:rPr>
-          <w:t xml:space="preserve">https://doi.org/10.1177/0018720810376055</w:t>
-        </w:r>
-      </w:hyperlink>
-    </w:p>
-    <w:p>
-      <w:pPr>
-        <w:pStyle w:val="ListParagraph"/>
-        <w:numPr>
-          <w:ilvl w:val="0"/>
-          <w:numId w:val="4"/>
-        </w:numPr>
-        <w:spacing w:after="60" w:before="0" w:line="240" w:lineRule="auto"/>
-      </w:pPr>
-      <w:r>
-        <w:rPr>
-          <w:rFonts w:ascii="Georgia" w:cs="Georgia" w:eastAsia="Georgia" w:hAnsi="Georgia"/>
-          <w:sz w:val="20"/>
-          <w:szCs w:val="20"/>
-        </w:rPr>
-        <w:t xml:space="preserve">Precisely. (2025, August 11). </w:t>
-      </w:r>
-      <w:r>
-        <w:rPr>
-          <w:rFonts w:ascii="Georgia" w:cs="Georgia" w:eastAsia="Georgia" w:hAnsi="Georgia"/>
-          <w:i/>
-          <w:iCs/>
-          <w:sz w:val="20"/>
-          <w:szCs w:val="20"/>
-        </w:rPr>
-        <w:t xml:space="preserve">AI governance frameworks: Cutting through the chaos</w:t>
+      <w:hyperlink w:history="1" r:id="rIdi4irjkx6q2cg3w-gtcgtw">
+        <w:r>
+          <w:rPr>
+            <w:rStyle w:val="Hyperlink"/>
+            <w:rFonts w:ascii="Georgia" w:cs="Georgia" w:eastAsia="Georgia" w:hAnsi="Georgia"/>
+            <w:sz w:val="20"/>
+            <w:szCs w:val="20"/>
+          </w:rPr>
+          <w:t xml:space="preserve">https://www.precisely.com/datagovernance/opening-the-black-box-building-transparent-ai-governance-frameworks</w:t>
+        </w:r>
+      </w:hyperlink>
+    </w:p>
+    <w:p>
+      <w:pPr>
+        <w:pStyle w:val="ListParagraph"/>
+        <w:numPr>
+          <w:ilvl w:val="0"/>
+          <w:numId w:val="4"/>
+        </w:numPr>
+        <w:spacing w:after="60" w:before="0" w:line="240" w:lineRule="auto"/>
+      </w:pPr>
+      <w:r>
+        <w:rPr>
+          <w:rFonts w:ascii="Georgia" w:cs="Georgia" w:eastAsia="Georgia" w:hAnsi="Georgia"/>
+          <w:sz w:val="20"/>
+          <w:szCs w:val="20"/>
+        </w:rPr>
+        <w:t xml:space="preserve">Splunk. (2025, February 25). </w:t>
+      </w:r>
+      <w:r>
+        <w:rPr>
+          <w:rFonts w:ascii="Georgia" w:cs="Georgia" w:eastAsia="Georgia" w:hAnsi="Georgia"/>
+          <w:i/>
+          <w:iCs/>
+          <w:sz w:val="20"/>
+          <w:szCs w:val="20"/>
+        </w:rPr>
+        <w:t xml:space="preserve">AI governance in 2025: A full perspective</w:t>
       </w:r>
       <w:r>
         <w:rPr>
@@ -3301,44 +3301,91 @@
         </w:rPr>
         <w:t xml:space="preserve">. </w:t>
       </w:r>
-      <w:hyperlink w:history="1" r:id="rIdxwr6zhs0e_qgbf0_fbyhv">
-        <w:r>
-          <w:rPr>
-            <w:rStyle w:val="Hyperlink"/>
-            <w:rFonts w:ascii="Georgia" w:cs="Georgia" w:eastAsia="Georgia" w:hAnsi="Georgia"/>
-            <w:sz w:val="20"/>
-            <w:szCs w:val="20"/>
-          </w:rPr>
-          <w:t xml:space="preserve">https://www.precisely.com/datagovernance/opening-the-black-box-building-transparent-ai-governance-frameworks</w:t>
-        </w:r>
-      </w:hyperlink>
-    </w:p>
-    <w:p>
-      <w:pPr>
-        <w:pStyle w:val="ListParagraph"/>
-        <w:numPr>
-          <w:ilvl w:val="0"/>
-          <w:numId w:val="4"/>
-        </w:numPr>
-        <w:spacing w:after="60" w:before="0" w:line="240" w:lineRule="auto"/>
-      </w:pPr>
-      <w:r>
-        <w:rPr>
-          <w:rFonts w:ascii="Georgia" w:cs="Georgia" w:eastAsia="Georgia" w:hAnsi="Georgia"/>
-          <w:sz w:val="20"/>
-          <w:szCs w:val="20"/>
-        </w:rPr>
-        <w:t xml:space="preserve">Splunk. (2025, February 25). </w:t>
-      </w:r>
-      <w:r>
-        <w:rPr>
-          <w:rFonts w:ascii="Georgia" w:cs="Georgia" w:eastAsia="Georgia" w:hAnsi="Georgia"/>
-          <w:i/>
-          <w:iCs/>
-          <w:sz w:val="20"/>
-          <w:szCs w:val="20"/>
-        </w:rPr>
-        <w:t xml:space="preserve">AI governance in 2025: A full perspective</w:t>
+      <w:hyperlink w:history="1" r:id="rIdudhwg6zfijj-rjcjunzui">
+        <w:r>
+          <w:rPr>
+            <w:rStyle w:val="Hyperlink"/>
+            <w:rFonts w:ascii="Georgia" w:cs="Georgia" w:eastAsia="Georgia" w:hAnsi="Georgia"/>
+            <w:sz w:val="20"/>
+            <w:szCs w:val="20"/>
+          </w:rPr>
+          <w:t xml:space="preserve">https://www.splunk.com/en_us/blog/learn/ai-governance.html</w:t>
+        </w:r>
+      </w:hyperlink>
+    </w:p>
+    <w:p>
+      <w:pPr>
+        <w:pStyle w:val="ListParagraph"/>
+        <w:numPr>
+          <w:ilvl w:val="0"/>
+          <w:numId w:val="4"/>
+        </w:numPr>
+        <w:spacing w:after="60" w:before="0" w:line="240" w:lineRule="auto"/>
+      </w:pPr>
+      <w:r>
+        <w:rPr>
+          <w:rFonts w:ascii="Georgia" w:cs="Georgia" w:eastAsia="Georgia" w:hAnsi="Georgia"/>
+          <w:sz w:val="20"/>
+          <w:szCs w:val="20"/>
+        </w:rPr>
+        <w:t xml:space="preserve">Stanford Institute for Human-Centered Artificial Intelligence. (2024). </w:t>
+      </w:r>
+      <w:r>
+        <w:rPr>
+          <w:rFonts w:ascii="Georgia" w:cs="Georgia" w:eastAsia="Georgia" w:hAnsi="Georgia"/>
+          <w:i/>
+          <w:iCs/>
+          <w:sz w:val="20"/>
+          <w:szCs w:val="20"/>
+        </w:rPr>
+        <w:t xml:space="preserve">Artificial Intelligence Index Report 2024</w:t>
+      </w:r>
+      <w:r>
+        <w:rPr>
+          <w:rFonts w:ascii="Georgia" w:cs="Georgia" w:eastAsia="Georgia" w:hAnsi="Georgia"/>
+          <w:sz w:val="20"/>
+          <w:szCs w:val="20"/>
+        </w:rPr>
+        <w:t xml:space="preserve">. Stanford University. </w:t>
+      </w:r>
+      <w:hyperlink w:history="1" r:id="rIdpftbd3shiu-dnf9ufwm7f">
+        <w:r>
+          <w:rPr>
+            <w:rStyle w:val="Hyperlink"/>
+            <w:rFonts w:ascii="Georgia" w:cs="Georgia" w:eastAsia="Georgia" w:hAnsi="Georgia"/>
+            <w:sz w:val="20"/>
+            <w:szCs w:val="20"/>
+          </w:rPr>
+          <w:t xml:space="preserve">https://aiindex.stanford.edu/report/</w:t>
+        </w:r>
+      </w:hyperlink>
+    </w:p>
+    <w:p>
+      <w:pPr>
+        <w:pStyle w:val="ListParagraph"/>
+        <w:numPr>
+          <w:ilvl w:val="0"/>
+          <w:numId w:val="4"/>
+        </w:numPr>
+        <w:spacing w:after="60" w:before="0" w:line="240" w:lineRule="auto"/>
+      </w:pPr>
+      <w:r>
+        <w:rPr>
+          <w:rFonts w:ascii="Georgia" w:cs="Georgia" w:eastAsia="Georgia" w:hAnsi="Georgia"/>
+          <w:sz w:val="20"/>
+          <w:szCs w:val="20"/>
+        </w:rPr>
+        <w:t xml:space="preserve">Strobes Security. (2025, July 1). </w:t>
+      </w:r>
+      <w:r>
+        <w:rPr>
+          <w:rFonts w:ascii="Georgia" w:cs="Georgia" w:eastAsia="Georgia" w:hAnsi="Georgia"/>
+          <w:i/>
+          <w:iCs/>
+          <w:sz w:val="20"/>
+          <w:szCs w:val="20"/>
+        </w:rPr>
+        <w:t xml:space="preserve">AI governance framework for security leaders</w:t>
       </w:r>
       <w:r>
         <w:rPr>
@@ -3348,91 +3395,91 @@
         </w:rPr>
         <w:t xml:space="preserve">. </w:t>
       </w:r>
-      <w:hyperlink w:history="1" r:id="rIdw6okjs22i5ksyyxkw_vae">
-        <w:r>
-          <w:rPr>
-            <w:rStyle w:val="Hyperlink"/>
-            <w:rFonts w:ascii="Georgia" w:cs="Georgia" w:eastAsia="Georgia" w:hAnsi="Georgia"/>
-            <w:sz w:val="20"/>
-            <w:szCs w:val="20"/>
-          </w:rPr>
-          <w:t xml:space="preserve">https://www.splunk.com/en_us/blog/learn/ai-governance.html</w:t>
-        </w:r>
-      </w:hyperlink>
-    </w:p>
-    <w:p>
-      <w:pPr>
-        <w:pStyle w:val="ListParagraph"/>
-        <w:numPr>
-          <w:ilvl w:val="0"/>
-          <w:numId w:val="4"/>
-        </w:numPr>
-        <w:spacing w:after="60" w:before="0" w:line="240" w:lineRule="auto"/>
-      </w:pPr>
-      <w:r>
-        <w:rPr>
-          <w:rFonts w:ascii="Georgia" w:cs="Georgia" w:eastAsia="Georgia" w:hAnsi="Georgia"/>
-          <w:sz w:val="20"/>
-          <w:szCs w:val="20"/>
-        </w:rPr>
-        <w:t xml:space="preserve">Stanford Institute for Human-Centered Artificial Intelligence. (2024). </w:t>
-      </w:r>
-      <w:r>
-        <w:rPr>
-          <w:rFonts w:ascii="Georgia" w:cs="Georgia" w:eastAsia="Georgia" w:hAnsi="Georgia"/>
-          <w:i/>
-          <w:iCs/>
-          <w:sz w:val="20"/>
-          <w:szCs w:val="20"/>
-        </w:rPr>
-        <w:t xml:space="preserve">Artificial Intelligence Index Report 2024</w:t>
-      </w:r>
-      <w:r>
-        <w:rPr>
-          <w:rFonts w:ascii="Georgia" w:cs="Georgia" w:eastAsia="Georgia" w:hAnsi="Georgia"/>
-          <w:sz w:val="20"/>
-          <w:szCs w:val="20"/>
-        </w:rPr>
-        <w:t xml:space="preserve">. Stanford University. </w:t>
-      </w:r>
-      <w:hyperlink w:history="1" r:id="rId9yhhbmesbdf5pikpknycn">
-        <w:r>
-          <w:rPr>
-            <w:rStyle w:val="Hyperlink"/>
-            <w:rFonts w:ascii="Georgia" w:cs="Georgia" w:eastAsia="Georgia" w:hAnsi="Georgia"/>
-            <w:sz w:val="20"/>
-            <w:szCs w:val="20"/>
-          </w:rPr>
-          <w:t xml:space="preserve">https://aiindex.stanford.edu/report/</w:t>
-        </w:r>
-      </w:hyperlink>
-    </w:p>
-    <w:p>
-      <w:pPr>
-        <w:pStyle w:val="ListParagraph"/>
-        <w:numPr>
-          <w:ilvl w:val="0"/>
-          <w:numId w:val="4"/>
-        </w:numPr>
-        <w:spacing w:after="60" w:before="0" w:line="240" w:lineRule="auto"/>
-      </w:pPr>
-      <w:r>
-        <w:rPr>
-          <w:rFonts w:ascii="Georgia" w:cs="Georgia" w:eastAsia="Georgia" w:hAnsi="Georgia"/>
-          <w:sz w:val="20"/>
-          <w:szCs w:val="20"/>
-        </w:rPr>
-        <w:t xml:space="preserve">Strobes Security. (2025, July 1). </w:t>
-      </w:r>
-      <w:r>
-        <w:rPr>
-          <w:rFonts w:ascii="Georgia" w:cs="Georgia" w:eastAsia="Georgia" w:hAnsi="Georgia"/>
-          <w:i/>
-          <w:iCs/>
-          <w:sz w:val="20"/>
-          <w:szCs w:val="20"/>
-        </w:rPr>
-        <w:t xml:space="preserve">AI governance framework for security leaders</w:t>
+      <w:hyperlink w:history="1" r:id="rIdazl23p41qpohz4dnu7p1q">
+        <w:r>
+          <w:rPr>
+            <w:rStyle w:val="Hyperlink"/>
+            <w:rFonts w:ascii="Georgia" w:cs="Georgia" w:eastAsia="Georgia" w:hAnsi="Georgia"/>
+            <w:sz w:val="20"/>
+            <w:szCs w:val="20"/>
+          </w:rPr>
+          <w:t xml:space="preserve">https://strobes.co/blog/ai-governance-framework-for-security-leaders</w:t>
+        </w:r>
+      </w:hyperlink>
+    </w:p>
+    <w:p>
+      <w:pPr>
+        <w:pStyle w:val="ListParagraph"/>
+        <w:numPr>
+          <w:ilvl w:val="0"/>
+          <w:numId w:val="4"/>
+        </w:numPr>
+        <w:spacing w:after="60" w:before="0" w:line="240" w:lineRule="auto"/>
+      </w:pPr>
+      <w:r>
+        <w:rPr>
+          <w:rFonts w:ascii="Georgia" w:cs="Georgia" w:eastAsia="Georgia" w:hAnsi="Georgia"/>
+          <w:sz w:val="20"/>
+          <w:szCs w:val="20"/>
+        </w:rPr>
+        <w:t xml:space="preserve">Superblocks. (2025, July 31). </w:t>
+      </w:r>
+      <w:r>
+        <w:rPr>
+          <w:rFonts w:ascii="Georgia" w:cs="Georgia" w:eastAsia="Georgia" w:hAnsi="Georgia"/>
+          <w:i/>
+          <w:iCs/>
+          <w:sz w:val="20"/>
+          <w:szCs w:val="20"/>
+        </w:rPr>
+        <w:t xml:space="preserve">What is AI model governance?</w:t>
+      </w:r>
+      <w:r>
+        <w:rPr>
+          <w:rFonts w:ascii="Georgia" w:cs="Georgia" w:eastAsia="Georgia" w:hAnsi="Georgia"/>
+          <w:sz w:val="20"/>
+          <w:szCs w:val="20"/>
+        </w:rPr>
+        <w:t xml:space="preserve"> </w:t>
+      </w:r>
+      <w:hyperlink w:history="1" r:id="rIdto8xlgcoo5-vt_61hymc-">
+        <w:r>
+          <w:rPr>
+            <w:rStyle w:val="Hyperlink"/>
+            <w:rFonts w:ascii="Georgia" w:cs="Georgia" w:eastAsia="Georgia" w:hAnsi="Georgia"/>
+            <w:sz w:val="20"/>
+            <w:szCs w:val="20"/>
+          </w:rPr>
+          <w:t xml:space="preserve">https://www.superblocks.com/blog/ai-model-governance</w:t>
+        </w:r>
+      </w:hyperlink>
+    </w:p>
+    <w:p>
+      <w:pPr>
+        <w:pStyle w:val="ListParagraph"/>
+        <w:numPr>
+          <w:ilvl w:val="0"/>
+          <w:numId w:val="4"/>
+        </w:numPr>
+        <w:spacing w:after="60" w:before="0" w:line="240" w:lineRule="auto"/>
+      </w:pPr>
+      <w:r>
+        <w:rPr>
+          <w:rFonts w:ascii="Georgia" w:cs="Georgia" w:eastAsia="Georgia" w:hAnsi="Georgia"/>
+          <w:sz w:val="20"/>
+          <w:szCs w:val="20"/>
+        </w:rPr>
+        <w:t xml:space="preserve">Visa. (2025). </w:t>
+      </w:r>
+      <w:r>
+        <w:rPr>
+          <w:rFonts w:ascii="Georgia" w:cs="Georgia" w:eastAsia="Georgia" w:hAnsi="Georgia"/>
+          <w:i/>
+          <w:iCs/>
+          <w:sz w:val="20"/>
+          <w:szCs w:val="20"/>
+        </w:rPr>
+        <w:t xml:space="preserve">Visa introduces Trusted Agent Protocol: An ecosystem-led framework for AI commerce</w:t>
       </w:r>
       <w:r>
         <w:rPr>
@@ -3442,109 +3489,15 @@
         </w:rPr>
         <w:t xml:space="preserve">. </w:t>
       </w:r>
-      <w:hyperlink w:history="1" r:id="rIdrlewi_n8eilgktcm3vsmn">
-        <w:r>
-          <w:rPr>
-            <w:rStyle w:val="Hyperlink"/>
-            <w:rFonts w:ascii="Georgia" w:cs="Georgia" w:eastAsia="Georgia" w:hAnsi="Georgia"/>
-            <w:sz w:val="20"/>
-            <w:szCs w:val="20"/>
-          </w:rPr>
-          <w:t xml:space="preserve">https://strobes.co/blog/ai-governance-framework-for-security-leaders</w:t>
-        </w:r>
-      </w:hyperlink>
-    </w:p>
-    <w:p>
-      <w:pPr>
-        <w:pStyle w:val="ListParagraph"/>
-        <w:numPr>
-          <w:ilvl w:val="0"/>
-          <w:numId w:val="4"/>
-        </w:numPr>
-        <w:spacing w:after="60" w:before="0" w:line="240" w:lineRule="auto"/>
-      </w:pPr>
-      <w:r>
-        <w:rPr>
-          <w:rFonts w:ascii="Georgia" w:cs="Georgia" w:eastAsia="Georgia" w:hAnsi="Georgia"/>
-          <w:sz w:val="20"/>
-          <w:szCs w:val="20"/>
-        </w:rPr>
-        <w:t xml:space="preserve">Superblocks. (2025, July 31). </w:t>
-      </w:r>
-      <w:r>
-        <w:rPr>
-          <w:rFonts w:ascii="Georgia" w:cs="Georgia" w:eastAsia="Georgia" w:hAnsi="Georgia"/>
-          <w:i/>
-          <w:iCs/>
-          <w:sz w:val="20"/>
-          <w:szCs w:val="20"/>
-        </w:rPr>
-        <w:t xml:space="preserve">What is AI model governance?</w:t>
-      </w:r>
-      <w:r>
-        <w:rPr>
-          <w:rFonts w:ascii="Georgia" w:cs="Georgia" w:eastAsia="Georgia" w:hAnsi="Georgia"/>
-          <w:sz w:val="20"/>
-          <w:szCs w:val="20"/>
-        </w:rPr>
-        <w:t xml:space="preserve"> </w:t>
-      </w:r>
-      <w:hyperlink w:history="1" r:id="rIdtey1kcssjd512dakhorck">
-        <w:r>
-          <w:rPr>
-            <w:rStyle w:val="Hyperlink"/>
-            <w:rFonts w:ascii="Georgia" w:cs="Georgia" w:eastAsia="Georgia" w:hAnsi="Georgia"/>
-            <w:sz w:val="20"/>
-            <w:szCs w:val="20"/>
-          </w:rPr>
-          <w:t xml:space="preserve">https://www.superblocks.com/blog/ai-model-governance</w:t>
-        </w:r>
-      </w:hyperlink>
-    </w:p>
-    <w:p>
-      <w:pPr>
-        <w:pStyle w:val="ListParagraph"/>
-        <w:numPr>
-          <w:ilvl w:val="0"/>
-          <w:numId w:val="4"/>
-        </w:numPr>
-        <w:spacing w:after="60" w:before="0" w:line="240" w:lineRule="auto"/>
-      </w:pPr>
-      <w:r>
-        <w:rPr>
-          <w:rFonts w:ascii="Georgia" w:cs="Georgia" w:eastAsia="Georgia" w:hAnsi="Georgia"/>
-          <w:sz w:val="20"/>
-          <w:szCs w:val="20"/>
-        </w:rPr>
-        <w:t xml:space="preserve">Visa. (2025). </w:t>
-      </w:r>
-      <w:r>
-        <w:rPr>
-          <w:rFonts w:ascii="Georgia" w:cs="Georgia" w:eastAsia="Georgia" w:hAnsi="Georgia"/>
-          <w:i/>
-          <w:iCs/>
-          <w:sz w:val="20"/>
-          <w:szCs w:val="20"/>
-        </w:rPr>
-        <w:t xml:space="preserve">Visa introduces Trusted Agent Protocol: An ecosystem-led framework for AI commerce</w:t>
-      </w:r>
-      <w:r>
-        <w:rPr>
-          <w:rFonts w:ascii="Georgia" w:cs="Georgia" w:eastAsia="Georgia" w:hAnsi="Georgia"/>
-          <w:sz w:val="20"/>
-          <w:szCs w:val="20"/>
-        </w:rPr>
-        <w:t xml:space="preserve">. </w:t>
-      </w:r>
-      <w:hyperlink w:history="1" r:id="rIdqieyqmmmgt8qg9q2fzi0u">
-        <w:r>
-          <w:rPr>
-            <w:rStyle w:val="Hyperlink"/>
-            <w:rFonts w:ascii="Georgia" w:cs="Georgia" w:eastAsia="Georgia" w:hAnsi="Georgia"/>
-            <w:sz w:val="20"/>
-            <w:szCs w:val="20"/>
-          </w:rPr>
-          <w:t xml:space="preserve">https://investor.visa.com/news/news-details/2025/Visa-Introduces-Trusted-Agent-Protocol</w:t>
+      <w:hyperlink w:history="1" r:id="rIdpzhxa4qgife2xesl6ixuy">
+        <w:r>
+          <w:rPr>
+            <w:rStyle w:val="Hyperlink"/>
+            <w:rFonts w:ascii="Georgia" w:cs="Georgia" w:eastAsia="Georgia" w:hAnsi="Georgia"/>
+            <w:sz w:val="20"/>
+            <w:szCs w:val="20"/>
+          </w:rPr>
+          <w:t xml:space="preserve">https://usa.visa.com/about-visa/newsroom/press-releases.releaseId.21716.html</w:t>
         </w:r>
       </w:hyperlink>
     </w:p>
@@ -3580,7 +3533,7 @@
         </w:rPr>
         <w:t xml:space="preserve">. Medium. </w:t>
       </w:r>
-      <w:hyperlink w:history="1" r:id="rIdqmxzkvylfobyrxa4fjjqr">
+      <w:hyperlink w:history="1" r:id="rIdgvy7emg_rwqcfvokfdjn7">
         <w:r>
           <w:rPr>
             <w:rStyle w:val="Hyperlink"/>
@@ -3627,7 +3580,7 @@
         </w:rPr>
         <w:t xml:space="preserve">. basilpuglisi.com. </w:t>
       </w:r>
-      <w:hyperlink w:history="1" r:id="rIdrdpykmcdwajwrkha34gnc">
+      <w:hyperlink w:history="1" r:id="rId3yl1uwxpnbv4ziyyu12dp">
         <w:r>
           <w:rPr>
             <w:rStyle w:val="Hyperlink"/>
@@ -3674,7 +3627,7 @@
         </w:rPr>
         <w:t xml:space="preserve">. </w:t>
       </w:r>
-      <w:hyperlink w:history="1" r:id="rIdezaqylamqnzrtmeqivmue">
+      <w:hyperlink w:history="1" r:id="rId5hzejpeednjuqvzivbumu">
         <w:r>
           <w:rPr>
             <w:rStyle w:val="Hyperlink"/>
@@ -3721,7 +3674,7 @@
         </w:rPr>
         <w:t xml:space="preserve">(7), 100779. </w:t>
       </w:r>
-      <w:hyperlink w:history="1" r:id="rId_adhmqkto1ko8srpjhuej">
+      <w:hyperlink w:history="1" r:id="rIddz3uihfhsx5r1cvwmjwng">
         <w:r>
           <w:rPr>
             <w:rStyle w:val="Hyperlink"/>
@@ -3768,7 +3721,7 @@
         </w:rPr>
         <w:t xml:space="preserve">, Article 26. </w:t>
       </w:r>
-      <w:hyperlink w:history="1" r:id="rId0ax3_r0qxoh3ge36_ewey">
+      <w:hyperlink w:history="1" r:id="rIda6vkzcbpbmkpk-yvwua4b">
         <w:r>
           <w:rPr>
             <w:rStyle w:val="Hyperlink"/>
@@ -3812,7 +3765,7 @@
         </w:rPr>
         <w:t xml:space="preserve">. basilpuglisi.com. </w:t>
       </w:r>
-      <w:hyperlink w:history="1" r:id="rIdeye4ej7vugrpucoztg4u1">
+      <w:hyperlink w:history="1" r:id="rIdkrnpsy0iwjikhkoto1fe6">
         <w:r>
           <w:rPr>
             <w:rStyle w:val="Hyperlink"/>
@@ -3859,7 +3812,7 @@
         </w:rPr>
         <w:t xml:space="preserve">. basilpuglisi.com. </w:t>
       </w:r>
-      <w:hyperlink w:history="1" r:id="rIdwcqqrjmvfvqqspclaqn4d">
+      <w:hyperlink w:history="1" r:id="rIdnnvvw1dd44f3ci0vatvxt">
         <w:r>
           <w:rPr>
             <w:rStyle w:val="Hyperlink"/>
@@ -3906,7 +3859,7 @@
         </w:rPr>
         <w:t xml:space="preserve">, 3265-3279. </w:t>
       </w:r>
-      <w:hyperlink w:history="1" r:id="rIdxwcopbsepv3ugu4qwx2nt">
+      <w:hyperlink w:history="1" r:id="rIdaxsjwxyd3efjv2om4cpec">
         <w:r>
           <w:rPr>
             <w:rStyle w:val="Hyperlink"/>
@@ -3989,7 +3942,7 @@
         </w:rPr>
         <w:t xml:space="preserve">. </w:t>
       </w:r>
-      <w:hyperlink w:history="1" r:id="rIdhqhcezpzjvt68vyd5s6ij">
+      <w:hyperlink w:history="1" r:id="rIdt_3u-otxlfcm4qmjsla4-">
         <w:r>
           <w:rPr>
             <w:rStyle w:val="Hyperlink"/>
@@ -4036,7 +3989,7 @@
         </w:rPr>
         <w:t xml:space="preserve">. </w:t>
       </w:r>
-      <w:hyperlink w:history="1" r:id="rId2cihrufbp214feavk-itc">
+      <w:hyperlink w:history="1" r:id="rId9obeqiphofxvg4zjetpot">
         <w:r>
           <w:rPr>
             <w:rStyle w:val="Hyperlink"/>
@@ -4063,53 +4016,6 @@
           <w:sz w:val="20"/>
           <w:szCs w:val="20"/>
         </w:rPr>
-        <w:t xml:space="preserve">Floridi, L., &amp; Cowan, S. (2025). Operationalizing accountability in AI governance: From principles to procedures. </w:t>
-      </w:r>
-      <w:r>
-        <w:rPr>
-          <w:rFonts w:ascii="Georgia" w:cs="Georgia" w:eastAsia="Georgia" w:hAnsi="Georgia"/>
-          <w:i/>
-          <w:iCs/>
-          <w:sz w:val="20"/>
-          <w:szCs w:val="20"/>
-        </w:rPr>
-        <w:t xml:space="preserve">AI and Ethics, 5</w:t>
-      </w:r>
-      <w:r>
-        <w:rPr>
-          <w:rFonts w:ascii="Georgia" w:cs="Georgia" w:eastAsia="Georgia" w:hAnsi="Georgia"/>
-          <w:sz w:val="20"/>
-          <w:szCs w:val="20"/>
-        </w:rPr>
-        <w:t xml:space="preserve">(2). </w:t>
-      </w:r>
-      <w:hyperlink w:history="1" r:id="rIdubvys-mfdo45xyrze-pgm">
-        <w:r>
-          <w:rPr>
-            <w:rStyle w:val="Hyperlink"/>
-            <w:rFonts w:ascii="Georgia" w:cs="Georgia" w:eastAsia="Georgia" w:hAnsi="Georgia"/>
-            <w:sz w:val="20"/>
-            <w:szCs w:val="20"/>
-          </w:rPr>
-          <w:t xml:space="preserve">https://doi.org/10.1007/s43681-025-00438-2</w:t>
-        </w:r>
-      </w:hyperlink>
-    </w:p>
-    <w:p>
-      <w:pPr>
-        <w:pStyle w:val="ListParagraph"/>
-        <w:numPr>
-          <w:ilvl w:val="0"/>
-          <w:numId w:val="4"/>
-        </w:numPr>
-        <w:spacing w:after="60" w:before="0" w:line="240" w:lineRule="auto"/>
-      </w:pPr>
-      <w:r>
-        <w:rPr>
-          <w:rFonts w:ascii="Georgia" w:cs="Georgia" w:eastAsia="Georgia" w:hAnsi="Georgia"/>
-          <w:sz w:val="20"/>
-          <w:szCs w:val="20"/>
-        </w:rPr>
         <w:t xml:space="preserve">Goffi, E. R. (2022). Respecting cultural diversity in ethics applied to AI: A new approach for multicultural governance. </w:t>
       </w:r>
       <w:r>
@@ -4166,15 +4072,15 @@
         </w:rPr>
         <w:t xml:space="preserve">. </w:t>
       </w:r>
-      <w:hyperlink w:history="1" r:id="rId0ltss3waocscjrjtcauai">
-        <w:r>
-          <w:rPr>
-            <w:rStyle w:val="Hyperlink"/>
-            <w:rFonts w:ascii="Georgia" w:cs="Georgia" w:eastAsia="Georgia" w:hAnsi="Georgia"/>
-            <w:sz w:val="20"/>
-            <w:szCs w:val="20"/>
-          </w:rPr>
-          <w:t xml:space="preserve">https://www.iso.org/standard/65034.html</w:t>
+      <w:hyperlink w:history="1" r:id="rId3loeps2a_plxjayheievc">
+        <w:r>
+          <w:rPr>
+            <w:rStyle w:val="Hyperlink"/>
+            <w:rFonts w:ascii="Georgia" w:cs="Georgia" w:eastAsia="Georgia" w:hAnsi="Georgia"/>
+            <w:sz w:val="20"/>
+            <w:szCs w:val="20"/>
+          </w:rPr>
+          <w:t xml:space="preserve">https://www.iso.org/standard/65036.html</w:t>
         </w:r>
       </w:hyperlink>
     </w:p>
@@ -4213,7 +4119,7 @@
         </w:rPr>
         <w:t xml:space="preserve">. </w:t>
       </w:r>
-      <w:hyperlink w:history="1" r:id="rIdxftwo75fiwsmimkgodqt6">
+      <w:hyperlink w:history="1" r:id="rIdu73ajb9riav_x2nrrtev-">
         <w:r>
           <w:rPr>
             <w:rStyle w:val="Hyperlink"/>
@@ -4260,7 +4166,7 @@
         </w:rPr>
         <w:t xml:space="preserve">. </w:t>
       </w:r>
-      <w:hyperlink w:history="1" r:id="rIdzyhpg_pew01x-zpfvuvjm">
+      <w:hyperlink w:history="1" r:id="rId1yxryvow_saklex8nuqd2">
         <w:r>
           <w:rPr>
             <w:rStyle w:val="Hyperlink"/>
@@ -4307,7 +4213,7 @@
         </w:rPr>
         <w:t xml:space="preserve">, 389-399. </w:t>
       </w:r>
-      <w:hyperlink w:history="1" r:id="rIdt5jvrssptyon0rqsnwqtm">
+      <w:hyperlink w:history="1" r:id="rIdjyn7xzmsrqbz_caye8_qt">
         <w:r>
           <w:rPr>
             <w:rStyle w:val="Hyperlink"/>
@@ -4352,17 +4258,17 @@
           <w:sz w:val="20"/>
           <w:szCs w:val="20"/>
         </w:rPr>
-        <w:t xml:space="preserve">. Oxford Academic. </w:t>
-      </w:r>
-      <w:hyperlink w:history="1" r:id="rId_44sohynntegxrwuu3tro">
-        <w:r>
-          <w:rPr>
-            <w:rStyle w:val="Hyperlink"/>
-            <w:rFonts w:ascii="Georgia" w:cs="Georgia" w:eastAsia="Georgia" w:hAnsi="Georgia"/>
-            <w:sz w:val="20"/>
-            <w:szCs w:val="20"/>
-          </w:rPr>
-          <w:t xml:space="preserve">https://doi.org/10.1093/9780191988455.003.0001</w:t>
+        <w:t xml:space="preserve">. Oxford University Press. </w:t>
+      </w:r>
+      <w:hyperlink w:history="1" r:id="rIdoi43rlii-ekla0nywvfye">
+        <w:r>
+          <w:rPr>
+            <w:rStyle w:val="Hyperlink"/>
+            <w:rFonts w:ascii="Georgia" w:cs="Georgia" w:eastAsia="Georgia" w:hAnsi="Georgia"/>
+            <w:sz w:val="20"/>
+            <w:szCs w:val="20"/>
+          </w:rPr>
+          <w:t xml:space="preserve">https://doi.org/10.1093/9780191988455.001.0001</w:t>
         </w:r>
       </w:hyperlink>
     </w:p>
@@ -4401,7 +4307,7 @@
         </w:rPr>
         <w:t xml:space="preserve">. </w:t>
       </w:r>
-      <w:hyperlink w:history="1" r:id="rId1lzul83y6dkhywkvi_maz">
+      <w:hyperlink w:history="1" r:id="rIdxs5crgn4ymjnwcfsw_9wf">
         <w:r>
           <w:rPr>
             <w:rStyle w:val="Hyperlink"/>
@@ -4448,7 +4354,7 @@
         </w:rPr>
         <w:t xml:space="preserve">. </w:t>
       </w:r>
-      <w:hyperlink w:history="1" r:id="rIdomns1ey_oefavpktell2u">
+      <w:hyperlink w:history="1" r:id="rIdzqmkcpsil0p7aeodxdf8d">
         <w:r>
           <w:rPr>
             <w:rStyle w:val="Hyperlink"/>
@@ -4495,7 +4401,7 @@
         </w:rPr>
         <w:t xml:space="preserve">. </w:t>
       </w:r>
-      <w:hyperlink w:history="1" r:id="rIdirq3hltg4bvqa7ylhsho5">
+      <w:hyperlink w:history="1" r:id="rIdg0ikvd3fltqngh9kfn-h5">
         <w:r>
           <w:rPr>
             <w:rStyle w:val="Hyperlink"/>
@@ -4542,7 +4448,7 @@
         </w:rPr>
         <w:t xml:space="preserve"> (OECD/LEGAL/0449, amended 2024). </w:t>
       </w:r>
-      <w:hyperlink w:history="1" r:id="rId5vl1wx_dyp_zwrkgvqxat">
+      <w:hyperlink w:history="1" r:id="rIdjxz8t14uuzqsjliz-vvq3">
         <w:r>
           <w:rPr>
             <w:rStyle w:val="Hyperlink"/>
@@ -4589,7 +4495,7 @@
         </w:rPr>
         <w:t xml:space="preserve">. </w:t>
       </w:r>
-      <w:hyperlink w:history="1" r:id="rIdp_uvbtllsaekg_edu4jsq">
+      <w:hyperlink w:history="1" r:id="rIdbfi7rlyfihyaisgsdbvue">
         <w:r>
           <w:rPr>
             <w:rStyle w:val="Hyperlink"/>
@@ -4636,7 +4542,7 @@
         </w:rPr>
         <w:t xml:space="preserve">(26). </w:t>
       </w:r>
-      <w:hyperlink w:history="1" r:id="rId0-rqayxgx9nrfsymc_li8">
+      <w:hyperlink w:history="1" r:id="rIdknl2_wrfpgnzjxq4yzsuw">
         <w:r>
           <w:rPr>
             <w:rStyle w:val="Hyperlink"/>
@@ -4683,7 +4589,7 @@
         </w:rPr>
         <w:t xml:space="preserve">. </w:t>
       </w:r>
-      <w:hyperlink w:history="1" r:id="rIdsc9jhh44kkwreogxijpml">
+      <w:hyperlink w:history="1" r:id="rIdodn6vxqw7wmzkqubkzt1a">
         <w:r>
           <w:rPr>
             <w:rStyle w:val="Hyperlink"/>
@@ -4763,7 +4669,7 @@
         </w:rPr>
         <w:t xml:space="preserve">. basilpuglisi.com. </w:t>
       </w:r>
-      <w:hyperlink w:history="1" r:id="rIdt_of-_quygu8w_7ccqaqo">
+      <w:hyperlink w:history="1" r:id="rIdwucsb79hwwckcokcwj_l1">
         <w:r>
           <w:rPr>
             <w:rStyle w:val="Hyperlink"/>
@@ -5187,7 +5093,7 @@
         </w:rPr>
         <w:t xml:space="preserve">. basilpuglisi.com. </w:t>
       </w:r>
-      <w:hyperlink w:history="1" r:id="rIdrnnuhrc3wh8bl8-ju4gyw">
+      <w:hyperlink w:history="1" r:id="rIdybwifyihv6rfsre8su_yg">
         <w:r>
           <w:rPr>
             <w:rStyle w:val="Hyperlink"/>
@@ -5214,53 +5120,6 @@
           <w:sz w:val="20"/>
           <w:szCs w:val="20"/>
         </w:rPr>
-        <w:t xml:space="preserve">Banovic, N., Kraut, R. E., Olson, J. S., &amp; Steinfeld, A. (2023). The effects of explanations and algorithmic accuracy on visual recommender systems of artistic images. </w:t>
-      </w:r>
-      <w:r>
-        <w:rPr>
-          <w:rFonts w:ascii="Georgia" w:cs="Georgia" w:eastAsia="Georgia" w:hAnsi="Georgia"/>
-          <w:i/>
-          <w:iCs/>
-          <w:sz w:val="20"/>
-          <w:szCs w:val="20"/>
-        </w:rPr>
-        <w:t xml:space="preserve">Behaviour &amp; Information Technology, 43</w:t>
-      </w:r>
-      <w:r>
-        <w:rPr>
-          <w:rFonts w:ascii="Georgia" w:cs="Georgia" w:eastAsia="Georgia" w:hAnsi="Georgia"/>
-          <w:sz w:val="20"/>
-          <w:szCs w:val="20"/>
-        </w:rPr>
-        <w:t xml:space="preserve">(9), 1-18. </w:t>
-      </w:r>
-      <w:hyperlink w:history="1" r:id="rIdl9mckpiypb4oevswydgpd">
-        <w:r>
-          <w:rPr>
-            <w:rStyle w:val="Hyperlink"/>
-            <w:rFonts w:ascii="Georgia" w:cs="Georgia" w:eastAsia="Georgia" w:hAnsi="Georgia"/>
-            <w:sz w:val="20"/>
-            <w:szCs w:val="20"/>
-          </w:rPr>
-          <w:t xml:space="preserve">https://doi.org/10.1080/0144929X.2023.2184098</w:t>
-        </w:r>
-      </w:hyperlink>
-    </w:p>
-    <w:p>
-      <w:pPr>
-        <w:pStyle w:val="ListParagraph"/>
-        <w:numPr>
-          <w:ilvl w:val="0"/>
-          <w:numId w:val="4"/>
-        </w:numPr>
-        <w:spacing w:after="60" w:before="0" w:line="240" w:lineRule="auto"/>
-      </w:pPr>
-      <w:r>
-        <w:rPr>
-          <w:rFonts w:ascii="Georgia" w:cs="Georgia" w:eastAsia="Georgia" w:hAnsi="Georgia"/>
-          <w:sz w:val="20"/>
-          <w:szCs w:val="20"/>
-        </w:rPr>
         <w:t xml:space="preserve">European Data Protection Supervisor. (2025, September 22). </w:t>
       </w:r>
       <w:r>
@@ -5353,7 +5212,7 @@
         </w:rPr>
         <w:t xml:space="preserve">(1), 121-127. </w:t>
       </w:r>
-      <w:hyperlink w:history="1" r:id="rId-1bv6kbpqdumcqqirhhkr">
+      <w:hyperlink w:history="1" r:id="rId9qd7jbs9hvc7hk5j6dxvr">
         <w:r>
           <w:rPr>
             <w:rStyle w:val="Hyperlink"/>
@@ -5433,7 +5292,7 @@
         </w:rPr>
         <w:t xml:space="preserve">. basilpuglisi.com. </w:t>
       </w:r>
-      <w:hyperlink w:history="1" r:id="rId8t150_ytfxnx0tdy-1epz">
+      <w:hyperlink w:history="1" r:id="rIdlp0r2gryqwitdeisaqgya">
         <w:r>
           <w:rPr>
             <w:rStyle w:val="Hyperlink"/>
@@ -5480,7 +5339,7 @@
         </w:rPr>
         <w:t xml:space="preserve">. </w:t>
       </w:r>
-      <w:hyperlink w:history="1" r:id="rIdf9xdsobaag0acodfnmm_s">
+      <w:hyperlink w:history="1" r:id="rIdyoz7a5c-j5lebajm5sqk6">
         <w:r>
           <w:rPr>
             <w:rStyle w:val="Hyperlink"/>
@@ -5527,7 +5386,7 @@
         </w:rPr>
         <w:t xml:space="preserve"> (arXiv:2212.08073). </w:t>
       </w:r>
-      <w:hyperlink w:history="1" r:id="rIdrkamyb5qtsdvhe0sr7ei-">
+      <w:hyperlink w:history="1" r:id="rIdmfjlqz1kkakq_jshulrfy">
         <w:r>
           <w:rPr>
             <w:rStyle w:val="Hyperlink"/>
@@ -5590,17 +5449,118 @@
           <w:sz w:val="20"/>
           <w:szCs w:val="20"/>
         </w:rPr>
-        <w:t xml:space="preserve">Digital Constitutionalist. (2024). </w:t>
-      </w:r>
-      <w:r>
-        <w:rPr>
-          <w:rFonts w:ascii="Georgia" w:cs="Georgia" w:eastAsia="Georgia" w:hAnsi="Georgia"/>
-          <w:i/>
-          <w:iCs/>
-          <w:sz w:val="20"/>
-          <w:szCs w:val="20"/>
-        </w:rPr>
-        <w:t xml:space="preserve">On constitutional AI</w:t>
+        <w:t xml:space="preserve">EU AI Act, Article 14 (Human oversight by natural persons for high-risk systems). </w:t>
+      </w:r>
+      <w:hyperlink w:history="1" r:id="rIddmfd9ztdfsbxja8kx5f-o">
+        <w:r>
+          <w:rPr>
+            <w:rStyle w:val="Hyperlink"/>
+            <w:rFonts w:ascii="Georgia" w:cs="Georgia" w:eastAsia="Georgia" w:hAnsi="Georgia"/>
+            <w:sz w:val="20"/>
+            <w:szCs w:val="20"/>
+          </w:rPr>
+          <w:t xml:space="preserve">https://artificialintelligenceact.eu/article/14/</w:t>
+        </w:r>
+      </w:hyperlink>
+    </w:p>
+    <w:p>
+      <w:pPr>
+        <w:pStyle w:val="ListParagraph"/>
+        <w:numPr>
+          <w:ilvl w:val="0"/>
+          <w:numId w:val="4"/>
+        </w:numPr>
+        <w:spacing w:after="60" w:before="0" w:line="240" w:lineRule="auto"/>
+      </w:pPr>
+      <w:r>
+        <w:rPr>
+          <w:rFonts w:ascii="Georgia" w:cs="Georgia" w:eastAsia="Georgia" w:hAnsi="Georgia"/>
+          <w:sz w:val="20"/>
+          <w:szCs w:val="20"/>
+        </w:rPr>
+        <w:t xml:space="preserve">European Parliament and Council. (2024). </w:t>
+      </w:r>
+      <w:r>
+        <w:rPr>
+          <w:rFonts w:ascii="Georgia" w:cs="Georgia" w:eastAsia="Georgia" w:hAnsi="Georgia"/>
+          <w:i/>
+          <w:iCs/>
+          <w:sz w:val="20"/>
+          <w:szCs w:val="20"/>
+        </w:rPr>
+        <w:t xml:space="preserve">Regulation (EU) 2024/1689 (AI Act)</w:t>
+      </w:r>
+      <w:r>
+        <w:rPr>
+          <w:rFonts w:ascii="Georgia" w:cs="Georgia" w:eastAsia="Georgia" w:hAnsi="Georgia"/>
+          <w:sz w:val="20"/>
+          <w:szCs w:val="20"/>
+        </w:rPr>
+        <w:t xml:space="preserve">, Article 14: Human oversight; Article 17: Quality management system.</w:t>
+      </w:r>
+    </w:p>
+    <w:p>
+      <w:pPr>
+        <w:pStyle w:val="ListParagraph"/>
+        <w:numPr>
+          <w:ilvl w:val="0"/>
+          <w:numId w:val="4"/>
+        </w:numPr>
+        <w:spacing w:after="60" w:before="0" w:line="240" w:lineRule="auto"/>
+      </w:pPr>
+      <w:r>
+        <w:rPr>
+          <w:rFonts w:ascii="Georgia" w:cs="Georgia" w:eastAsia="Georgia" w:hAnsi="Georgia"/>
+          <w:sz w:val="20"/>
+          <w:szCs w:val="20"/>
+        </w:rPr>
+        <w:t xml:space="preserve">Fink, M. (2025). </w:t>
+      </w:r>
+      <w:r>
+        <w:rPr>
+          <w:rFonts w:ascii="Georgia" w:cs="Georgia" w:eastAsia="Georgia" w:hAnsi="Georgia"/>
+          <w:i/>
+          <w:iCs/>
+          <w:sz w:val="20"/>
+          <w:szCs w:val="20"/>
+        </w:rPr>
+        <w:t xml:space="preserve">Human oversight under Article 14 of the EU AI Act</w:t>
+      </w:r>
+      <w:r>
+        <w:rPr>
+          <w:rFonts w:ascii="Georgia" w:cs="Georgia" w:eastAsia="Georgia" w:hAnsi="Georgia"/>
+          <w:sz w:val="20"/>
+          <w:szCs w:val="20"/>
+        </w:rPr>
+        <w:t xml:space="preserve">. SSRN.</w:t>
+      </w:r>
+    </w:p>
+    <w:p>
+      <w:pPr>
+        <w:pStyle w:val="ListParagraph"/>
+        <w:numPr>
+          <w:ilvl w:val="0"/>
+          <w:numId w:val="4"/>
+        </w:numPr>
+        <w:spacing w:after="60" w:before="0" w:line="240" w:lineRule="auto"/>
+      </w:pPr>
+      <w:r>
+        <w:rPr>
+          <w:rFonts w:ascii="Georgia" w:cs="Georgia" w:eastAsia="Georgia" w:hAnsi="Georgia"/>
+          <w:sz w:val="20"/>
+          <w:szCs w:val="20"/>
+        </w:rPr>
+        <w:t xml:space="preserve">IEEE. </w:t>
+      </w:r>
+      <w:r>
+        <w:rPr>
+          <w:rFonts w:ascii="Georgia" w:cs="Georgia" w:eastAsia="Georgia" w:hAnsi="Georgia"/>
+          <w:i/>
+          <w:iCs/>
+          <w:sz w:val="20"/>
+          <w:szCs w:val="20"/>
+        </w:rPr>
+        <w:t xml:space="preserve">Ethically aligned design</w:t>
       </w:r>
       <w:r>
         <w:rPr>
@@ -5610,7 +5570,409 @@
         </w:rPr>
         <w:t xml:space="preserve">. </w:t>
       </w:r>
-      <w:hyperlink w:history="1" r:id="rIdiebgb7f1geyk72ecx6z_f">
+      <w:hyperlink w:history="1" r:id="rIdrw32fbc8nwaelal6qieq8">
+        <w:r>
+          <w:rPr>
+            <w:rStyle w:val="Hyperlink"/>
+            <w:rFonts w:ascii="Georgia" w:cs="Georgia" w:eastAsia="Georgia" w:hAnsi="Georgia"/>
+            <w:sz w:val="20"/>
+            <w:szCs w:val="20"/>
+          </w:rPr>
+          <w:t xml:space="preserve">https://ethicsinaction.ieee.org/</w:t>
+        </w:r>
+      </w:hyperlink>
+    </w:p>
+    <w:p>
+      <w:pPr>
+        <w:pStyle w:val="ListParagraph"/>
+        <w:numPr>
+          <w:ilvl w:val="0"/>
+          <w:numId w:val="4"/>
+        </w:numPr>
+        <w:spacing w:after="60" w:before="0" w:line="240" w:lineRule="auto"/>
+      </w:pPr>
+      <w:r>
+        <w:rPr>
+          <w:rFonts w:ascii="Georgia" w:cs="Georgia" w:eastAsia="Georgia" w:hAnsi="Georgia"/>
+          <w:sz w:val="20"/>
+          <w:szCs w:val="20"/>
+        </w:rPr>
+        <w:t xml:space="preserve">International Association of Privacy Professionals. (2022). </w:t>
+      </w:r>
+      <w:r>
+        <w:rPr>
+          <w:rFonts w:ascii="Georgia" w:cs="Georgia" w:eastAsia="Georgia" w:hAnsi="Georgia"/>
+          <w:i/>
+          <w:iCs/>
+          <w:sz w:val="20"/>
+          <w:szCs w:val="20"/>
+        </w:rPr>
+        <w:t xml:space="preserve">Human-in-the-loop in AI risk management: Not a cure-all approach</w:t>
+      </w:r>
+      <w:r>
+        <w:rPr>
+          <w:rFonts w:ascii="Georgia" w:cs="Georgia" w:eastAsia="Georgia" w:hAnsi="Georgia"/>
+          <w:sz w:val="20"/>
+          <w:szCs w:val="20"/>
+        </w:rPr>
+        <w:t xml:space="preserve">. </w:t>
+      </w:r>
+      <w:hyperlink w:history="1" r:id="rIdohajvk3o_e1q8t37h3x4g">
+        <w:r>
+          <w:rPr>
+            <w:rStyle w:val="Hyperlink"/>
+            <w:rFonts w:ascii="Georgia" w:cs="Georgia" w:eastAsia="Georgia" w:hAnsi="Georgia"/>
+            <w:sz w:val="20"/>
+            <w:szCs w:val="20"/>
+          </w:rPr>
+          <w:t xml:space="preserve">https://iapp.org/news/a/-human-in-the-loop-in-ai-risk-management-not-a-cure-all-approach</w:t>
+        </w:r>
+      </w:hyperlink>
+    </w:p>
+    <w:p>
+      <w:pPr>
+        <w:pStyle w:val="ListParagraph"/>
+        <w:numPr>
+          <w:ilvl w:val="0"/>
+          <w:numId w:val="4"/>
+        </w:numPr>
+        <w:spacing w:after="60" w:before="0" w:line="240" w:lineRule="auto"/>
+      </w:pPr>
+      <w:r>
+        <w:rPr>
+          <w:rFonts w:ascii="Georgia" w:cs="Georgia" w:eastAsia="Georgia" w:hAnsi="Georgia"/>
+          <w:sz w:val="20"/>
+          <w:szCs w:val="20"/>
+        </w:rPr>
+        <w:t xml:space="preserve">ISO 37000:2021 (Governance as accountability, decision-making authority, stakeholder expectations). </w:t>
+      </w:r>
+      <w:hyperlink w:history="1" r:id="rIdwu0efgvcndumcwoyziy_q">
+        <w:r>
+          <w:rPr>
+            <w:rStyle w:val="Hyperlink"/>
+            <w:rFonts w:ascii="Georgia" w:cs="Georgia" w:eastAsia="Georgia" w:hAnsi="Georgia"/>
+            <w:sz w:val="20"/>
+            <w:szCs w:val="20"/>
+          </w:rPr>
+          <w:t xml:space="preserve">https://committee.iso.org/ISO_37000_Governance</w:t>
+        </w:r>
+      </w:hyperlink>
+    </w:p>
+    <w:p>
+      <w:pPr>
+        <w:pStyle w:val="ListParagraph"/>
+        <w:numPr>
+          <w:ilvl w:val="0"/>
+          <w:numId w:val="4"/>
+        </w:numPr>
+        <w:spacing w:after="60" w:before="0" w:line="240" w:lineRule="auto"/>
+      </w:pPr>
+      <w:r>
+        <w:rPr>
+          <w:rFonts w:ascii="Georgia" w:cs="Georgia" w:eastAsia="Georgia" w:hAnsi="Georgia"/>
+          <w:sz w:val="20"/>
+          <w:szCs w:val="20"/>
+        </w:rPr>
+        <w:t xml:space="preserve">ISO/IEC 38500:2024 (IT governance framework, decision-making structures). </w:t>
+      </w:r>
+      <w:hyperlink w:history="1" r:id="rId2cnaim62znqdik0cs78ui">
+        <w:r>
+          <w:rPr>
+            <w:rStyle w:val="Hyperlink"/>
+            <w:rFonts w:ascii="Georgia" w:cs="Georgia" w:eastAsia="Georgia" w:hAnsi="Georgia"/>
+            <w:sz w:val="20"/>
+            <w:szCs w:val="20"/>
+          </w:rPr>
+          <w:t xml:space="preserve">https://committee.iso.org/sites/jtc1sc40/home/news/content-left-area/News/iso-iec-38500-2024-information-t.html</w:t>
+        </w:r>
+      </w:hyperlink>
+    </w:p>
+    <w:p>
+      <w:pPr>
+        <w:pStyle w:val="ListParagraph"/>
+        <w:numPr>
+          <w:ilvl w:val="0"/>
+          <w:numId w:val="4"/>
+        </w:numPr>
+        <w:spacing w:after="60" w:before="0" w:line="240" w:lineRule="auto"/>
+      </w:pPr>
+      <w:r>
+        <w:rPr>
+          <w:rFonts w:ascii="Georgia" w:cs="Georgia" w:eastAsia="Georgia" w:hAnsi="Georgia"/>
+          <w:sz w:val="20"/>
+          <w:szCs w:val="20"/>
+        </w:rPr>
+        <w:t xml:space="preserve">ISO/IEC 38500:2024 White Paper (Governance framework definition from ISO 37000). </w:t>
+      </w:r>
+      <w:hyperlink w:history="1" r:id="rIdnfpxup7wrcvfrrcigzv6g">
+        <w:r>
+          <w:rPr>
+            <w:rStyle w:val="Hyperlink"/>
+            <w:rFonts w:ascii="Georgia" w:cs="Georgia" w:eastAsia="Georgia" w:hAnsi="Georgia"/>
+            <w:sz w:val="20"/>
+            <w:szCs w:val="20"/>
+          </w:rPr>
+          <w:t xml:space="preserve">https://committee.iso.org/sites/jtc1sc40/home/projects/wg-1/published-wg1/content-left-area/isoiec-sc-40-wg-1-develops-the-s/white-paper-on-the-differences-b.html</w:t>
+        </w:r>
+      </w:hyperlink>
+    </w:p>
+    <w:p>
+      <w:pPr>
+        <w:pStyle w:val="ListParagraph"/>
+        <w:numPr>
+          <w:ilvl w:val="0"/>
+          <w:numId w:val="4"/>
+        </w:numPr>
+        <w:spacing w:after="60" w:before="0" w:line="240" w:lineRule="auto"/>
+      </w:pPr>
+      <w:r>
+        <w:rPr>
+          <w:rFonts w:ascii="Georgia" w:cs="Georgia" w:eastAsia="Georgia" w:hAnsi="Georgia"/>
+          <w:sz w:val="20"/>
+          <w:szCs w:val="20"/>
+        </w:rPr>
+        <w:t xml:space="preserve">ISO/IEC 38507:2022 (Governance implications of AI use). </w:t>
+      </w:r>
+      <w:hyperlink w:history="1" r:id="rIdkevos_cfyjqoziw6-nhyr">
+        <w:r>
+          <w:rPr>
+            <w:rStyle w:val="Hyperlink"/>
+            <w:rFonts w:ascii="Georgia" w:cs="Georgia" w:eastAsia="Georgia" w:hAnsi="Georgia"/>
+            <w:sz w:val="20"/>
+            <w:szCs w:val="20"/>
+          </w:rPr>
+          <w:t xml:space="preserve">https://www.itsmf.ch/blogs/post/the-eu-ai-act-and-the-main-related-iso-standards-42001-38507-and-38500</w:t>
+        </w:r>
+      </w:hyperlink>
+    </w:p>
+    <w:p>
+      <w:pPr>
+        <w:pStyle w:val="ListParagraph"/>
+        <w:numPr>
+          <w:ilvl w:val="0"/>
+          <w:numId w:val="4"/>
+        </w:numPr>
+        <w:spacing w:after="60" w:before="0" w:line="240" w:lineRule="auto"/>
+      </w:pPr>
+      <w:r>
+        <w:rPr>
+          <w:rFonts w:ascii="Georgia" w:cs="Georgia" w:eastAsia="Georgia" w:hAnsi="Georgia"/>
+          <w:sz w:val="20"/>
+          <w:szCs w:val="20"/>
+        </w:rPr>
+        <w:t xml:space="preserve">ISO/IEC 42001:2023 (AI management systems). </w:t>
+      </w:r>
+      <w:hyperlink w:history="1" r:id="rIdmongwuseyc4utvneg5txa">
+        <w:r>
+          <w:rPr>
+            <w:rStyle w:val="Hyperlink"/>
+            <w:rFonts w:ascii="Georgia" w:cs="Georgia" w:eastAsia="Georgia" w:hAnsi="Georgia"/>
+            <w:sz w:val="20"/>
+            <w:szCs w:val="20"/>
+          </w:rPr>
+          <w:t xml:space="preserve">https://www.iso.org/standard/42001</w:t>
+        </w:r>
+      </w:hyperlink>
+    </w:p>
+    <w:p>
+      <w:pPr>
+        <w:pStyle w:val="ListParagraph"/>
+        <w:numPr>
+          <w:ilvl w:val="0"/>
+          <w:numId w:val="4"/>
+        </w:numPr>
+        <w:spacing w:after="60" w:before="0" w:line="240" w:lineRule="auto"/>
+      </w:pPr>
+      <w:r>
+        <w:rPr>
+          <w:rFonts w:ascii="Georgia" w:cs="Georgia" w:eastAsia="Georgia" w:hAnsi="Georgia"/>
+          <w:sz w:val="20"/>
+          <w:szCs w:val="20"/>
+        </w:rPr>
+        <w:t xml:space="preserve">Jobin, A., Ienca, M., &amp; Vayena, E. (2019). Global landscape of 84 AI ethics guidelines. </w:t>
+      </w:r>
+      <w:hyperlink w:history="1" r:id="rIdwnnngh8q7viejejari91i">
+        <w:r>
+          <w:rPr>
+            <w:rStyle w:val="Hyperlink"/>
+            <w:rFonts w:ascii="Georgia" w:cs="Georgia" w:eastAsia="Georgia" w:hAnsi="Georgia"/>
+            <w:sz w:val="20"/>
+            <w:szCs w:val="20"/>
+          </w:rPr>
+          <w:t xml:space="preserve">https://doi.org/10.1038/s42256-019-0088-2</w:t>
+        </w:r>
+      </w:hyperlink>
+    </w:p>
+    <w:p>
+      <w:pPr>
+        <w:pStyle w:val="ListParagraph"/>
+        <w:numPr>
+          <w:ilvl w:val="0"/>
+          <w:numId w:val="4"/>
+        </w:numPr>
+        <w:spacing w:after="60" w:before="0" w:line="240" w:lineRule="auto"/>
+      </w:pPr>
+      <w:r>
+        <w:rPr>
+          <w:rFonts w:ascii="Georgia" w:cs="Georgia" w:eastAsia="Georgia" w:hAnsi="Georgia"/>
+          <w:sz w:val="20"/>
+          <w:szCs w:val="20"/>
+        </w:rPr>
+        <w:t xml:space="preserve">Maas, M. M. (2025). </w:t>
+      </w:r>
+      <w:r>
+        <w:rPr>
+          <w:rFonts w:ascii="Georgia" w:cs="Georgia" w:eastAsia="Georgia" w:hAnsi="Georgia"/>
+          <w:i/>
+          <w:iCs/>
+          <w:sz w:val="20"/>
+          <w:szCs w:val="20"/>
+        </w:rPr>
+        <w:t xml:space="preserve">Architectures of global AI governance: From technological change to human choice</w:t>
+      </w:r>
+      <w:r>
+        <w:rPr>
+          <w:rFonts w:ascii="Georgia" w:cs="Georgia" w:eastAsia="Georgia" w:hAnsi="Georgia"/>
+          <w:sz w:val="20"/>
+          <w:szCs w:val="20"/>
+        </w:rPr>
+        <w:t xml:space="preserve">. Oxford University Press. </w:t>
+      </w:r>
+      <w:hyperlink w:history="1" r:id="rIdntbz-5f80ficxahzy8yuz">
+        <w:r>
+          <w:rPr>
+            <w:rStyle w:val="Hyperlink"/>
+            <w:rFonts w:ascii="Georgia" w:cs="Georgia" w:eastAsia="Georgia" w:hAnsi="Georgia"/>
+            <w:sz w:val="20"/>
+            <w:szCs w:val="20"/>
+          </w:rPr>
+          <w:t xml:space="preserve">https://doi.org/10.1093/9780191988455.001.0001</w:t>
+        </w:r>
+      </w:hyperlink>
+    </w:p>
+    <w:p>
+      <w:pPr>
+        <w:pStyle w:val="ListParagraph"/>
+        <w:numPr>
+          <w:ilvl w:val="0"/>
+          <w:numId w:val="4"/>
+        </w:numPr>
+        <w:spacing w:after="60" w:before="0" w:line="240" w:lineRule="auto"/>
+      </w:pPr>
+      <w:r>
+        <w:rPr>
+          <w:rFonts w:ascii="Georgia" w:cs="Georgia" w:eastAsia="Georgia" w:hAnsi="Georgia"/>
+          <w:sz w:val="20"/>
+          <w:szCs w:val="20"/>
+        </w:rPr>
+        <w:t xml:space="preserve">NIST AI 600-1 Generative AI Profile. </w:t>
+      </w:r>
+      <w:hyperlink w:history="1" r:id="rIdtpytvijreiea346q9csku">
+        <w:r>
+          <w:rPr>
+            <w:rStyle w:val="Hyperlink"/>
+            <w:rFonts w:ascii="Georgia" w:cs="Georgia" w:eastAsia="Georgia" w:hAnsi="Georgia"/>
+            <w:sz w:val="20"/>
+            <w:szCs w:val="20"/>
+          </w:rPr>
+          <w:t xml:space="preserve">https://nvlpubs.nist.gov/nistpubs/ai/NIST.AI.600-1.pdf</w:t>
+        </w:r>
+      </w:hyperlink>
+    </w:p>
+    <w:p>
+      <w:pPr>
+        <w:pStyle w:val="ListParagraph"/>
+        <w:numPr>
+          <w:ilvl w:val="0"/>
+          <w:numId w:val="4"/>
+        </w:numPr>
+        <w:spacing w:after="60" w:before="0" w:line="240" w:lineRule="auto"/>
+      </w:pPr>
+      <w:r>
+        <w:rPr>
+          <w:rFonts w:ascii="Georgia" w:cs="Georgia" w:eastAsia="Georgia" w:hAnsi="Georgia"/>
+          <w:sz w:val="20"/>
+          <w:szCs w:val="20"/>
+        </w:rPr>
+        <w:t xml:space="preserve">NIST AI RMF 1.0. </w:t>
+      </w:r>
+      <w:hyperlink w:history="1" r:id="rIdr0ewssy2k4gdlxdmfzgya">
+        <w:r>
+          <w:rPr>
+            <w:rStyle w:val="Hyperlink"/>
+            <w:rFonts w:ascii="Georgia" w:cs="Georgia" w:eastAsia="Georgia" w:hAnsi="Georgia"/>
+            <w:sz w:val="20"/>
+            <w:szCs w:val="20"/>
+          </w:rPr>
+          <w:t xml:space="preserve">https://nvlpubs.nist.gov/nistpubs/ai/nist.ai.100-1.pdf</w:t>
+        </w:r>
+      </w:hyperlink>
+    </w:p>
+    <w:p>
+      <w:pPr>
+        <w:pStyle w:val="ListParagraph"/>
+        <w:numPr>
+          <w:ilvl w:val="0"/>
+          <w:numId w:val="4"/>
+        </w:numPr>
+        <w:spacing w:after="60" w:before="0" w:line="240" w:lineRule="auto"/>
+      </w:pPr>
+      <w:r>
+        <w:rPr>
+          <w:rFonts w:ascii="Georgia" w:cs="Georgia" w:eastAsia="Georgia" w:hAnsi="Georgia"/>
+          <w:sz w:val="20"/>
+          <w:szCs w:val="20"/>
+        </w:rPr>
+        <w:t xml:space="preserve">OECD AI Principles. </w:t>
+      </w:r>
+      <w:hyperlink w:history="1" r:id="rIdp2aza1ymgl6f2jqgkyw6k">
+        <w:r>
+          <w:rPr>
+            <w:rStyle w:val="Hyperlink"/>
+            <w:rFonts w:ascii="Georgia" w:cs="Georgia" w:eastAsia="Georgia" w:hAnsi="Georgia"/>
+            <w:sz w:val="20"/>
+            <w:szCs w:val="20"/>
+          </w:rPr>
+          <w:t xml:space="preserve">https://oecd.ai/en/ai-principles</w:t>
+        </w:r>
+      </w:hyperlink>
+    </w:p>
+    <w:p>
+      <w:pPr>
+        <w:pStyle w:val="ListParagraph"/>
+        <w:numPr>
+          <w:ilvl w:val="0"/>
+          <w:numId w:val="4"/>
+        </w:numPr>
+        <w:spacing w:after="60" w:before="0" w:line="240" w:lineRule="auto"/>
+      </w:pPr>
+      <w:r>
+        <w:rPr>
+          <w:rFonts w:ascii="Georgia" w:cs="Georgia" w:eastAsia="Georgia" w:hAnsi="Georgia"/>
+          <w:sz w:val="20"/>
+          <w:szCs w:val="20"/>
+        </w:rPr>
+        <w:t xml:space="preserve">Orozco y Villa, L. H., &amp; Menendez, N. (2025, March 13). </w:t>
+      </w:r>
+      <w:r>
+        <w:rPr>
+          <w:rFonts w:ascii="Georgia" w:cs="Georgia" w:eastAsia="Georgia" w:hAnsi="Georgia"/>
+          <w:i/>
+          <w:iCs/>
+          <w:sz w:val="20"/>
+          <w:szCs w:val="20"/>
+        </w:rPr>
+        <w:t xml:space="preserve">On ‘constitutional’ AI</w:t>
+      </w:r>
+      <w:r>
+        <w:rPr>
+          <w:rFonts w:ascii="Georgia" w:cs="Georgia" w:eastAsia="Georgia" w:hAnsi="Georgia"/>
+          <w:sz w:val="20"/>
+          <w:szCs w:val="20"/>
+        </w:rPr>
+        <w:t xml:space="preserve">. The Digital Constitutionalist. </w:t>
+      </w:r>
+      <w:hyperlink w:history="1" r:id="rIdb2a0rwqar45ouvsamiqpc">
         <w:r>
           <w:rPr>
             <w:rStyle w:val="Hyperlink"/>
@@ -5637,494 +5999,9 @@
           <w:sz w:val="20"/>
           <w:szCs w:val="20"/>
         </w:rPr>
-        <w:t xml:space="preserve">EU AI Act, Article 14 (Human oversight by natural persons for high-risk systems). </w:t>
-      </w:r>
-      <w:hyperlink w:history="1" r:id="rIdjebgomxlhzdfowjsajrjj">
-        <w:r>
-          <w:rPr>
-            <w:rStyle w:val="Hyperlink"/>
-            <w:rFonts w:ascii="Georgia" w:cs="Georgia" w:eastAsia="Georgia" w:hAnsi="Georgia"/>
-            <w:sz w:val="20"/>
-            <w:szCs w:val="20"/>
-          </w:rPr>
-          <w:t xml:space="preserve">https://artificialintelligenceact.eu/article/14/</w:t>
-        </w:r>
-      </w:hyperlink>
-    </w:p>
-    <w:p>
-      <w:pPr>
-        <w:pStyle w:val="ListParagraph"/>
-        <w:numPr>
-          <w:ilvl w:val="0"/>
-          <w:numId w:val="4"/>
-        </w:numPr>
-        <w:spacing w:after="60" w:before="0" w:line="240" w:lineRule="auto"/>
-      </w:pPr>
-      <w:r>
-        <w:rPr>
-          <w:rFonts w:ascii="Georgia" w:cs="Georgia" w:eastAsia="Georgia" w:hAnsi="Georgia"/>
-          <w:sz w:val="20"/>
-          <w:szCs w:val="20"/>
-        </w:rPr>
-        <w:t xml:space="preserve">European Parliament and Council. (2024). </w:t>
-      </w:r>
-      <w:r>
-        <w:rPr>
-          <w:rFonts w:ascii="Georgia" w:cs="Georgia" w:eastAsia="Georgia" w:hAnsi="Georgia"/>
-          <w:i/>
-          <w:iCs/>
-          <w:sz w:val="20"/>
-          <w:szCs w:val="20"/>
-        </w:rPr>
-        <w:t xml:space="preserve">Regulation (EU) 2024/1689 (AI Act)</w:t>
-      </w:r>
-      <w:r>
-        <w:rPr>
-          <w:rFonts w:ascii="Georgia" w:cs="Georgia" w:eastAsia="Georgia" w:hAnsi="Georgia"/>
-          <w:sz w:val="20"/>
-          <w:szCs w:val="20"/>
-        </w:rPr>
-        <w:t xml:space="preserve">, Article 14: Human oversight; Article 17: Quality management system.</w:t>
-      </w:r>
-    </w:p>
-    <w:p>
-      <w:pPr>
-        <w:pStyle w:val="ListParagraph"/>
-        <w:numPr>
-          <w:ilvl w:val="0"/>
-          <w:numId w:val="4"/>
-        </w:numPr>
-        <w:spacing w:after="60" w:before="0" w:line="240" w:lineRule="auto"/>
-      </w:pPr>
-      <w:r>
-        <w:rPr>
-          <w:rFonts w:ascii="Georgia" w:cs="Georgia" w:eastAsia="Georgia" w:hAnsi="Georgia"/>
-          <w:sz w:val="20"/>
-          <w:szCs w:val="20"/>
-        </w:rPr>
-        <w:t xml:space="preserve">Fink, M. (2025). </w:t>
-      </w:r>
-      <w:r>
-        <w:rPr>
-          <w:rFonts w:ascii="Georgia" w:cs="Georgia" w:eastAsia="Georgia" w:hAnsi="Georgia"/>
-          <w:i/>
-          <w:iCs/>
-          <w:sz w:val="20"/>
-          <w:szCs w:val="20"/>
-        </w:rPr>
-        <w:t xml:space="preserve">Human oversight under Article 14 of the EU AI Act</w:t>
-      </w:r>
-      <w:r>
-        <w:rPr>
-          <w:rFonts w:ascii="Georgia" w:cs="Georgia" w:eastAsia="Georgia" w:hAnsi="Georgia"/>
-          <w:sz w:val="20"/>
-          <w:szCs w:val="20"/>
-        </w:rPr>
-        <w:t xml:space="preserve">. SSRN.</w:t>
-      </w:r>
-    </w:p>
-    <w:p>
-      <w:pPr>
-        <w:pStyle w:val="ListParagraph"/>
-        <w:numPr>
-          <w:ilvl w:val="0"/>
-          <w:numId w:val="4"/>
-        </w:numPr>
-        <w:spacing w:after="60" w:before="0" w:line="240" w:lineRule="auto"/>
-      </w:pPr>
-      <w:r>
-        <w:rPr>
-          <w:rFonts w:ascii="Georgia" w:cs="Georgia" w:eastAsia="Georgia" w:hAnsi="Georgia"/>
-          <w:sz w:val="20"/>
-          <w:szCs w:val="20"/>
-        </w:rPr>
-        <w:t xml:space="preserve">IEEE. </w:t>
-      </w:r>
-      <w:r>
-        <w:rPr>
-          <w:rFonts w:ascii="Georgia" w:cs="Georgia" w:eastAsia="Georgia" w:hAnsi="Georgia"/>
-          <w:i/>
-          <w:iCs/>
-          <w:sz w:val="20"/>
-          <w:szCs w:val="20"/>
-        </w:rPr>
-        <w:t xml:space="preserve">Ethically aligned design</w:t>
-      </w:r>
-      <w:r>
-        <w:rPr>
-          <w:rFonts w:ascii="Georgia" w:cs="Georgia" w:eastAsia="Georgia" w:hAnsi="Georgia"/>
-          <w:sz w:val="20"/>
-          <w:szCs w:val="20"/>
-        </w:rPr>
-        <w:t xml:space="preserve">. </w:t>
-      </w:r>
-      <w:hyperlink w:history="1" r:id="rId1wo_nrmkjck5gpxgtsryg">
-        <w:r>
-          <w:rPr>
-            <w:rStyle w:val="Hyperlink"/>
-            <w:rFonts w:ascii="Georgia" w:cs="Georgia" w:eastAsia="Georgia" w:hAnsi="Georgia"/>
-            <w:sz w:val="20"/>
-            <w:szCs w:val="20"/>
-          </w:rPr>
-          <w:t xml:space="preserve">https://ethicsinaction.ieee.org/</w:t>
-        </w:r>
-      </w:hyperlink>
-    </w:p>
-    <w:p>
-      <w:pPr>
-        <w:pStyle w:val="ListParagraph"/>
-        <w:numPr>
-          <w:ilvl w:val="0"/>
-          <w:numId w:val="4"/>
-        </w:numPr>
-        <w:spacing w:after="60" w:before="0" w:line="240" w:lineRule="auto"/>
-      </w:pPr>
-      <w:r>
-        <w:rPr>
-          <w:rFonts w:ascii="Georgia" w:cs="Georgia" w:eastAsia="Georgia" w:hAnsi="Georgia"/>
-          <w:sz w:val="20"/>
-          <w:szCs w:val="20"/>
-        </w:rPr>
-        <w:t xml:space="preserve">International Association of Privacy Professionals. (2022). </w:t>
-      </w:r>
-      <w:r>
-        <w:rPr>
-          <w:rFonts w:ascii="Georgia" w:cs="Georgia" w:eastAsia="Georgia" w:hAnsi="Georgia"/>
-          <w:i/>
-          <w:iCs/>
-          <w:sz w:val="20"/>
-          <w:szCs w:val="20"/>
-        </w:rPr>
-        <w:t xml:space="preserve">Human-in-the-loop in AI risk management: Not a cure-all approach</w:t>
-      </w:r>
-      <w:r>
-        <w:rPr>
-          <w:rFonts w:ascii="Georgia" w:cs="Georgia" w:eastAsia="Georgia" w:hAnsi="Georgia"/>
-          <w:sz w:val="20"/>
-          <w:szCs w:val="20"/>
-        </w:rPr>
-        <w:t xml:space="preserve">. </w:t>
-      </w:r>
-      <w:hyperlink w:history="1" r:id="rIdnuic9exyakua2exr5u1j4">
-        <w:r>
-          <w:rPr>
-            <w:rStyle w:val="Hyperlink"/>
-            <w:rFonts w:ascii="Georgia" w:cs="Georgia" w:eastAsia="Georgia" w:hAnsi="Georgia"/>
-            <w:sz w:val="20"/>
-            <w:szCs w:val="20"/>
-          </w:rPr>
-          <w:t xml:space="preserve">https://iapp.org/news/a/-human-in-the-loop-in-ai-risk-management-not-a-cure-all-approach</w:t>
-        </w:r>
-      </w:hyperlink>
-    </w:p>
-    <w:p>
-      <w:pPr>
-        <w:pStyle w:val="ListParagraph"/>
-        <w:numPr>
-          <w:ilvl w:val="0"/>
-          <w:numId w:val="4"/>
-        </w:numPr>
-        <w:spacing w:after="60" w:before="0" w:line="240" w:lineRule="auto"/>
-      </w:pPr>
-      <w:r>
-        <w:rPr>
-          <w:rFonts w:ascii="Georgia" w:cs="Georgia" w:eastAsia="Georgia" w:hAnsi="Georgia"/>
-          <w:sz w:val="20"/>
-          <w:szCs w:val="20"/>
-        </w:rPr>
-        <w:t xml:space="preserve">ISO 37000:2021 (Governance as accountability, decision-making authority, stakeholder expectations). </w:t>
-      </w:r>
-      <w:hyperlink w:history="1" r:id="rIddlgzhzsxmb3afsfnqozhy">
-        <w:r>
-          <w:rPr>
-            <w:rStyle w:val="Hyperlink"/>
-            <w:rFonts w:ascii="Georgia" w:cs="Georgia" w:eastAsia="Georgia" w:hAnsi="Georgia"/>
-            <w:sz w:val="20"/>
-            <w:szCs w:val="20"/>
-          </w:rPr>
-          <w:t xml:space="preserve">https://committee.iso.org/ISO_37000_Governance</w:t>
-        </w:r>
-      </w:hyperlink>
-    </w:p>
-    <w:p>
-      <w:pPr>
-        <w:pStyle w:val="ListParagraph"/>
-        <w:numPr>
-          <w:ilvl w:val="0"/>
-          <w:numId w:val="4"/>
-        </w:numPr>
-        <w:spacing w:after="60" w:before="0" w:line="240" w:lineRule="auto"/>
-      </w:pPr>
-      <w:r>
-        <w:rPr>
-          <w:rFonts w:ascii="Georgia" w:cs="Georgia" w:eastAsia="Georgia" w:hAnsi="Georgia"/>
-          <w:sz w:val="20"/>
-          <w:szCs w:val="20"/>
-        </w:rPr>
-        <w:t xml:space="preserve">ISO/IEC 38500:2024 (IT governance framework, decision-making structures). </w:t>
-      </w:r>
-      <w:hyperlink w:history="1" r:id="rIdkizdcpb8lwwg5q6gqbfbn">
-        <w:r>
-          <w:rPr>
-            <w:rStyle w:val="Hyperlink"/>
-            <w:rFonts w:ascii="Georgia" w:cs="Georgia" w:eastAsia="Georgia" w:hAnsi="Georgia"/>
-            <w:sz w:val="20"/>
-            <w:szCs w:val="20"/>
-          </w:rPr>
-          <w:t xml:space="preserve">https://committee.iso.org/sites/jtc1sc40/home/news/content-left-area/News/iso-iec-38500-2024-information-t.html</w:t>
-        </w:r>
-      </w:hyperlink>
-    </w:p>
-    <w:p>
-      <w:pPr>
-        <w:pStyle w:val="ListParagraph"/>
-        <w:numPr>
-          <w:ilvl w:val="0"/>
-          <w:numId w:val="4"/>
-        </w:numPr>
-        <w:spacing w:after="60" w:before="0" w:line="240" w:lineRule="auto"/>
-      </w:pPr>
-      <w:r>
-        <w:rPr>
-          <w:rFonts w:ascii="Georgia" w:cs="Georgia" w:eastAsia="Georgia" w:hAnsi="Georgia"/>
-          <w:sz w:val="20"/>
-          <w:szCs w:val="20"/>
-        </w:rPr>
-        <w:t xml:space="preserve">ISO/IEC 38500:2024 White Paper (Governance framework definition from ISO 37000). </w:t>
-      </w:r>
-      <w:hyperlink w:history="1" r:id="rIdirw3n1ekvycvbuxbibfpt">
-        <w:r>
-          <w:rPr>
-            <w:rStyle w:val="Hyperlink"/>
-            <w:rFonts w:ascii="Georgia" w:cs="Georgia" w:eastAsia="Georgia" w:hAnsi="Georgia"/>
-            <w:sz w:val="20"/>
-            <w:szCs w:val="20"/>
-          </w:rPr>
-          <w:t xml:space="preserve">https://committee.iso.org/sites/jtc1sc40/home/projects/wg-1/published-wg1/content-left-area/isoiec-sc-40-wg-1-develops-the-s/white-paper-on-the-differences-b.html</w:t>
-        </w:r>
-      </w:hyperlink>
-    </w:p>
-    <w:p>
-      <w:pPr>
-        <w:pStyle w:val="ListParagraph"/>
-        <w:numPr>
-          <w:ilvl w:val="0"/>
-          <w:numId w:val="4"/>
-        </w:numPr>
-        <w:spacing w:after="60" w:before="0" w:line="240" w:lineRule="auto"/>
-      </w:pPr>
-      <w:r>
-        <w:rPr>
-          <w:rFonts w:ascii="Georgia" w:cs="Georgia" w:eastAsia="Georgia" w:hAnsi="Georgia"/>
-          <w:sz w:val="20"/>
-          <w:szCs w:val="20"/>
-        </w:rPr>
-        <w:t xml:space="preserve">ISO/IEC 38507:2022 (Governance implications of AI use). </w:t>
-      </w:r>
-      <w:hyperlink w:history="1" r:id="rIdgdobscejulbzgd6nosy46">
-        <w:r>
-          <w:rPr>
-            <w:rStyle w:val="Hyperlink"/>
-            <w:rFonts w:ascii="Georgia" w:cs="Georgia" w:eastAsia="Georgia" w:hAnsi="Georgia"/>
-            <w:sz w:val="20"/>
-            <w:szCs w:val="20"/>
-          </w:rPr>
-          <w:t xml:space="preserve">https://www.itsmf.ch/blogs/post/the-eu-ai-act-and-the-main-related-iso-standards-42001-38507-and-38500</w:t>
-        </w:r>
-      </w:hyperlink>
-    </w:p>
-    <w:p>
-      <w:pPr>
-        <w:pStyle w:val="ListParagraph"/>
-        <w:numPr>
-          <w:ilvl w:val="0"/>
-          <w:numId w:val="4"/>
-        </w:numPr>
-        <w:spacing w:after="60" w:before="0" w:line="240" w:lineRule="auto"/>
-      </w:pPr>
-      <w:r>
-        <w:rPr>
-          <w:rFonts w:ascii="Georgia" w:cs="Georgia" w:eastAsia="Georgia" w:hAnsi="Georgia"/>
-          <w:sz w:val="20"/>
-          <w:szCs w:val="20"/>
-        </w:rPr>
-        <w:t xml:space="preserve">ISO/IEC 42001:2023 (AI management systems). </w:t>
-      </w:r>
-      <w:hyperlink w:history="1" r:id="rIdpc9ogonlnlugnnj97bfil">
-        <w:r>
-          <w:rPr>
-            <w:rStyle w:val="Hyperlink"/>
-            <w:rFonts w:ascii="Georgia" w:cs="Georgia" w:eastAsia="Georgia" w:hAnsi="Georgia"/>
-            <w:sz w:val="20"/>
-            <w:szCs w:val="20"/>
-          </w:rPr>
-          <w:t xml:space="preserve">https://www.iso.org/standard/42001</w:t>
-        </w:r>
-      </w:hyperlink>
-    </w:p>
-    <w:p>
-      <w:pPr>
-        <w:pStyle w:val="ListParagraph"/>
-        <w:numPr>
-          <w:ilvl w:val="0"/>
-          <w:numId w:val="4"/>
-        </w:numPr>
-        <w:spacing w:after="60" w:before="0" w:line="240" w:lineRule="auto"/>
-      </w:pPr>
-      <w:r>
-        <w:rPr>
-          <w:rFonts w:ascii="Georgia" w:cs="Georgia" w:eastAsia="Georgia" w:hAnsi="Georgia"/>
-          <w:sz w:val="20"/>
-          <w:szCs w:val="20"/>
-        </w:rPr>
-        <w:t xml:space="preserve">Jobin, A., Ienca, M., &amp; Vayena, E. (2019). Global landscape of 84 AI ethics guidelines. </w:t>
-      </w:r>
-      <w:hyperlink w:history="1" r:id="rIdv6fmnh4dxtrrkl6uoa5yr">
-        <w:r>
-          <w:rPr>
-            <w:rStyle w:val="Hyperlink"/>
-            <w:rFonts w:ascii="Georgia" w:cs="Georgia" w:eastAsia="Georgia" w:hAnsi="Georgia"/>
-            <w:sz w:val="20"/>
-            <w:szCs w:val="20"/>
-          </w:rPr>
-          <w:t xml:space="preserve">https://doi.org/10.1038/s42256-019-0088-2</w:t>
-        </w:r>
-      </w:hyperlink>
-    </w:p>
-    <w:p>
-      <w:pPr>
-        <w:pStyle w:val="ListParagraph"/>
-        <w:numPr>
-          <w:ilvl w:val="0"/>
-          <w:numId w:val="4"/>
-        </w:numPr>
-        <w:spacing w:after="60" w:before="0" w:line="240" w:lineRule="auto"/>
-      </w:pPr>
-      <w:r>
-        <w:rPr>
-          <w:rFonts w:ascii="Georgia" w:cs="Georgia" w:eastAsia="Georgia" w:hAnsi="Georgia"/>
-          <w:sz w:val="20"/>
-          <w:szCs w:val="20"/>
-        </w:rPr>
-        <w:t xml:space="preserve">Maas, M. (2025). Global AI governance architecture. Oxford Academic. </w:t>
-      </w:r>
-      <w:hyperlink w:history="1" r:id="rId9jxp9gozucxxg4no_naye">
-        <w:r>
-          <w:rPr>
-            <w:rStyle w:val="Hyperlink"/>
-            <w:rFonts w:ascii="Georgia" w:cs="Georgia" w:eastAsia="Georgia" w:hAnsi="Georgia"/>
-            <w:sz w:val="20"/>
-            <w:szCs w:val="20"/>
-          </w:rPr>
-          <w:t xml:space="preserve">https://academic.oup.com/book/61416/chapter/533869022</w:t>
-        </w:r>
-      </w:hyperlink>
-    </w:p>
-    <w:p>
-      <w:pPr>
-        <w:pStyle w:val="ListParagraph"/>
-        <w:numPr>
-          <w:ilvl w:val="0"/>
-          <w:numId w:val="4"/>
-        </w:numPr>
-        <w:spacing w:after="60" w:before="0" w:line="240" w:lineRule="auto"/>
-      </w:pPr>
-      <w:r>
-        <w:rPr>
-          <w:rFonts w:ascii="Georgia" w:cs="Georgia" w:eastAsia="Georgia" w:hAnsi="Georgia"/>
-          <w:sz w:val="20"/>
-          <w:szCs w:val="20"/>
-        </w:rPr>
-        <w:t xml:space="preserve">NIST AI 600-1 Generative AI Profile. </w:t>
-      </w:r>
-      <w:hyperlink w:history="1" r:id="rIdj1kohfoccuaeogrotit5g">
-        <w:r>
-          <w:rPr>
-            <w:rStyle w:val="Hyperlink"/>
-            <w:rFonts w:ascii="Georgia" w:cs="Georgia" w:eastAsia="Georgia" w:hAnsi="Georgia"/>
-            <w:sz w:val="20"/>
-            <w:szCs w:val="20"/>
-          </w:rPr>
-          <w:t xml:space="preserve">https://nvlpubs.nist.gov/nistpubs/ai/NIST.AI.600-1.pdf</w:t>
-        </w:r>
-      </w:hyperlink>
-    </w:p>
-    <w:p>
-      <w:pPr>
-        <w:pStyle w:val="ListParagraph"/>
-        <w:numPr>
-          <w:ilvl w:val="0"/>
-          <w:numId w:val="4"/>
-        </w:numPr>
-        <w:spacing w:after="60" w:before="0" w:line="240" w:lineRule="auto"/>
-      </w:pPr>
-      <w:r>
-        <w:rPr>
-          <w:rFonts w:ascii="Georgia" w:cs="Georgia" w:eastAsia="Georgia" w:hAnsi="Georgia"/>
-          <w:sz w:val="20"/>
-          <w:szCs w:val="20"/>
-        </w:rPr>
-        <w:t xml:space="preserve">NIST AI RMF 1.0. </w:t>
-      </w:r>
-      <w:hyperlink w:history="1" r:id="rIdy48gzuceitkhumrz-smtm">
-        <w:r>
-          <w:rPr>
-            <w:rStyle w:val="Hyperlink"/>
-            <w:rFonts w:ascii="Georgia" w:cs="Georgia" w:eastAsia="Georgia" w:hAnsi="Georgia"/>
-            <w:sz w:val="20"/>
-            <w:szCs w:val="20"/>
-          </w:rPr>
-          <w:t xml:space="preserve">https://nvlpubs.nist.gov/nistpubs/ai/nist.ai.100-1.pdf</w:t>
-        </w:r>
-      </w:hyperlink>
-    </w:p>
-    <w:p>
-      <w:pPr>
-        <w:pStyle w:val="ListParagraph"/>
-        <w:numPr>
-          <w:ilvl w:val="0"/>
-          <w:numId w:val="4"/>
-        </w:numPr>
-        <w:spacing w:after="60" w:before="0" w:line="240" w:lineRule="auto"/>
-      </w:pPr>
-      <w:r>
-        <w:rPr>
-          <w:rFonts w:ascii="Georgia" w:cs="Georgia" w:eastAsia="Georgia" w:hAnsi="Georgia"/>
-          <w:sz w:val="20"/>
-          <w:szCs w:val="20"/>
-        </w:rPr>
-        <w:t xml:space="preserve">OECD AI Principles. </w:t>
-      </w:r>
-      <w:hyperlink w:history="1" r:id="rIdingwz63z8xrs4phz5bdjc">
-        <w:r>
-          <w:rPr>
-            <w:rStyle w:val="Hyperlink"/>
-            <w:rFonts w:ascii="Georgia" w:cs="Georgia" w:eastAsia="Georgia" w:hAnsi="Georgia"/>
-            <w:sz w:val="20"/>
-            <w:szCs w:val="20"/>
-          </w:rPr>
-          <w:t xml:space="preserve">https://oecd.ai/en/ai-principles</w:t>
-        </w:r>
-      </w:hyperlink>
-    </w:p>
-    <w:p>
-      <w:pPr>
-        <w:pStyle w:val="ListParagraph"/>
-        <w:numPr>
-          <w:ilvl w:val="0"/>
-          <w:numId w:val="4"/>
-        </w:numPr>
-        <w:spacing w:after="60" w:before="0" w:line="240" w:lineRule="auto"/>
-      </w:pPr>
-      <w:r>
-        <w:rPr>
-          <w:rFonts w:ascii="Georgia" w:cs="Georgia" w:eastAsia="Georgia" w:hAnsi="Georgia"/>
-          <w:sz w:val="20"/>
-          <w:szCs w:val="20"/>
-        </w:rPr>
         <w:t xml:space="preserve">PMC. (2021). Companies committed to responsible AI. </w:t>
       </w:r>
-      <w:hyperlink w:history="1" r:id="rIdre5-lbrduebyzpbmau9sm">
+      <w:hyperlink w:history="1" r:id="rIdmzx5txr1xfa75sasovkft">
         <w:r>
           <w:rPr>
             <w:rStyle w:val="Hyperlink"/>
@@ -6153,7 +6030,7 @@
         </w:rPr>
         <w:t xml:space="preserve">Stix, C. (2022). Terminological history of trustworthy, ethical, and responsible AI. </w:t>
       </w:r>
-      <w:hyperlink w:history="1" r:id="rIdx9bgkrv3nlm3fowejsw6r">
+      <w:hyperlink w:history="1" r:id="rIdd-dtncgderhkw1hvrpixk">
         <w:r>
           <w:rPr>
             <w:rStyle w:val="Hyperlink"/>
@@ -6182,7 +6059,7 @@
         </w:rPr>
         <w:t xml:space="preserve">UNESCO Recommendation on the Ethics of AI. </w:t>
       </w:r>
-      <w:hyperlink w:history="1" r:id="rIdp2yb7vrsdohgtqrkxi9id">
+      <w:hyperlink w:history="1" r:id="rIdgupnxmow8vo_dy5yttahy">
         <w:r>
           <w:rPr>
             <w:rStyle w:val="Hyperlink"/>
@@ -6226,7 +6103,7 @@
         </w:rPr>
         <w:t xml:space="preserve">. basilpuglisi.com. </w:t>
       </w:r>
-      <w:hyperlink w:history="1" r:id="rId8n2qgzelddob_magrcwig">
+      <w:hyperlink w:history="1" r:id="rIdtq4ipyjp4e20oy5x0p8kj">
         <w:r>
           <w:rPr>
             <w:rStyle w:val="Hyperlink"/>
@@ -6273,7 +6150,7 @@
         </w:rPr>
         <w:t xml:space="preserve">. basilpuglisi.com. </w:t>
       </w:r>
-      <w:hyperlink w:history="1" r:id="rIdpy6b7osjoszkk3jwk9-6u">
+      <w:hyperlink w:history="1" r:id="rIdcgmhoqsvgj1rqiha82qgw">
         <w:r>
           <w:rPr>
             <w:rStyle w:val="Hyperlink"/>
@@ -6533,7 +6410,7 @@
         </w:rPr>
         <w:t xml:space="preserve">. basilpuglisi.com. </w:t>
       </w:r>
-      <w:hyperlink w:history="1" r:id="rIdyg3h8er4sqvefqe6g8vh-">
+      <w:hyperlink w:history="1" r:id="rIddyyxitpkuplps0e6h6rt0">
         <w:r>
           <w:rPr>
             <w:rStyle w:val="Hyperlink"/>
@@ -6632,54 +6509,865 @@
           <w:sz w:val="20"/>
           <w:szCs w:val="20"/>
         </w:rPr>
-        <w:t xml:space="preserve">Banovic, N., Kraut, R. E., Olson, J. S., &amp; Steinfeld, A. (2023). The effects of explanations and algorithmic accuracy on visual recommender systems of artistic images. </w:t>
-      </w:r>
-      <w:r>
-        <w:rPr>
-          <w:rFonts w:ascii="Georgia" w:cs="Georgia" w:eastAsia="Georgia" w:hAnsi="Georgia"/>
-          <w:i/>
-          <w:iCs/>
-          <w:sz w:val="20"/>
-          <w:szCs w:val="20"/>
-        </w:rPr>
-        <w:t xml:space="preserve">Behaviour &amp; Information Technology, 43</w:t>
-      </w:r>
-      <w:r>
-        <w:rPr>
-          <w:rFonts w:ascii="Georgia" w:cs="Georgia" w:eastAsia="Georgia" w:hAnsi="Georgia"/>
-          <w:sz w:val="20"/>
-          <w:szCs w:val="20"/>
-        </w:rPr>
-        <w:t xml:space="preserve">(9), 1-18. </w:t>
-      </w:r>
-      <w:hyperlink w:history="1" r:id="rIderufo_9cncquefvlattcu">
-        <w:r>
-          <w:rPr>
-            <w:rStyle w:val="Hyperlink"/>
-            <w:rFonts w:ascii="Georgia" w:cs="Georgia" w:eastAsia="Georgia" w:hAnsi="Georgia"/>
-            <w:sz w:val="20"/>
-            <w:szCs w:val="20"/>
-          </w:rPr>
-          <w:t xml:space="preserve">https://doi.org/10.1080/0144929X.2023.2184098</w:t>
-        </w:r>
-      </w:hyperlink>
-    </w:p>
-    <w:p>
-      <w:pPr>
-        <w:pStyle w:val="ListParagraph"/>
-        <w:numPr>
-          <w:ilvl w:val="0"/>
-          <w:numId w:val="4"/>
-        </w:numPr>
-        <w:spacing w:after="60" w:before="0" w:line="240" w:lineRule="auto"/>
-      </w:pPr>
-      <w:r>
-        <w:rPr>
-          <w:rFonts w:ascii="Georgia" w:cs="Georgia" w:eastAsia="Georgia" w:hAnsi="Georgia"/>
-          <w:sz w:val="20"/>
-          <w:szCs w:val="20"/>
-        </w:rPr>
-        <w:t xml:space="preserve">Barrett, H. C., et al. (2023). </w:t>
+        <w:t xml:space="preserve">Cao, J., Deng, Z., Zhao, M., Guo, L., &amp; Zhang, S. (2024). </w:t>
+      </w:r>
+      <w:r>
+        <w:rPr>
+          <w:rFonts w:ascii="Georgia" w:cs="Georgia" w:eastAsia="Georgia" w:hAnsi="Georgia"/>
+          <w:i/>
+          <w:iCs/>
+          <w:sz w:val="20"/>
+          <w:szCs w:val="20"/>
+        </w:rPr>
+        <w:t xml:space="preserve">Diagnosing the Western cultural bias of large vision-language models in generative image understanding</w:t>
+      </w:r>
+      <w:r>
+        <w:rPr>
+          <w:rFonts w:ascii="Georgia" w:cs="Georgia" w:eastAsia="Georgia" w:hAnsi="Georgia"/>
+          <w:sz w:val="20"/>
+          <w:szCs w:val="20"/>
+        </w:rPr>
+        <w:t xml:space="preserve"> (arXiv:2406.11665).</w:t>
+      </w:r>
+    </w:p>
+    <w:p>
+      <w:pPr>
+        <w:pStyle w:val="ListParagraph"/>
+        <w:numPr>
+          <w:ilvl w:val="0"/>
+          <w:numId w:val="4"/>
+        </w:numPr>
+        <w:spacing w:after="60" w:before="0" w:line="240" w:lineRule="auto"/>
+      </w:pPr>
+      <w:r>
+        <w:rPr>
+          <w:rFonts w:ascii="Georgia" w:cs="Georgia" w:eastAsia="Georgia" w:hAnsi="Georgia"/>
+          <w:sz w:val="20"/>
+          <w:szCs w:val="20"/>
+        </w:rPr>
+        <w:t xml:space="preserve">Clayton Antitrust Act, 15 U.S.C. §§ 12-27 (1914).</w:t>
+      </w:r>
+    </w:p>
+    <w:p>
+      <w:pPr>
+        <w:pStyle w:val="ListParagraph"/>
+        <w:numPr>
+          <w:ilvl w:val="0"/>
+          <w:numId w:val="4"/>
+        </w:numPr>
+        <w:spacing w:after="60" w:before="0" w:line="240" w:lineRule="auto"/>
+      </w:pPr>
+      <w:r>
+        <w:rPr>
+          <w:rFonts w:ascii="Georgia" w:cs="Georgia" w:eastAsia="Georgia" w:hAnsi="Georgia"/>
+          <w:sz w:val="20"/>
+          <w:szCs w:val="20"/>
+        </w:rPr>
+        <w:t xml:space="preserve">Di Vita, S., et al. (2025). </w:t>
+      </w:r>
+      <w:r>
+        <w:rPr>
+          <w:rFonts w:ascii="Georgia" w:cs="Georgia" w:eastAsia="Georgia" w:hAnsi="Georgia"/>
+          <w:i/>
+          <w:iCs/>
+          <w:sz w:val="20"/>
+          <w:szCs w:val="20"/>
+        </w:rPr>
+        <w:t xml:space="preserve">EAM-SQL: Cryptographic safety envelopes for table-centric LLM pipelines</w:t>
+      </w:r>
+      <w:r>
+        <w:rPr>
+          <w:rFonts w:ascii="Georgia" w:cs="Georgia" w:eastAsia="Georgia" w:hAnsi="Georgia"/>
+          <w:sz w:val="20"/>
+          <w:szCs w:val="20"/>
+        </w:rPr>
+        <w:t xml:space="preserve">. OpenReview.</w:t>
+      </w:r>
+    </w:p>
+    <w:p>
+      <w:pPr>
+        <w:pStyle w:val="ListParagraph"/>
+        <w:numPr>
+          <w:ilvl w:val="0"/>
+          <w:numId w:val="4"/>
+        </w:numPr>
+        <w:spacing w:after="60" w:before="0" w:line="240" w:lineRule="auto"/>
+      </w:pPr>
+      <w:r>
+        <w:rPr>
+          <w:rFonts w:ascii="Georgia" w:cs="Georgia" w:eastAsia="Georgia" w:hAnsi="Georgia"/>
+          <w:sz w:val="20"/>
+          <w:szCs w:val="20"/>
+        </w:rPr>
+        <w:t xml:space="preserve">European Data Protection Supervisor. (2025, September 22). </w:t>
+      </w:r>
+      <w:r>
+        <w:rPr>
+          <w:rFonts w:ascii="Georgia" w:cs="Georgia" w:eastAsia="Georgia" w:hAnsi="Georgia"/>
+          <w:i/>
+          <w:iCs/>
+          <w:sz w:val="20"/>
+          <w:szCs w:val="20"/>
+        </w:rPr>
+        <w:t xml:space="preserve">TechDispatch #2/2025: Human oversight of automated decision-making</w:t>
+      </w:r>
+      <w:r>
+        <w:rPr>
+          <w:rFonts w:ascii="Georgia" w:cs="Georgia" w:eastAsia="Georgia" w:hAnsi="Georgia"/>
+          <w:sz w:val="20"/>
+          <w:szCs w:val="20"/>
+        </w:rPr>
+        <w:t xml:space="preserve">. EDPS Office.</w:t>
+      </w:r>
+    </w:p>
+    <w:p>
+      <w:pPr>
+        <w:pStyle w:val="ListParagraph"/>
+        <w:numPr>
+          <w:ilvl w:val="0"/>
+          <w:numId w:val="4"/>
+        </w:numPr>
+        <w:spacing w:after="60" w:before="0" w:line="240" w:lineRule="auto"/>
+      </w:pPr>
+      <w:r>
+        <w:rPr>
+          <w:rFonts w:ascii="Georgia" w:cs="Georgia" w:eastAsia="Georgia" w:hAnsi="Georgia"/>
+          <w:sz w:val="20"/>
+          <w:szCs w:val="20"/>
+        </w:rPr>
+        <w:t xml:space="preserve">European Union. (2024). </w:t>
+      </w:r>
+      <w:r>
+        <w:rPr>
+          <w:rFonts w:ascii="Georgia" w:cs="Georgia" w:eastAsia="Georgia" w:hAnsi="Georgia"/>
+          <w:i/>
+          <w:iCs/>
+          <w:sz w:val="20"/>
+          <w:szCs w:val="20"/>
+        </w:rPr>
+        <w:t xml:space="preserve">Regulation (EU) 2024/1689 laying down harmonised rules on artificial intelligence</w:t>
+      </w:r>
+      <w:r>
+        <w:rPr>
+          <w:rFonts w:ascii="Georgia" w:cs="Georgia" w:eastAsia="Georgia" w:hAnsi="Georgia"/>
+          <w:sz w:val="20"/>
+          <w:szCs w:val="20"/>
+        </w:rPr>
+        <w:t xml:space="preserve">, Articles 12 and 14. Official Journal of the European Union. </w:t>
+      </w:r>
+      <w:hyperlink w:history="1" r:id="rId3nymy9vjyczsjsgtuypah">
+        <w:r>
+          <w:rPr>
+            <w:rStyle w:val="Hyperlink"/>
+            <w:rFonts w:ascii="Georgia" w:cs="Georgia" w:eastAsia="Georgia" w:hAnsi="Georgia"/>
+            <w:sz w:val="20"/>
+            <w:szCs w:val="20"/>
+          </w:rPr>
+          <w:t xml:space="preserve">https://artificialintelligenceact.eu/</w:t>
+        </w:r>
+      </w:hyperlink>
+    </w:p>
+    <w:p>
+      <w:pPr>
+        <w:pStyle w:val="ListParagraph"/>
+        <w:numPr>
+          <w:ilvl w:val="0"/>
+          <w:numId w:val="4"/>
+        </w:numPr>
+        <w:spacing w:after="60" w:before="0" w:line="240" w:lineRule="auto"/>
+      </w:pPr>
+      <w:r>
+        <w:rPr>
+          <w:rFonts w:ascii="Georgia" w:cs="Georgia" w:eastAsia="Georgia" w:hAnsi="Georgia"/>
+          <w:sz w:val="20"/>
+          <w:szCs w:val="20"/>
+        </w:rPr>
+        <w:t xml:space="preserve">Federation of American Scientists. (2025, January 9). </w:t>
+      </w:r>
+      <w:r>
+        <w:rPr>
+          <w:rFonts w:ascii="Georgia" w:cs="Georgia" w:eastAsia="Georgia" w:hAnsi="Georgia"/>
+          <w:i/>
+          <w:iCs/>
+          <w:sz w:val="20"/>
+          <w:szCs w:val="20"/>
+        </w:rPr>
+        <w:t xml:space="preserve">Antitrust in the AI era</w:t>
+      </w:r>
+      <w:r>
+        <w:rPr>
+          <w:rFonts w:ascii="Georgia" w:cs="Georgia" w:eastAsia="Georgia" w:hAnsi="Georgia"/>
+          <w:sz w:val="20"/>
+          <w:szCs w:val="20"/>
+        </w:rPr>
+        <w:t xml:space="preserve">. </w:t>
+      </w:r>
+      <w:hyperlink w:history="1" r:id="rIdcfnpre2ala6jkbn_deutz">
+        <w:r>
+          <w:rPr>
+            <w:rStyle w:val="Hyperlink"/>
+            <w:rFonts w:ascii="Georgia" w:cs="Georgia" w:eastAsia="Georgia" w:hAnsi="Georgia"/>
+            <w:sz w:val="20"/>
+            <w:szCs w:val="20"/>
+          </w:rPr>
+          <w:t xml:space="preserve">https://fas.org/publication/antitrust-in-the-ai-era/</w:t>
+        </w:r>
+      </w:hyperlink>
+    </w:p>
+    <w:p>
+      <w:pPr>
+        <w:pStyle w:val="ListParagraph"/>
+        <w:numPr>
+          <w:ilvl w:val="0"/>
+          <w:numId w:val="4"/>
+        </w:numPr>
+        <w:spacing w:after="60" w:before="0" w:line="240" w:lineRule="auto"/>
+      </w:pPr>
+      <w:r>
+        <w:rPr>
+          <w:rFonts w:ascii="Georgia" w:cs="Georgia" w:eastAsia="Georgia" w:hAnsi="Georgia"/>
+          <w:sz w:val="20"/>
+          <w:szCs w:val="20"/>
+        </w:rPr>
+        <w:t xml:space="preserve">Gaurav, S., Heikkonen, J., &amp; Chaudhary, J. (2025). </w:t>
+      </w:r>
+      <w:r>
+        <w:rPr>
+          <w:rFonts w:ascii="Georgia" w:cs="Georgia" w:eastAsia="Georgia" w:hAnsi="Georgia"/>
+          <w:i/>
+          <w:iCs/>
+          <w:sz w:val="20"/>
+          <w:szCs w:val="20"/>
+        </w:rPr>
+        <w:t xml:space="preserve">Governance-as-a-Service: A multi-agent framework for AI system compliance and policy enforcement</w:t>
+      </w:r>
+      <w:r>
+        <w:rPr>
+          <w:rFonts w:ascii="Georgia" w:cs="Georgia" w:eastAsia="Georgia" w:hAnsi="Georgia"/>
+          <w:sz w:val="20"/>
+          <w:szCs w:val="20"/>
+        </w:rPr>
+        <w:t xml:space="preserve"> (arXiv:2508.18765).</w:t>
+      </w:r>
+    </w:p>
+    <w:p>
+      <w:pPr>
+        <w:pStyle w:val="ListParagraph"/>
+        <w:numPr>
+          <w:ilvl w:val="0"/>
+          <w:numId w:val="4"/>
+        </w:numPr>
+        <w:spacing w:after="60" w:before="0" w:line="240" w:lineRule="auto"/>
+      </w:pPr>
+      <w:r>
+        <w:rPr>
+          <w:rFonts w:ascii="Georgia" w:cs="Georgia" w:eastAsia="Georgia" w:hAnsi="Georgia"/>
+          <w:sz w:val="20"/>
+          <w:szCs w:val="20"/>
+        </w:rPr>
+        <w:t xml:space="preserve">Georgia Institute of Technology. (2024, April 2). </w:t>
+      </w:r>
+      <w:r>
+        <w:rPr>
+          <w:rFonts w:ascii="Georgia" w:cs="Georgia" w:eastAsia="Georgia" w:hAnsi="Georgia"/>
+          <w:i/>
+          <w:iCs/>
+          <w:sz w:val="20"/>
+          <w:szCs w:val="20"/>
+        </w:rPr>
+        <w:t xml:space="preserve">LLMs generate Western bias even when trained with non-Western languages</w:t>
+      </w:r>
+      <w:r>
+        <w:rPr>
+          <w:rFonts w:ascii="Georgia" w:cs="Georgia" w:eastAsia="Georgia" w:hAnsi="Georgia"/>
+          <w:sz w:val="20"/>
+          <w:szCs w:val="20"/>
+        </w:rPr>
+        <w:t xml:space="preserve">. Georgia Tech News.</w:t>
+      </w:r>
+    </w:p>
+    <w:p>
+      <w:pPr>
+        <w:pStyle w:val="ListParagraph"/>
+        <w:numPr>
+          <w:ilvl w:val="0"/>
+          <w:numId w:val="4"/>
+        </w:numPr>
+        <w:spacing w:after="60" w:before="0" w:line="240" w:lineRule="auto"/>
+      </w:pPr>
+      <w:r>
+        <w:rPr>
+          <w:rFonts w:ascii="Georgia" w:cs="Georgia" w:eastAsia="Georgia" w:hAnsi="Georgia"/>
+          <w:sz w:val="20"/>
+          <w:szCs w:val="20"/>
+        </w:rPr>
+        <w:t xml:space="preserve">Goddard, K., Roudsari, A., &amp; Wyatt, J. C. (2011). Automation bias: A systematic review of frequency, effect mediators, and mitigators. </w:t>
+      </w:r>
+      <w:r>
+        <w:rPr>
+          <w:rFonts w:ascii="Georgia" w:cs="Georgia" w:eastAsia="Georgia" w:hAnsi="Georgia"/>
+          <w:i/>
+          <w:iCs/>
+          <w:sz w:val="20"/>
+          <w:szCs w:val="20"/>
+        </w:rPr>
+        <w:t xml:space="preserve">Journal of the American Medical Informatics Association, 19</w:t>
+      </w:r>
+      <w:r>
+        <w:rPr>
+          <w:rFonts w:ascii="Georgia" w:cs="Georgia" w:eastAsia="Georgia" w:hAnsi="Georgia"/>
+          <w:sz w:val="20"/>
+          <w:szCs w:val="20"/>
+        </w:rPr>
+        <w:t xml:space="preserve">(1), 121-127. </w:t>
+      </w:r>
+      <w:hyperlink w:history="1" r:id="rIddphw9zgfgme2wsb6iviya">
+        <w:r>
+          <w:rPr>
+            <w:rStyle w:val="Hyperlink"/>
+            <w:rFonts w:ascii="Georgia" w:cs="Georgia" w:eastAsia="Georgia" w:hAnsi="Georgia"/>
+            <w:sz w:val="20"/>
+            <w:szCs w:val="20"/>
+          </w:rPr>
+          <w:t xml:space="preserve">https://doi.org/10.1136/amiajnl-2011-000089</w:t>
+        </w:r>
+      </w:hyperlink>
+    </w:p>
+    <w:p>
+      <w:pPr>
+        <w:pStyle w:val="ListParagraph"/>
+        <w:numPr>
+          <w:ilvl w:val="0"/>
+          <w:numId w:val="4"/>
+        </w:numPr>
+        <w:spacing w:after="60" w:before="0" w:line="240" w:lineRule="auto"/>
+      </w:pPr>
+      <w:r>
+        <w:rPr>
+          <w:rFonts w:ascii="Georgia" w:cs="Georgia" w:eastAsia="Georgia" w:hAnsi="Georgia"/>
+          <w:sz w:val="20"/>
+          <w:szCs w:val="20"/>
+        </w:rPr>
+        <w:t xml:space="preserve">Heim, L., Bernaerts, K., Metzger, C., &amp; Anderljung, M. (2024). </w:t>
+      </w:r>
+      <w:r>
+        <w:rPr>
+          <w:rFonts w:ascii="Georgia" w:cs="Georgia" w:eastAsia="Georgia" w:hAnsi="Georgia"/>
+          <w:i/>
+          <w:iCs/>
+          <w:sz w:val="20"/>
+          <w:szCs w:val="20"/>
+        </w:rPr>
+        <w:t xml:space="preserve">Governing through the cloud: The intermediary role of compute providers in AI regulation</w:t>
+      </w:r>
+      <w:r>
+        <w:rPr>
+          <w:rFonts w:ascii="Georgia" w:cs="Georgia" w:eastAsia="Georgia" w:hAnsi="Georgia"/>
+          <w:sz w:val="20"/>
+          <w:szCs w:val="20"/>
+        </w:rPr>
+        <w:t xml:space="preserve">. Centre for the Governance of AI.</w:t>
+      </w:r>
+    </w:p>
+    <w:p>
+      <w:pPr>
+        <w:pStyle w:val="ListParagraph"/>
+        <w:numPr>
+          <w:ilvl w:val="0"/>
+          <w:numId w:val="4"/>
+        </w:numPr>
+        <w:spacing w:after="60" w:before="0" w:line="240" w:lineRule="auto"/>
+      </w:pPr>
+      <w:r>
+        <w:rPr>
+          <w:rFonts w:ascii="Georgia" w:cs="Georgia" w:eastAsia="Georgia" w:hAnsi="Georgia"/>
+          <w:sz w:val="20"/>
+          <w:szCs w:val="20"/>
+        </w:rPr>
+        <w:t xml:space="preserve">Henrich, J., Atari, M., Xue, M. J., Park, P. S., &amp; Blasi, D. E. (2024). </w:t>
+      </w:r>
+      <w:r>
+        <w:rPr>
+          <w:rFonts w:ascii="Georgia" w:cs="Georgia" w:eastAsia="Georgia" w:hAnsi="Georgia"/>
+          <w:i/>
+          <w:iCs/>
+          <w:sz w:val="20"/>
+          <w:szCs w:val="20"/>
+        </w:rPr>
+        <w:t xml:space="preserve">Which humans? Measuring and understanding the responses of large language models to cultural diversity</w:t>
+      </w:r>
+      <w:r>
+        <w:rPr>
+          <w:rFonts w:ascii="Georgia" w:cs="Georgia" w:eastAsia="Georgia" w:hAnsi="Georgia"/>
+          <w:sz w:val="20"/>
+          <w:szCs w:val="20"/>
+        </w:rPr>
+        <w:t xml:space="preserve"> [Working paper]. Harvard Department of Human Evolutionary Biology.</w:t>
+      </w:r>
+    </w:p>
+    <w:p>
+      <w:pPr>
+        <w:pStyle w:val="ListParagraph"/>
+        <w:numPr>
+          <w:ilvl w:val="0"/>
+          <w:numId w:val="4"/>
+        </w:numPr>
+        <w:spacing w:after="60" w:before="0" w:line="240" w:lineRule="auto"/>
+      </w:pPr>
+      <w:r>
+        <w:rPr>
+          <w:rFonts w:ascii="Georgia" w:cs="Georgia" w:eastAsia="Georgia" w:hAnsi="Georgia"/>
+          <w:sz w:val="20"/>
+          <w:szCs w:val="20"/>
+        </w:rPr>
+        <w:t xml:space="preserve">Henrich, J., Heine, S. J., &amp; Norenzayan, A. (2010). The weirdest people in the world? </w:t>
+      </w:r>
+      <w:r>
+        <w:rPr>
+          <w:rFonts w:ascii="Georgia" w:cs="Georgia" w:eastAsia="Georgia" w:hAnsi="Georgia"/>
+          <w:i/>
+          <w:iCs/>
+          <w:sz w:val="20"/>
+          <w:szCs w:val="20"/>
+        </w:rPr>
+        <w:t xml:space="preserve">Behavioral and Brain Sciences, 33</w:t>
+      </w:r>
+      <w:r>
+        <w:rPr>
+          <w:rFonts w:ascii="Georgia" w:cs="Georgia" w:eastAsia="Georgia" w:hAnsi="Georgia"/>
+          <w:sz w:val="20"/>
+          <w:szCs w:val="20"/>
+        </w:rPr>
+        <w:t xml:space="preserve">(2-3), 61-83. </w:t>
+      </w:r>
+      <w:hyperlink w:history="1" r:id="rIdof5dboezq3axluqhjp5d0">
+        <w:r>
+          <w:rPr>
+            <w:rStyle w:val="Hyperlink"/>
+            <w:rFonts w:ascii="Georgia" w:cs="Georgia" w:eastAsia="Georgia" w:hAnsi="Georgia"/>
+            <w:sz w:val="20"/>
+            <w:szCs w:val="20"/>
+          </w:rPr>
+          <w:t xml:space="preserve">https://doi.org/10.1017/S0140525X0999152X</w:t>
+        </w:r>
+      </w:hyperlink>
+    </w:p>
+    <w:p>
+      <w:pPr>
+        <w:pStyle w:val="ListParagraph"/>
+        <w:numPr>
+          <w:ilvl w:val="0"/>
+          <w:numId w:val="4"/>
+        </w:numPr>
+        <w:spacing w:after="60" w:before="0" w:line="240" w:lineRule="auto"/>
+      </w:pPr>
+      <w:r>
+        <w:rPr>
+          <w:rFonts w:ascii="Georgia" w:cs="Georgia" w:eastAsia="Georgia" w:hAnsi="Georgia"/>
+          <w:sz w:val="20"/>
+          <w:szCs w:val="20"/>
+        </w:rPr>
+        <w:t xml:space="preserve">Hoover, A. (2025, June 17). There’s a “10% to 20% chance” that AI will displace humans completely, says “godfather” of the technology. CNBC.</w:t>
+      </w:r>
+    </w:p>
+    <w:p>
+      <w:pPr>
+        <w:pStyle w:val="ListParagraph"/>
+        <w:numPr>
+          <w:ilvl w:val="0"/>
+          <w:numId w:val="4"/>
+        </w:numPr>
+        <w:spacing w:after="60" w:before="0" w:line="240" w:lineRule="auto"/>
+      </w:pPr>
+      <w:r>
+        <w:rPr>
+          <w:rFonts w:ascii="Georgia" w:cs="Georgia" w:eastAsia="Georgia" w:hAnsi="Georgia"/>
+          <w:sz w:val="20"/>
+          <w:szCs w:val="20"/>
+        </w:rPr>
+        <w:t xml:space="preserve">Horowitz, M. C., &amp; Kahn, L. (2024). Bending the automation bias curve: A study of human and AI-based decision making in national security contexts. </w:t>
+      </w:r>
+      <w:r>
+        <w:rPr>
+          <w:rFonts w:ascii="Georgia" w:cs="Georgia" w:eastAsia="Georgia" w:hAnsi="Georgia"/>
+          <w:i/>
+          <w:iCs/>
+          <w:sz w:val="20"/>
+          <w:szCs w:val="20"/>
+        </w:rPr>
+        <w:t xml:space="preserve">International Studies Quarterly, 68</w:t>
+      </w:r>
+      <w:r>
+        <w:rPr>
+          <w:rFonts w:ascii="Georgia" w:cs="Georgia" w:eastAsia="Georgia" w:hAnsi="Georgia"/>
+          <w:sz w:val="20"/>
+          <w:szCs w:val="20"/>
+        </w:rPr>
+        <w:t xml:space="preserve">(2), sqae020. </w:t>
+      </w:r>
+      <w:hyperlink w:history="1" r:id="rIdqpdc_x61fq7rkln98rbhh">
+        <w:r>
+          <w:rPr>
+            <w:rStyle w:val="Hyperlink"/>
+            <w:rFonts w:ascii="Georgia" w:cs="Georgia" w:eastAsia="Georgia" w:hAnsi="Georgia"/>
+            <w:sz w:val="20"/>
+            <w:szCs w:val="20"/>
+          </w:rPr>
+          <w:t xml:space="preserve">https://doi.org/10.1093/isq/sqae020</w:t>
+        </w:r>
+      </w:hyperlink>
+    </w:p>
+    <w:p>
+      <w:pPr>
+        <w:pStyle w:val="ListParagraph"/>
+        <w:numPr>
+          <w:ilvl w:val="0"/>
+          <w:numId w:val="4"/>
+        </w:numPr>
+        <w:spacing w:after="60" w:before="0" w:line="240" w:lineRule="auto"/>
+      </w:pPr>
+      <w:r>
+        <w:rPr>
+          <w:rFonts w:ascii="Georgia" w:cs="Georgia" w:eastAsia="Georgia" w:hAnsi="Georgia"/>
+          <w:sz w:val="20"/>
+          <w:szCs w:val="20"/>
+        </w:rPr>
+        <w:t xml:space="preserve">Janis, I. L. (1972). </w:t>
+      </w:r>
+      <w:r>
+        <w:rPr>
+          <w:rFonts w:ascii="Georgia" w:cs="Georgia" w:eastAsia="Georgia" w:hAnsi="Georgia"/>
+          <w:i/>
+          <w:iCs/>
+          <w:sz w:val="20"/>
+          <w:szCs w:val="20"/>
+        </w:rPr>
+        <w:t xml:space="preserve">Victims of groupthink: A psychological study of foreign-policy decisions and fiascos</w:t>
+      </w:r>
+      <w:r>
+        <w:rPr>
+          <w:rFonts w:ascii="Georgia" w:cs="Georgia" w:eastAsia="Georgia" w:hAnsi="Georgia"/>
+          <w:sz w:val="20"/>
+          <w:szCs w:val="20"/>
+        </w:rPr>
+        <w:t xml:space="preserve">. Houghton Mifflin.</w:t>
+      </w:r>
+    </w:p>
+    <w:p>
+      <w:pPr>
+        <w:pStyle w:val="ListParagraph"/>
+        <w:numPr>
+          <w:ilvl w:val="0"/>
+          <w:numId w:val="4"/>
+        </w:numPr>
+        <w:spacing w:after="60" w:before="0" w:line="240" w:lineRule="auto"/>
+      </w:pPr>
+      <w:r>
+        <w:rPr>
+          <w:rFonts w:ascii="Georgia" w:cs="Georgia" w:eastAsia="Georgia" w:hAnsi="Georgia"/>
+          <w:sz w:val="20"/>
+          <w:szCs w:val="20"/>
+        </w:rPr>
+        <w:t xml:space="preserve">Mallaband, A. (2025, December 29). </w:t>
+      </w:r>
+      <w:r>
+        <w:rPr>
+          <w:rFonts w:ascii="Georgia" w:cs="Georgia" w:eastAsia="Georgia" w:hAnsi="Georgia"/>
+          <w:i/>
+          <w:iCs/>
+          <w:sz w:val="20"/>
+          <w:szCs w:val="20"/>
+        </w:rPr>
+        <w:t xml:space="preserve">Deterministic guardrails for nondeterministic agents</w:t>
+      </w:r>
+      <w:r>
+        <w:rPr>
+          <w:rFonts w:ascii="Georgia" w:cs="Georgia" w:eastAsia="Georgia" w:hAnsi="Georgia"/>
+          <w:sz w:val="20"/>
+          <w:szCs w:val="20"/>
+        </w:rPr>
+        <w:t xml:space="preserve">. LinkedIn.</w:t>
+      </w:r>
+    </w:p>
+    <w:p>
+      <w:pPr>
+        <w:pStyle w:val="ListParagraph"/>
+        <w:numPr>
+          <w:ilvl w:val="0"/>
+          <w:numId w:val="4"/>
+        </w:numPr>
+        <w:spacing w:after="60" w:before="0" w:line="240" w:lineRule="auto"/>
+      </w:pPr>
+      <w:r>
+        <w:rPr>
+          <w:rFonts w:ascii="Georgia" w:cs="Georgia" w:eastAsia="Georgia" w:hAnsi="Georgia"/>
+          <w:sz w:val="20"/>
+          <w:szCs w:val="20"/>
+        </w:rPr>
+        <w:t xml:space="preserve">Mökander, J., &amp; Floridi, L. (2025). Human oversight under Article 14 of the EU AI Act. In </w:t>
+      </w:r>
+      <w:r>
+        <w:rPr>
+          <w:rFonts w:ascii="Georgia" w:cs="Georgia" w:eastAsia="Georgia" w:hAnsi="Georgia"/>
+          <w:i/>
+          <w:iCs/>
+          <w:sz w:val="20"/>
+          <w:szCs w:val="20"/>
+        </w:rPr>
+        <w:t xml:space="preserve">Regulation of artificial intelligence: International standards and governance mechanisms</w:t>
+      </w:r>
+      <w:r>
+        <w:rPr>
+          <w:rFonts w:ascii="Georgia" w:cs="Georgia" w:eastAsia="Georgia" w:hAnsi="Georgia"/>
+          <w:sz w:val="20"/>
+          <w:szCs w:val="20"/>
+        </w:rPr>
+        <w:t xml:space="preserve"> (pp. 127-154). Edward Elgar Publishing.</w:t>
+      </w:r>
+    </w:p>
+    <w:p>
+      <w:pPr>
+        <w:pStyle w:val="ListParagraph"/>
+        <w:numPr>
+          <w:ilvl w:val="0"/>
+          <w:numId w:val="4"/>
+        </w:numPr>
+        <w:spacing w:after="60" w:before="0" w:line="240" w:lineRule="auto"/>
+      </w:pPr>
+      <w:r>
+        <w:rPr>
+          <w:rFonts w:ascii="Georgia" w:cs="Georgia" w:eastAsia="Georgia" w:hAnsi="Georgia"/>
+          <w:sz w:val="20"/>
+          <w:szCs w:val="20"/>
+        </w:rPr>
+        <w:t xml:space="preserve">Narechania, T. S., &amp; Sitaraman, G. (2024). An antimonopoly approach to governing artificial intelligence. </w:t>
+      </w:r>
+      <w:r>
+        <w:rPr>
+          <w:rFonts w:ascii="Georgia" w:cs="Georgia" w:eastAsia="Georgia" w:hAnsi="Georgia"/>
+          <w:i/>
+          <w:iCs/>
+          <w:sz w:val="20"/>
+          <w:szCs w:val="20"/>
+        </w:rPr>
+        <w:t xml:space="preserve">Yale Law &amp; Policy Review, 43</w:t>
+      </w:r>
+      <w:r>
+        <w:rPr>
+          <w:rFonts w:ascii="Georgia" w:cs="Georgia" w:eastAsia="Georgia" w:hAnsi="Georgia"/>
+          <w:sz w:val="20"/>
+          <w:szCs w:val="20"/>
+        </w:rPr>
+        <w:t xml:space="preserve">(1), 1-74.</w:t>
+      </w:r>
+    </w:p>
+    <w:p>
+      <w:pPr>
+        <w:pStyle w:val="ListParagraph"/>
+        <w:numPr>
+          <w:ilvl w:val="0"/>
+          <w:numId w:val="4"/>
+        </w:numPr>
+        <w:spacing w:after="60" w:before="0" w:line="240" w:lineRule="auto"/>
+      </w:pPr>
+      <w:r>
+        <w:rPr>
+          <w:rFonts w:ascii="Georgia" w:cs="Georgia" w:eastAsia="Georgia" w:hAnsi="Georgia"/>
+          <w:sz w:val="20"/>
+          <w:szCs w:val="20"/>
+        </w:rPr>
+        <w:t xml:space="preserve">Navarrete, J., Vaca-Barahona, B., Peña, S., &amp; Hernández-Suárez, A. (2024). Human oversight of automated decision-making systems: A multi-method study on automation bias with recidivism risk assessment algorithms. </w:t>
+      </w:r>
+      <w:r>
+        <w:rPr>
+          <w:rFonts w:ascii="Georgia" w:cs="Georgia" w:eastAsia="Georgia" w:hAnsi="Georgia"/>
+          <w:i/>
+          <w:iCs/>
+          <w:sz w:val="20"/>
+          <w:szCs w:val="20"/>
+        </w:rPr>
+        <w:t xml:space="preserve">PLOS ONE, 19</w:t>
+      </w:r>
+      <w:r>
+        <w:rPr>
+          <w:rFonts w:ascii="Georgia" w:cs="Georgia" w:eastAsia="Georgia" w:hAnsi="Georgia"/>
+          <w:sz w:val="20"/>
+          <w:szCs w:val="20"/>
+        </w:rPr>
+        <w:t xml:space="preserve">(1), e0296384.</w:t>
+      </w:r>
+    </w:p>
+    <w:p>
+      <w:pPr>
+        <w:pStyle w:val="ListParagraph"/>
+        <w:numPr>
+          <w:ilvl w:val="0"/>
+          <w:numId w:val="4"/>
+        </w:numPr>
+        <w:spacing w:after="60" w:before="0" w:line="240" w:lineRule="auto"/>
+      </w:pPr>
+      <w:r>
+        <w:rPr>
+          <w:rFonts w:ascii="Georgia" w:cs="Georgia" w:eastAsia="Georgia" w:hAnsi="Georgia"/>
+          <w:sz w:val="20"/>
+          <w:szCs w:val="20"/>
+        </w:rPr>
+        <w:t xml:space="preserve">Nolan, J., &amp; Nolan, L. (Creators). (2011-2016). </w:t>
+      </w:r>
+      <w:r>
+        <w:rPr>
+          <w:rFonts w:ascii="Georgia" w:cs="Georgia" w:eastAsia="Georgia" w:hAnsi="Georgia"/>
+          <w:i/>
+          <w:iCs/>
+          <w:sz w:val="20"/>
+          <w:szCs w:val="20"/>
+        </w:rPr>
+        <w:t xml:space="preserve">Person of interest</w:t>
+      </w:r>
+      <w:r>
+        <w:rPr>
+          <w:rFonts w:ascii="Georgia" w:cs="Georgia" w:eastAsia="Georgia" w:hAnsi="Georgia"/>
+          <w:sz w:val="20"/>
+          <w:szCs w:val="20"/>
+        </w:rPr>
+        <w:t xml:space="preserve"> [TV series]. CBS.</w:t>
+      </w:r>
+    </w:p>
+    <w:p>
+      <w:pPr>
+        <w:pStyle w:val="ListParagraph"/>
+        <w:numPr>
+          <w:ilvl w:val="0"/>
+          <w:numId w:val="4"/>
+        </w:numPr>
+        <w:spacing w:after="60" w:before="0" w:line="240" w:lineRule="auto"/>
+      </w:pPr>
+      <w:r>
+        <w:rPr>
+          <w:rFonts w:ascii="Georgia" w:cs="Georgia" w:eastAsia="Georgia" w:hAnsi="Georgia"/>
+          <w:sz w:val="20"/>
+          <w:szCs w:val="20"/>
+        </w:rPr>
+        <w:t xml:space="preserve">Parasuraman, R., &amp; Manzey, D. H. (2010). Complacency and bias in human use of automation: An attentional integration. </w:t>
+      </w:r>
+      <w:r>
+        <w:rPr>
+          <w:rFonts w:ascii="Georgia" w:cs="Georgia" w:eastAsia="Georgia" w:hAnsi="Georgia"/>
+          <w:i/>
+          <w:iCs/>
+          <w:sz w:val="20"/>
+          <w:szCs w:val="20"/>
+        </w:rPr>
+        <w:t xml:space="preserve">Human Factors, 52</w:t>
+      </w:r>
+      <w:r>
+        <w:rPr>
+          <w:rFonts w:ascii="Georgia" w:cs="Georgia" w:eastAsia="Georgia" w:hAnsi="Georgia"/>
+          <w:sz w:val="20"/>
+          <w:szCs w:val="20"/>
+        </w:rPr>
+        <w:t xml:space="preserve">(3), 381-410. </w:t>
+      </w:r>
+      <w:hyperlink w:history="1" r:id="rIda8cpzwgwfhkvhsukyxtyb">
+        <w:r>
+          <w:rPr>
+            <w:rStyle w:val="Hyperlink"/>
+            <w:rFonts w:ascii="Georgia" w:cs="Georgia" w:eastAsia="Georgia" w:hAnsi="Georgia"/>
+            <w:sz w:val="20"/>
+            <w:szCs w:val="20"/>
+          </w:rPr>
+          <w:t xml:space="preserve">https://doi.org/10.1177/0018720810376055</w:t>
+        </w:r>
+      </w:hyperlink>
+    </w:p>
+    <w:p>
+      <w:pPr>
+        <w:pStyle w:val="ListParagraph"/>
+        <w:numPr>
+          <w:ilvl w:val="0"/>
+          <w:numId w:val="4"/>
+        </w:numPr>
+        <w:spacing w:after="60" w:before="0" w:line="240" w:lineRule="auto"/>
+      </w:pPr>
+      <w:r>
+        <w:rPr>
+          <w:rFonts w:ascii="Georgia" w:cs="Georgia" w:eastAsia="Georgia" w:hAnsi="Georgia"/>
+          <w:sz w:val="20"/>
+          <w:szCs w:val="20"/>
+        </w:rPr>
+        <w:t xml:space="preserve">Pierucci, F., Galisai, M., Bracale, M. S., Prandi, M., Bisconti, P., Giarrusso, F., Sorokoletova, O., Suriani, V., &amp; Nardi, D. (2026). </w:t>
+      </w:r>
+      <w:r>
+        <w:rPr>
+          <w:rFonts w:ascii="Georgia" w:cs="Georgia" w:eastAsia="Georgia" w:hAnsi="Georgia"/>
+          <w:i/>
+          <w:iCs/>
+          <w:sz w:val="20"/>
+          <w:szCs w:val="20"/>
+        </w:rPr>
+        <w:t xml:space="preserve">Institutional AI: A governance framework for distributional AGI safety</w:t>
+      </w:r>
+      <w:r>
+        <w:rPr>
+          <w:rFonts w:ascii="Georgia" w:cs="Georgia" w:eastAsia="Georgia" w:hAnsi="Georgia"/>
+          <w:sz w:val="20"/>
+          <w:szCs w:val="20"/>
+        </w:rPr>
+        <w:t xml:space="preserve"> (arXiv:2601.10599).</w:t>
+      </w:r>
+    </w:p>
+    <w:p>
+      <w:pPr>
+        <w:pStyle w:val="ListParagraph"/>
+        <w:numPr>
+          <w:ilvl w:val="0"/>
+          <w:numId w:val="4"/>
+        </w:numPr>
+        <w:spacing w:after="60" w:before="0" w:line="240" w:lineRule="auto"/>
+      </w:pPr>
+      <w:r>
+        <w:rPr>
+          <w:rFonts w:ascii="Georgia" w:cs="Georgia" w:eastAsia="Georgia" w:hAnsi="Georgia"/>
+          <w:sz w:val="20"/>
+          <w:szCs w:val="20"/>
+        </w:rPr>
+        <w:t xml:space="preserve">prEN 18286:2025. </w:t>
+      </w:r>
+      <w:r>
+        <w:rPr>
+          <w:rFonts w:ascii="Georgia" w:cs="Georgia" w:eastAsia="Georgia" w:hAnsi="Georgia"/>
+          <w:i/>
+          <w:iCs/>
+          <w:sz w:val="20"/>
+          <w:szCs w:val="20"/>
+        </w:rPr>
+        <w:t xml:space="preserve">Quality management systems for providers of AI systems</w:t>
+      </w:r>
+      <w:r>
+        <w:rPr>
+          <w:rFonts w:ascii="Georgia" w:cs="Georgia" w:eastAsia="Georgia" w:hAnsi="Georgia"/>
+          <w:sz w:val="20"/>
+          <w:szCs w:val="20"/>
+        </w:rPr>
+        <w:t xml:space="preserve">. European Committee for Standardization (CEN).</w:t>
+      </w:r>
+    </w:p>
+    <w:p>
+      <w:pPr>
+        <w:pStyle w:val="ListParagraph"/>
+        <w:numPr>
+          <w:ilvl w:val="0"/>
+          <w:numId w:val="4"/>
+        </w:numPr>
+        <w:spacing w:after="60" w:before="0" w:line="240" w:lineRule="auto"/>
+      </w:pPr>
+      <w:r>
+        <w:rPr>
+          <w:rFonts w:ascii="Georgia" w:cs="Georgia" w:eastAsia="Georgia" w:hAnsi="Georgia"/>
+          <w:sz w:val="20"/>
+          <w:szCs w:val="20"/>
+        </w:rPr>
+        <w:t xml:space="preserve">Sanches de Oliveira, G., &amp; Baggs, E. (2023). </w:t>
       </w:r>
       <w:r>
         <w:rPr>
@@ -6697,949 +7385,36 @@
           <w:sz w:val="20"/>
           <w:szCs w:val="20"/>
         </w:rPr>
-        <w:t xml:space="preserve">. Cambridge Elements. </w:t>
-      </w:r>
-      <w:hyperlink w:history="1" r:id="rIdjmj7c_68xtso3cmzuxj7s">
-        <w:r>
-          <w:rPr>
-            <w:rStyle w:val="Hyperlink"/>
-            <w:rFonts w:ascii="Georgia" w:cs="Georgia" w:eastAsia="Georgia" w:hAnsi="Georgia"/>
-            <w:sz w:val="20"/>
-            <w:szCs w:val="20"/>
-          </w:rPr>
-          <w:t xml:space="preserve">https://doi.org/10.1017/9781108974288</w:t>
-        </w:r>
-      </w:hyperlink>
-    </w:p>
-    <w:p>
-      <w:pPr>
-        <w:pStyle w:val="ListParagraph"/>
-        <w:numPr>
-          <w:ilvl w:val="0"/>
-          <w:numId w:val="4"/>
-        </w:numPr>
-        <w:spacing w:after="60" w:before="0" w:line="240" w:lineRule="auto"/>
-      </w:pPr>
-      <w:r>
-        <w:rPr>
-          <w:rFonts w:ascii="Georgia" w:cs="Georgia" w:eastAsia="Georgia" w:hAnsi="Georgia"/>
-          <w:sz w:val="20"/>
-          <w:szCs w:val="20"/>
-        </w:rPr>
-        <w:t xml:space="preserve">Cao, J., Deng, Z., Zhao, M., Guo, L., &amp; Zhang, S. (2024). </w:t>
-      </w:r>
-      <w:r>
-        <w:rPr>
-          <w:rFonts w:ascii="Georgia" w:cs="Georgia" w:eastAsia="Georgia" w:hAnsi="Georgia"/>
-          <w:i/>
-          <w:iCs/>
-          <w:sz w:val="20"/>
-          <w:szCs w:val="20"/>
-        </w:rPr>
-        <w:t xml:space="preserve">Diagnosing the Western cultural bias of large vision-language models in generative image understanding</w:t>
-      </w:r>
-      <w:r>
-        <w:rPr>
-          <w:rFonts w:ascii="Georgia" w:cs="Georgia" w:eastAsia="Georgia" w:hAnsi="Georgia"/>
-          <w:sz w:val="20"/>
-          <w:szCs w:val="20"/>
-        </w:rPr>
-        <w:t xml:space="preserve"> (arXiv:2406.11665).</w:t>
-      </w:r>
-    </w:p>
-    <w:p>
-      <w:pPr>
-        <w:pStyle w:val="ListParagraph"/>
-        <w:numPr>
-          <w:ilvl w:val="0"/>
-          <w:numId w:val="4"/>
-        </w:numPr>
-        <w:spacing w:after="60" w:before="0" w:line="240" w:lineRule="auto"/>
-      </w:pPr>
-      <w:r>
-        <w:rPr>
-          <w:rFonts w:ascii="Georgia" w:cs="Georgia" w:eastAsia="Georgia" w:hAnsi="Georgia"/>
-          <w:sz w:val="20"/>
-          <w:szCs w:val="20"/>
-        </w:rPr>
-        <w:t xml:space="preserve">Clayton Antitrust Act, 15 U.S.C. §§ 12-27 (1914).</w:t>
-      </w:r>
-    </w:p>
-    <w:p>
-      <w:pPr>
-        <w:pStyle w:val="ListParagraph"/>
-        <w:numPr>
-          <w:ilvl w:val="0"/>
-          <w:numId w:val="4"/>
-        </w:numPr>
-        <w:spacing w:after="60" w:before="0" w:line="240" w:lineRule="auto"/>
-      </w:pPr>
-      <w:r>
-        <w:rPr>
-          <w:rFonts w:ascii="Georgia" w:cs="Georgia" w:eastAsia="Georgia" w:hAnsi="Georgia"/>
-          <w:sz w:val="20"/>
-          <w:szCs w:val="20"/>
-        </w:rPr>
-        <w:t xml:space="preserve">Di Vita, S., et al. (2025). </w:t>
-      </w:r>
-      <w:r>
-        <w:rPr>
-          <w:rFonts w:ascii="Georgia" w:cs="Georgia" w:eastAsia="Georgia" w:hAnsi="Georgia"/>
-          <w:i/>
-          <w:iCs/>
-          <w:sz w:val="20"/>
-          <w:szCs w:val="20"/>
-        </w:rPr>
-        <w:t xml:space="preserve">EAM-SQL: Cryptographic safety envelopes for table-centric LLM pipelines</w:t>
-      </w:r>
-      <w:r>
-        <w:rPr>
-          <w:rFonts w:ascii="Georgia" w:cs="Georgia" w:eastAsia="Georgia" w:hAnsi="Georgia"/>
-          <w:sz w:val="20"/>
-          <w:szCs w:val="20"/>
-        </w:rPr>
-        <w:t xml:space="preserve">. OpenReview.</w:t>
-      </w:r>
-    </w:p>
-    <w:p>
-      <w:pPr>
-        <w:pStyle w:val="ListParagraph"/>
-        <w:numPr>
-          <w:ilvl w:val="0"/>
-          <w:numId w:val="4"/>
-        </w:numPr>
-        <w:spacing w:after="60" w:before="0" w:line="240" w:lineRule="auto"/>
-      </w:pPr>
-      <w:r>
-        <w:rPr>
-          <w:rFonts w:ascii="Georgia" w:cs="Georgia" w:eastAsia="Georgia" w:hAnsi="Georgia"/>
-          <w:sz w:val="20"/>
-          <w:szCs w:val="20"/>
-        </w:rPr>
-        <w:t xml:space="preserve">European Data Protection Supervisor. (2025, September 22). </w:t>
-      </w:r>
-      <w:r>
-        <w:rPr>
-          <w:rFonts w:ascii="Georgia" w:cs="Georgia" w:eastAsia="Georgia" w:hAnsi="Georgia"/>
-          <w:i/>
-          <w:iCs/>
-          <w:sz w:val="20"/>
-          <w:szCs w:val="20"/>
-        </w:rPr>
-        <w:t xml:space="preserve">TechDispatch #2/2025: Human oversight of automated decision-making</w:t>
-      </w:r>
-      <w:r>
-        <w:rPr>
-          <w:rFonts w:ascii="Georgia" w:cs="Georgia" w:eastAsia="Georgia" w:hAnsi="Georgia"/>
-          <w:sz w:val="20"/>
-          <w:szCs w:val="20"/>
-        </w:rPr>
-        <w:t xml:space="preserve">. EDPS Office.</w:t>
-      </w:r>
-    </w:p>
-    <w:p>
-      <w:pPr>
-        <w:pStyle w:val="ListParagraph"/>
-        <w:numPr>
-          <w:ilvl w:val="0"/>
-          <w:numId w:val="4"/>
-        </w:numPr>
-        <w:spacing w:after="60" w:before="0" w:line="240" w:lineRule="auto"/>
-      </w:pPr>
-      <w:r>
-        <w:rPr>
-          <w:rFonts w:ascii="Georgia" w:cs="Georgia" w:eastAsia="Georgia" w:hAnsi="Georgia"/>
-          <w:sz w:val="20"/>
-          <w:szCs w:val="20"/>
-        </w:rPr>
-        <w:t xml:space="preserve">European Union. (2024). </w:t>
-      </w:r>
-      <w:r>
-        <w:rPr>
-          <w:rFonts w:ascii="Georgia" w:cs="Georgia" w:eastAsia="Georgia" w:hAnsi="Georgia"/>
-          <w:i/>
-          <w:iCs/>
-          <w:sz w:val="20"/>
-          <w:szCs w:val="20"/>
-        </w:rPr>
-        <w:t xml:space="preserve">Regulation (EU) 2024/1689 laying down harmonised rules on artificial intelligence</w:t>
-      </w:r>
-      <w:r>
-        <w:rPr>
-          <w:rFonts w:ascii="Georgia" w:cs="Georgia" w:eastAsia="Georgia" w:hAnsi="Georgia"/>
-          <w:sz w:val="20"/>
-          <w:szCs w:val="20"/>
-        </w:rPr>
-        <w:t xml:space="preserve">, Articles 12 and 14. Official Journal of the European Union. </w:t>
-      </w:r>
-      <w:hyperlink w:history="1" r:id="rIdh3a1eu7kh8ngrqtqwcbt0">
-        <w:r>
-          <w:rPr>
-            <w:rStyle w:val="Hyperlink"/>
-            <w:rFonts w:ascii="Georgia" w:cs="Georgia" w:eastAsia="Georgia" w:hAnsi="Georgia"/>
-            <w:sz w:val="20"/>
-            <w:szCs w:val="20"/>
-          </w:rPr>
-          <w:t xml:space="preserve">https://artificialintelligenceact.eu/</w:t>
-        </w:r>
-      </w:hyperlink>
-    </w:p>
-    <w:p>
-      <w:pPr>
-        <w:pStyle w:val="ListParagraph"/>
-        <w:numPr>
-          <w:ilvl w:val="0"/>
-          <w:numId w:val="4"/>
-        </w:numPr>
-        <w:spacing w:after="60" w:before="0" w:line="240" w:lineRule="auto"/>
-      </w:pPr>
-      <w:r>
-        <w:rPr>
-          <w:rFonts w:ascii="Georgia" w:cs="Georgia" w:eastAsia="Georgia" w:hAnsi="Georgia"/>
-          <w:sz w:val="20"/>
-          <w:szCs w:val="20"/>
-        </w:rPr>
-        <w:t xml:space="preserve">Federation of American Scientists. (2025, January 9). </w:t>
-      </w:r>
-      <w:r>
-        <w:rPr>
-          <w:rFonts w:ascii="Georgia" w:cs="Georgia" w:eastAsia="Georgia" w:hAnsi="Georgia"/>
-          <w:i/>
-          <w:iCs/>
-          <w:sz w:val="20"/>
-          <w:szCs w:val="20"/>
-        </w:rPr>
-        <w:t xml:space="preserve">Antitrust in the AI era</w:t>
-      </w:r>
-      <w:r>
-        <w:rPr>
-          <w:rFonts w:ascii="Georgia" w:cs="Georgia" w:eastAsia="Georgia" w:hAnsi="Georgia"/>
-          <w:sz w:val="20"/>
-          <w:szCs w:val="20"/>
-        </w:rPr>
-        <w:t xml:space="preserve">. </w:t>
-      </w:r>
-      <w:hyperlink w:history="1" r:id="rIdjvsqczd8ol7xuwfng9bqd">
-        <w:r>
-          <w:rPr>
-            <w:rStyle w:val="Hyperlink"/>
-            <w:rFonts w:ascii="Georgia" w:cs="Georgia" w:eastAsia="Georgia" w:hAnsi="Georgia"/>
-            <w:sz w:val="20"/>
-            <w:szCs w:val="20"/>
-          </w:rPr>
-          <w:t xml:space="preserve">https://fas.org/publication/antitrust-in-the-ai-era/</w:t>
-        </w:r>
-      </w:hyperlink>
-    </w:p>
-    <w:p>
-      <w:pPr>
-        <w:pStyle w:val="ListParagraph"/>
-        <w:numPr>
-          <w:ilvl w:val="0"/>
-          <w:numId w:val="4"/>
-        </w:numPr>
-        <w:spacing w:after="60" w:before="0" w:line="240" w:lineRule="auto"/>
-      </w:pPr>
-      <w:r>
-        <w:rPr>
-          <w:rFonts w:ascii="Georgia" w:cs="Georgia" w:eastAsia="Georgia" w:hAnsi="Georgia"/>
-          <w:sz w:val="20"/>
-          <w:szCs w:val="20"/>
-        </w:rPr>
-        <w:t xml:space="preserve">Gaurav, S., Heikkonen, J., &amp; Chaudhary, J. (2025). </w:t>
-      </w:r>
-      <w:r>
-        <w:rPr>
-          <w:rFonts w:ascii="Georgia" w:cs="Georgia" w:eastAsia="Georgia" w:hAnsi="Georgia"/>
-          <w:i/>
-          <w:iCs/>
-          <w:sz w:val="20"/>
-          <w:szCs w:val="20"/>
-        </w:rPr>
-        <w:t xml:space="preserve">Governance-as-a-Service: A multi-agent framework for AI system compliance and policy enforcement</w:t>
-      </w:r>
-      <w:r>
-        <w:rPr>
-          <w:rFonts w:ascii="Georgia" w:cs="Georgia" w:eastAsia="Georgia" w:hAnsi="Georgia"/>
-          <w:sz w:val="20"/>
-          <w:szCs w:val="20"/>
-        </w:rPr>
-        <w:t xml:space="preserve"> (arXiv:2508.18765).</w:t>
-      </w:r>
-    </w:p>
-    <w:p>
-      <w:pPr>
-        <w:pStyle w:val="ListParagraph"/>
-        <w:numPr>
-          <w:ilvl w:val="0"/>
-          <w:numId w:val="4"/>
-        </w:numPr>
-        <w:spacing w:after="60" w:before="0" w:line="240" w:lineRule="auto"/>
-      </w:pPr>
-      <w:r>
-        <w:rPr>
-          <w:rFonts w:ascii="Georgia" w:cs="Georgia" w:eastAsia="Georgia" w:hAnsi="Georgia"/>
-          <w:sz w:val="20"/>
-          <w:szCs w:val="20"/>
-        </w:rPr>
-        <w:t xml:space="preserve">Georgia Institute of Technology. (2024, April 2). </w:t>
-      </w:r>
-      <w:r>
-        <w:rPr>
-          <w:rFonts w:ascii="Georgia" w:cs="Georgia" w:eastAsia="Georgia" w:hAnsi="Georgia"/>
-          <w:i/>
-          <w:iCs/>
-          <w:sz w:val="20"/>
-          <w:szCs w:val="20"/>
-        </w:rPr>
-        <w:t xml:space="preserve">LLMs generate Western bias even when trained with non-Western languages</w:t>
-      </w:r>
-      <w:r>
-        <w:rPr>
-          <w:rFonts w:ascii="Georgia" w:cs="Georgia" w:eastAsia="Georgia" w:hAnsi="Georgia"/>
-          <w:sz w:val="20"/>
-          <w:szCs w:val="20"/>
-        </w:rPr>
-        <w:t xml:space="preserve">. Georgia Tech News.</w:t>
-      </w:r>
-    </w:p>
-    <w:p>
-      <w:pPr>
-        <w:pStyle w:val="ListParagraph"/>
-        <w:numPr>
-          <w:ilvl w:val="0"/>
-          <w:numId w:val="4"/>
-        </w:numPr>
-        <w:spacing w:after="60" w:before="0" w:line="240" w:lineRule="auto"/>
-      </w:pPr>
-      <w:r>
-        <w:rPr>
-          <w:rFonts w:ascii="Georgia" w:cs="Georgia" w:eastAsia="Georgia" w:hAnsi="Georgia"/>
-          <w:sz w:val="20"/>
-          <w:szCs w:val="20"/>
-        </w:rPr>
-        <w:t xml:space="preserve">Goddard, K., Roudsari, A., &amp; Wyatt, J. C. (2011). Automation bias: A systematic review of frequency, effect mediators, and mitigators. </w:t>
-      </w:r>
-      <w:r>
-        <w:rPr>
-          <w:rFonts w:ascii="Georgia" w:cs="Georgia" w:eastAsia="Georgia" w:hAnsi="Georgia"/>
-          <w:i/>
-          <w:iCs/>
-          <w:sz w:val="20"/>
-          <w:szCs w:val="20"/>
-        </w:rPr>
-        <w:t xml:space="preserve">Journal of the American Medical Informatics Association, 19</w:t>
-      </w:r>
-      <w:r>
-        <w:rPr>
-          <w:rFonts w:ascii="Georgia" w:cs="Georgia" w:eastAsia="Georgia" w:hAnsi="Georgia"/>
-          <w:sz w:val="20"/>
-          <w:szCs w:val="20"/>
-        </w:rPr>
-        <w:t xml:space="preserve">(1), 121-127. </w:t>
-      </w:r>
-      <w:hyperlink w:history="1" r:id="rId1xom-icmfac2yyj1lcu7t">
-        <w:r>
-          <w:rPr>
-            <w:rStyle w:val="Hyperlink"/>
-            <w:rFonts w:ascii="Georgia" w:cs="Georgia" w:eastAsia="Georgia" w:hAnsi="Georgia"/>
-            <w:sz w:val="20"/>
-            <w:szCs w:val="20"/>
-          </w:rPr>
-          <w:t xml:space="preserve">https://doi.org/10.1136/amiajnl-2011-000089</w:t>
-        </w:r>
-      </w:hyperlink>
-    </w:p>
-    <w:p>
-      <w:pPr>
-        <w:pStyle w:val="ListParagraph"/>
-        <w:numPr>
-          <w:ilvl w:val="0"/>
-          <w:numId w:val="4"/>
-        </w:numPr>
-        <w:spacing w:after="60" w:before="0" w:line="240" w:lineRule="auto"/>
-      </w:pPr>
-      <w:r>
-        <w:rPr>
-          <w:rFonts w:ascii="Georgia" w:cs="Georgia" w:eastAsia="Georgia" w:hAnsi="Georgia"/>
-          <w:sz w:val="20"/>
-          <w:szCs w:val="20"/>
-        </w:rPr>
-        <w:t xml:space="preserve">Heim, L., Bernaerts, K., Metzger, C., &amp; Anderljung, M. (2024). </w:t>
-      </w:r>
-      <w:r>
-        <w:rPr>
-          <w:rFonts w:ascii="Georgia" w:cs="Georgia" w:eastAsia="Georgia" w:hAnsi="Georgia"/>
-          <w:i/>
-          <w:iCs/>
-          <w:sz w:val="20"/>
-          <w:szCs w:val="20"/>
-        </w:rPr>
-        <w:t xml:space="preserve">Governing through the cloud: The intermediary role of compute providers in AI regulation</w:t>
-      </w:r>
-      <w:r>
-        <w:rPr>
-          <w:rFonts w:ascii="Georgia" w:cs="Georgia" w:eastAsia="Georgia" w:hAnsi="Georgia"/>
-          <w:sz w:val="20"/>
-          <w:szCs w:val="20"/>
-        </w:rPr>
-        <w:t xml:space="preserve">. Centre for the Governance of AI.</w:t>
-      </w:r>
-    </w:p>
-    <w:p>
-      <w:pPr>
-        <w:pStyle w:val="ListParagraph"/>
-        <w:numPr>
-          <w:ilvl w:val="0"/>
-          <w:numId w:val="4"/>
-        </w:numPr>
-        <w:spacing w:after="60" w:before="0" w:line="240" w:lineRule="auto"/>
-      </w:pPr>
-      <w:r>
-        <w:rPr>
-          <w:rFonts w:ascii="Georgia" w:cs="Georgia" w:eastAsia="Georgia" w:hAnsi="Georgia"/>
-          <w:sz w:val="20"/>
-          <w:szCs w:val="20"/>
-        </w:rPr>
-        <w:t xml:space="preserve">Henrich, J., Atari, M., Xue, M. J., Park, P. S., &amp; Blasi, D. E. (2024). </w:t>
-      </w:r>
-      <w:r>
-        <w:rPr>
-          <w:rFonts w:ascii="Georgia" w:cs="Georgia" w:eastAsia="Georgia" w:hAnsi="Georgia"/>
-          <w:i/>
-          <w:iCs/>
-          <w:sz w:val="20"/>
-          <w:szCs w:val="20"/>
-        </w:rPr>
-        <w:t xml:space="preserve">Which humans? Measuring and understanding the responses of large language models to cultural diversity</w:t>
-      </w:r>
-      <w:r>
-        <w:rPr>
-          <w:rFonts w:ascii="Georgia" w:cs="Georgia" w:eastAsia="Georgia" w:hAnsi="Georgia"/>
-          <w:sz w:val="20"/>
-          <w:szCs w:val="20"/>
-        </w:rPr>
-        <w:t xml:space="preserve"> [Working paper]. Harvard Department of Human Evolutionary Biology.</w:t>
-      </w:r>
-    </w:p>
-    <w:p>
-      <w:pPr>
-        <w:pStyle w:val="ListParagraph"/>
-        <w:numPr>
-          <w:ilvl w:val="0"/>
-          <w:numId w:val="4"/>
-        </w:numPr>
-        <w:spacing w:after="60" w:before="0" w:line="240" w:lineRule="auto"/>
-      </w:pPr>
-      <w:r>
-        <w:rPr>
-          <w:rFonts w:ascii="Georgia" w:cs="Georgia" w:eastAsia="Georgia" w:hAnsi="Georgia"/>
-          <w:sz w:val="20"/>
-          <w:szCs w:val="20"/>
-        </w:rPr>
-        <w:t xml:space="preserve">Henrich, J., Heine, S. J., &amp; Norenzayan, A. (2010). The weirdest people in the world? </w:t>
-      </w:r>
-      <w:r>
-        <w:rPr>
-          <w:rFonts w:ascii="Georgia" w:cs="Georgia" w:eastAsia="Georgia" w:hAnsi="Georgia"/>
-          <w:i/>
-          <w:iCs/>
-          <w:sz w:val="20"/>
-          <w:szCs w:val="20"/>
-        </w:rPr>
-        <w:t xml:space="preserve">Behavioral and Brain Sciences, 33</w:t>
-      </w:r>
-      <w:r>
-        <w:rPr>
-          <w:rFonts w:ascii="Georgia" w:cs="Georgia" w:eastAsia="Georgia" w:hAnsi="Georgia"/>
-          <w:sz w:val="20"/>
-          <w:szCs w:val="20"/>
-        </w:rPr>
-        <w:t xml:space="preserve">(2-3), 61-83. </w:t>
-      </w:r>
-      <w:hyperlink w:history="1" r:id="rIdb35uaokvhvzguapxbkv_f">
-        <w:r>
-          <w:rPr>
-            <w:rStyle w:val="Hyperlink"/>
-            <w:rFonts w:ascii="Georgia" w:cs="Georgia" w:eastAsia="Georgia" w:hAnsi="Georgia"/>
-            <w:sz w:val="20"/>
-            <w:szCs w:val="20"/>
-          </w:rPr>
-          <w:t xml:space="preserve">https://doi.org/10.1017/S0140525X0999152X</w:t>
-        </w:r>
-      </w:hyperlink>
-    </w:p>
-    <w:p>
-      <w:pPr>
-        <w:pStyle w:val="ListParagraph"/>
-        <w:numPr>
-          <w:ilvl w:val="0"/>
-          <w:numId w:val="4"/>
-        </w:numPr>
-        <w:spacing w:after="60" w:before="0" w:line="240" w:lineRule="auto"/>
-      </w:pPr>
-      <w:r>
-        <w:rPr>
-          <w:rFonts w:ascii="Georgia" w:cs="Georgia" w:eastAsia="Georgia" w:hAnsi="Georgia"/>
-          <w:sz w:val="20"/>
-          <w:szCs w:val="20"/>
-        </w:rPr>
-        <w:t xml:space="preserve">Hoover, A. (2025, June 17). There’s a “10% to 20% chance” that AI will displace humans completely, says “godfather” of the technology. CNBC.</w:t>
-      </w:r>
-    </w:p>
-    <w:p>
-      <w:pPr>
-        <w:pStyle w:val="ListParagraph"/>
-        <w:numPr>
-          <w:ilvl w:val="0"/>
-          <w:numId w:val="4"/>
-        </w:numPr>
-        <w:spacing w:after="60" w:before="0" w:line="240" w:lineRule="auto"/>
-      </w:pPr>
-      <w:r>
-        <w:rPr>
-          <w:rFonts w:ascii="Georgia" w:cs="Georgia" w:eastAsia="Georgia" w:hAnsi="Georgia"/>
-          <w:sz w:val="20"/>
-          <w:szCs w:val="20"/>
-        </w:rPr>
-        <w:t xml:space="preserve">Janis, I. L. (1972). </w:t>
-      </w:r>
-      <w:r>
-        <w:rPr>
-          <w:rFonts w:ascii="Georgia" w:cs="Georgia" w:eastAsia="Georgia" w:hAnsi="Georgia"/>
-          <w:i/>
-          <w:iCs/>
-          <w:sz w:val="20"/>
-          <w:szCs w:val="20"/>
-        </w:rPr>
-        <w:t xml:space="preserve">Victims of groupthink: A psychological study of foreign-policy decisions and fiascos</w:t>
-      </w:r>
-      <w:r>
-        <w:rPr>
-          <w:rFonts w:ascii="Georgia" w:cs="Georgia" w:eastAsia="Georgia" w:hAnsi="Georgia"/>
-          <w:sz w:val="20"/>
-          <w:szCs w:val="20"/>
-        </w:rPr>
-        <w:t xml:space="preserve">. Houghton Mifflin.</w:t>
-      </w:r>
-    </w:p>
-    <w:p>
-      <w:pPr>
-        <w:pStyle w:val="ListParagraph"/>
-        <w:numPr>
-          <w:ilvl w:val="0"/>
-          <w:numId w:val="4"/>
-        </w:numPr>
-        <w:spacing w:after="60" w:before="0" w:line="240" w:lineRule="auto"/>
-      </w:pPr>
-      <w:r>
-        <w:rPr>
-          <w:rFonts w:ascii="Georgia" w:cs="Georgia" w:eastAsia="Georgia" w:hAnsi="Georgia"/>
-          <w:sz w:val="20"/>
-          <w:szCs w:val="20"/>
-        </w:rPr>
-        <w:t xml:space="preserve">Kreps, S., Kriner, D. L., &amp; Schneider, J. (2024). Automation bias in national security contexts: Experiential and attitudinal drivers. </w:t>
-      </w:r>
-      <w:r>
-        <w:rPr>
-          <w:rFonts w:ascii="Georgia" w:cs="Georgia" w:eastAsia="Georgia" w:hAnsi="Georgia"/>
-          <w:i/>
-          <w:iCs/>
-          <w:sz w:val="20"/>
-          <w:szCs w:val="20"/>
-        </w:rPr>
-        <w:t xml:space="preserve">International Studies Quarterly, 68</w:t>
-      </w:r>
-      <w:r>
-        <w:rPr>
-          <w:rFonts w:ascii="Georgia" w:cs="Georgia" w:eastAsia="Georgia" w:hAnsi="Georgia"/>
-          <w:sz w:val="20"/>
-          <w:szCs w:val="20"/>
-        </w:rPr>
-        <w:t xml:space="preserve">(2), sqae020. </w:t>
-      </w:r>
-      <w:hyperlink w:history="1" r:id="rIdb9dt6vaf14yh-asg3pkk3">
-        <w:r>
-          <w:rPr>
-            <w:rStyle w:val="Hyperlink"/>
-            <w:rFonts w:ascii="Georgia" w:cs="Georgia" w:eastAsia="Georgia" w:hAnsi="Georgia"/>
-            <w:sz w:val="20"/>
-            <w:szCs w:val="20"/>
-          </w:rPr>
-          <w:t xml:space="preserve">https://doi.org/10.1093/isq/sqae020</w:t>
-        </w:r>
-      </w:hyperlink>
-    </w:p>
-    <w:p>
-      <w:pPr>
-        <w:pStyle w:val="ListParagraph"/>
-        <w:numPr>
-          <w:ilvl w:val="0"/>
-          <w:numId w:val="4"/>
-        </w:numPr>
-        <w:spacing w:after="60" w:before="0" w:line="240" w:lineRule="auto"/>
-      </w:pPr>
-      <w:r>
-        <w:rPr>
-          <w:rFonts w:ascii="Georgia" w:cs="Georgia" w:eastAsia="Georgia" w:hAnsi="Georgia"/>
-          <w:sz w:val="20"/>
-          <w:szCs w:val="20"/>
-        </w:rPr>
-        <w:t xml:space="preserve">Mallaband, A. (2025, December 29). </w:t>
-      </w:r>
-      <w:r>
-        <w:rPr>
-          <w:rFonts w:ascii="Georgia" w:cs="Georgia" w:eastAsia="Georgia" w:hAnsi="Georgia"/>
-          <w:i/>
-          <w:iCs/>
-          <w:sz w:val="20"/>
-          <w:szCs w:val="20"/>
-        </w:rPr>
-        <w:t xml:space="preserve">Deterministic guardrails for nondeterministic agents</w:t>
-      </w:r>
-      <w:r>
-        <w:rPr>
-          <w:rFonts w:ascii="Georgia" w:cs="Georgia" w:eastAsia="Georgia" w:hAnsi="Georgia"/>
-          <w:sz w:val="20"/>
-          <w:szCs w:val="20"/>
-        </w:rPr>
-        <w:t xml:space="preserve">. LinkedIn.</w:t>
-      </w:r>
-    </w:p>
-    <w:p>
-      <w:pPr>
-        <w:pStyle w:val="ListParagraph"/>
-        <w:numPr>
-          <w:ilvl w:val="0"/>
-          <w:numId w:val="4"/>
-        </w:numPr>
-        <w:spacing w:after="60" w:before="0" w:line="240" w:lineRule="auto"/>
-      </w:pPr>
-      <w:r>
-        <w:rPr>
-          <w:rFonts w:ascii="Georgia" w:cs="Georgia" w:eastAsia="Georgia" w:hAnsi="Georgia"/>
-          <w:sz w:val="20"/>
-          <w:szCs w:val="20"/>
-        </w:rPr>
-        <w:t xml:space="preserve">Mökander, J., &amp; Floridi, L. (2025). Human oversight under Article 14 of the EU AI Act. In </w:t>
-      </w:r>
-      <w:r>
-        <w:rPr>
-          <w:rFonts w:ascii="Georgia" w:cs="Georgia" w:eastAsia="Georgia" w:hAnsi="Georgia"/>
-          <w:i/>
-          <w:iCs/>
-          <w:sz w:val="20"/>
-          <w:szCs w:val="20"/>
-        </w:rPr>
-        <w:t xml:space="preserve">Regulation of artificial intelligence: International standards and governance mechanisms</w:t>
-      </w:r>
-      <w:r>
-        <w:rPr>
-          <w:rFonts w:ascii="Georgia" w:cs="Georgia" w:eastAsia="Georgia" w:hAnsi="Georgia"/>
-          <w:sz w:val="20"/>
-          <w:szCs w:val="20"/>
-        </w:rPr>
-        <w:t xml:space="preserve"> (pp. 127-154). Edward Elgar Publishing.</w:t>
-      </w:r>
-    </w:p>
-    <w:p>
-      <w:pPr>
-        <w:pStyle w:val="ListParagraph"/>
-        <w:numPr>
-          <w:ilvl w:val="0"/>
-          <w:numId w:val="4"/>
-        </w:numPr>
-        <w:spacing w:after="60" w:before="0" w:line="240" w:lineRule="auto"/>
-      </w:pPr>
-      <w:r>
-        <w:rPr>
-          <w:rFonts w:ascii="Georgia" w:cs="Georgia" w:eastAsia="Georgia" w:hAnsi="Georgia"/>
-          <w:sz w:val="20"/>
-          <w:szCs w:val="20"/>
-        </w:rPr>
-        <w:t xml:space="preserve">Mosier, K. L., &amp; Skitka, L. J. (1996). Does automation bias decision-making? </w:t>
-      </w:r>
-      <w:r>
-        <w:rPr>
-          <w:rFonts w:ascii="Georgia" w:cs="Georgia" w:eastAsia="Georgia" w:hAnsi="Georgia"/>
-          <w:i/>
-          <w:iCs/>
-          <w:sz w:val="20"/>
-          <w:szCs w:val="20"/>
-        </w:rPr>
-        <w:t xml:space="preserve">International Journal of Industrial Ergonomics, 18</w:t>
-      </w:r>
-      <w:r>
-        <w:rPr>
-          <w:rFonts w:ascii="Georgia" w:cs="Georgia" w:eastAsia="Georgia" w:hAnsi="Georgia"/>
-          <w:sz w:val="20"/>
-          <w:szCs w:val="20"/>
-        </w:rPr>
-        <w:t xml:space="preserve">(5), 311-325. </w:t>
-      </w:r>
-      <w:hyperlink w:history="1" r:id="rIdgubcmwpnxj-drxenmrccv">
-        <w:r>
-          <w:rPr>
-            <w:rStyle w:val="Hyperlink"/>
-            <w:rFonts w:ascii="Georgia" w:cs="Georgia" w:eastAsia="Georgia" w:hAnsi="Georgia"/>
-            <w:sz w:val="20"/>
-            <w:szCs w:val="20"/>
-          </w:rPr>
-          <w:t xml:space="preserve">https://doi.org/10.1016/0169-8141(95</w:t>
-        </w:r>
-      </w:hyperlink>
-      <w:r>
-        <w:rPr>
-          <w:rFonts w:ascii="Georgia" w:cs="Georgia" w:eastAsia="Georgia" w:hAnsi="Georgia"/>
-          <w:sz w:val="20"/>
-          <w:szCs w:val="20"/>
-        </w:rPr>
-        <w:t xml:space="preserve">)00070-4</w:t>
-      </w:r>
-    </w:p>
-    <w:p>
-      <w:pPr>
-        <w:pStyle w:val="ListParagraph"/>
-        <w:numPr>
-          <w:ilvl w:val="0"/>
-          <w:numId w:val="4"/>
-        </w:numPr>
-        <w:spacing w:after="60" w:before="0" w:line="240" w:lineRule="auto"/>
-      </w:pPr>
-      <w:r>
-        <w:rPr>
-          <w:rFonts w:ascii="Georgia" w:cs="Georgia" w:eastAsia="Georgia" w:hAnsi="Georgia"/>
-          <w:sz w:val="20"/>
-          <w:szCs w:val="20"/>
-        </w:rPr>
-        <w:t xml:space="preserve">Narechania, T. S., &amp; Sitaraman, G. (2024). An antimonopoly approach to governing artificial intelligence. </w:t>
-      </w:r>
-      <w:r>
-        <w:rPr>
-          <w:rFonts w:ascii="Georgia" w:cs="Georgia" w:eastAsia="Georgia" w:hAnsi="Georgia"/>
-          <w:i/>
-          <w:iCs/>
-          <w:sz w:val="20"/>
-          <w:szCs w:val="20"/>
-        </w:rPr>
-        <w:t xml:space="preserve">Yale Law &amp; Policy Review, 43</w:t>
-      </w:r>
-      <w:r>
-        <w:rPr>
-          <w:rFonts w:ascii="Georgia" w:cs="Georgia" w:eastAsia="Georgia" w:hAnsi="Georgia"/>
-          <w:sz w:val="20"/>
-          <w:szCs w:val="20"/>
-        </w:rPr>
-        <w:t xml:space="preserve">(1), 1-74.</w:t>
-      </w:r>
-    </w:p>
-    <w:p>
-      <w:pPr>
-        <w:pStyle w:val="ListParagraph"/>
-        <w:numPr>
-          <w:ilvl w:val="0"/>
-          <w:numId w:val="4"/>
-        </w:numPr>
-        <w:spacing w:after="60" w:before="0" w:line="240" w:lineRule="auto"/>
-      </w:pPr>
-      <w:r>
-        <w:rPr>
-          <w:rFonts w:ascii="Georgia" w:cs="Georgia" w:eastAsia="Georgia" w:hAnsi="Georgia"/>
-          <w:sz w:val="20"/>
-          <w:szCs w:val="20"/>
-        </w:rPr>
-        <w:t xml:space="preserve">Navarrete, J., Vaca-Barahona, B., Peña, S., &amp; Hernández-Suárez, A. (2024). Human oversight of automated decision-making systems: A multi-method study on automation bias with recidivism risk assessment algorithms. </w:t>
-      </w:r>
-      <w:r>
-        <w:rPr>
-          <w:rFonts w:ascii="Georgia" w:cs="Georgia" w:eastAsia="Georgia" w:hAnsi="Georgia"/>
-          <w:i/>
-          <w:iCs/>
-          <w:sz w:val="20"/>
-          <w:szCs w:val="20"/>
-        </w:rPr>
-        <w:t xml:space="preserve">PLOS ONE, 19</w:t>
-      </w:r>
-      <w:r>
-        <w:rPr>
-          <w:rFonts w:ascii="Georgia" w:cs="Georgia" w:eastAsia="Georgia" w:hAnsi="Georgia"/>
-          <w:sz w:val="20"/>
-          <w:szCs w:val="20"/>
-        </w:rPr>
-        <w:t xml:space="preserve">(1), e0296384.</w:t>
-      </w:r>
-    </w:p>
-    <w:p>
-      <w:pPr>
-        <w:pStyle w:val="ListParagraph"/>
-        <w:numPr>
-          <w:ilvl w:val="0"/>
-          <w:numId w:val="4"/>
-        </w:numPr>
-        <w:spacing w:after="60" w:before="0" w:line="240" w:lineRule="auto"/>
-      </w:pPr>
-      <w:r>
-        <w:rPr>
-          <w:rFonts w:ascii="Georgia" w:cs="Georgia" w:eastAsia="Georgia" w:hAnsi="Georgia"/>
-          <w:sz w:val="20"/>
-          <w:szCs w:val="20"/>
-        </w:rPr>
-        <w:t xml:space="preserve">Nolan, J., &amp; Nolan, L. (Creators). (2011-2016). </w:t>
-      </w:r>
-      <w:r>
-        <w:rPr>
-          <w:rFonts w:ascii="Georgia" w:cs="Georgia" w:eastAsia="Georgia" w:hAnsi="Georgia"/>
-          <w:i/>
-          <w:iCs/>
-          <w:sz w:val="20"/>
-          <w:szCs w:val="20"/>
-        </w:rPr>
-        <w:t xml:space="preserve">Person of interest</w:t>
-      </w:r>
-      <w:r>
-        <w:rPr>
-          <w:rFonts w:ascii="Georgia" w:cs="Georgia" w:eastAsia="Georgia" w:hAnsi="Georgia"/>
-          <w:sz w:val="20"/>
-          <w:szCs w:val="20"/>
-        </w:rPr>
-        <w:t xml:space="preserve"> [TV series]. CBS.</w:t>
-      </w:r>
-    </w:p>
-    <w:p>
-      <w:pPr>
-        <w:pStyle w:val="ListParagraph"/>
-        <w:numPr>
-          <w:ilvl w:val="0"/>
-          <w:numId w:val="4"/>
-        </w:numPr>
-        <w:spacing w:after="60" w:before="0" w:line="240" w:lineRule="auto"/>
-      </w:pPr>
-      <w:r>
-        <w:rPr>
-          <w:rFonts w:ascii="Georgia" w:cs="Georgia" w:eastAsia="Georgia" w:hAnsi="Georgia"/>
-          <w:sz w:val="20"/>
-          <w:szCs w:val="20"/>
-        </w:rPr>
-        <w:t xml:space="preserve">Parasuraman, R., &amp; Manzey, D. H. (2010). Complacency and bias in human use of automation: An attentional integration. </w:t>
-      </w:r>
-      <w:r>
-        <w:rPr>
-          <w:rFonts w:ascii="Georgia" w:cs="Georgia" w:eastAsia="Georgia" w:hAnsi="Georgia"/>
-          <w:i/>
-          <w:iCs/>
-          <w:sz w:val="20"/>
-          <w:szCs w:val="20"/>
-        </w:rPr>
-        <w:t xml:space="preserve">Human Factors, 52</w:t>
-      </w:r>
-      <w:r>
-        <w:rPr>
-          <w:rFonts w:ascii="Georgia" w:cs="Georgia" w:eastAsia="Georgia" w:hAnsi="Georgia"/>
-          <w:sz w:val="20"/>
-          <w:szCs w:val="20"/>
-        </w:rPr>
-        <w:t xml:space="preserve">(3), 381-410. </w:t>
-      </w:r>
-      <w:hyperlink w:history="1" r:id="rId9fw8v8xg52wmbgzq7ioqm">
-        <w:r>
-          <w:rPr>
-            <w:rStyle w:val="Hyperlink"/>
-            <w:rFonts w:ascii="Georgia" w:cs="Georgia" w:eastAsia="Georgia" w:hAnsi="Georgia"/>
-            <w:sz w:val="20"/>
-            <w:szCs w:val="20"/>
-          </w:rPr>
-          <w:t xml:space="preserve">https://doi.org/10.1177/0018720810376055</w:t>
-        </w:r>
-      </w:hyperlink>
-    </w:p>
-    <w:p>
-      <w:pPr>
-        <w:pStyle w:val="ListParagraph"/>
-        <w:numPr>
-          <w:ilvl w:val="0"/>
-          <w:numId w:val="4"/>
-        </w:numPr>
-        <w:spacing w:after="60" w:before="0" w:line="240" w:lineRule="auto"/>
-      </w:pPr>
-      <w:r>
-        <w:rPr>
-          <w:rFonts w:ascii="Georgia" w:cs="Georgia" w:eastAsia="Georgia" w:hAnsi="Georgia"/>
-          <w:sz w:val="20"/>
-          <w:szCs w:val="20"/>
-        </w:rPr>
-        <w:t xml:space="preserve">Pierucci, F., Galisai, M., Bracale, M. S., Prandi, M., Bisconti, P., Giarrusso, F., Sorokoletova, O., Suriani, V., &amp; Nardi, D. (2026). </w:t>
-      </w:r>
-      <w:r>
-        <w:rPr>
-          <w:rFonts w:ascii="Georgia" w:cs="Georgia" w:eastAsia="Georgia" w:hAnsi="Georgia"/>
-          <w:i/>
-          <w:iCs/>
-          <w:sz w:val="20"/>
-          <w:szCs w:val="20"/>
-        </w:rPr>
-        <w:t xml:space="preserve">Institutional AI: A governance framework for distributional AGI safety</w:t>
-      </w:r>
-      <w:r>
-        <w:rPr>
-          <w:rFonts w:ascii="Georgia" w:cs="Georgia" w:eastAsia="Georgia" w:hAnsi="Georgia"/>
-          <w:sz w:val="20"/>
-          <w:szCs w:val="20"/>
-        </w:rPr>
-        <w:t xml:space="preserve"> (arXiv:2601.10599).</w:t>
-      </w:r>
-    </w:p>
-    <w:p>
-      <w:pPr>
-        <w:pStyle w:val="ListParagraph"/>
-        <w:numPr>
-          <w:ilvl w:val="0"/>
-          <w:numId w:val="4"/>
-        </w:numPr>
-        <w:spacing w:after="60" w:before="0" w:line="240" w:lineRule="auto"/>
-      </w:pPr>
-      <w:r>
-        <w:rPr>
-          <w:rFonts w:ascii="Georgia" w:cs="Georgia" w:eastAsia="Georgia" w:hAnsi="Georgia"/>
-          <w:sz w:val="20"/>
-          <w:szCs w:val="20"/>
-        </w:rPr>
-        <w:t xml:space="preserve">prEN 18286:2025. </w:t>
-      </w:r>
-      <w:r>
-        <w:rPr>
-          <w:rFonts w:ascii="Georgia" w:cs="Georgia" w:eastAsia="Georgia" w:hAnsi="Georgia"/>
-          <w:i/>
-          <w:iCs/>
-          <w:sz w:val="20"/>
-          <w:szCs w:val="20"/>
-        </w:rPr>
-        <w:t xml:space="preserve">Quality management systems for providers of AI systems</w:t>
-      </w:r>
-      <w:r>
-        <w:rPr>
-          <w:rFonts w:ascii="Georgia" w:cs="Georgia" w:eastAsia="Georgia" w:hAnsi="Georgia"/>
-          <w:sz w:val="20"/>
-          <w:szCs w:val="20"/>
-        </w:rPr>
-        <w:t xml:space="preserve">. European Committee for Standardization (CEN).</w:t>
-      </w:r>
-    </w:p>
-    <w:p>
-      <w:pPr>
-        <w:pStyle w:val="ListParagraph"/>
-        <w:numPr>
-          <w:ilvl w:val="0"/>
-          <w:numId w:val="4"/>
-        </w:numPr>
-        <w:spacing w:after="60" w:before="0" w:line="240" w:lineRule="auto"/>
-      </w:pPr>
-      <w:r>
-        <w:rPr>
-          <w:rFonts w:ascii="Georgia" w:cs="Georgia" w:eastAsia="Georgia" w:hAnsi="Georgia"/>
-          <w:sz w:val="20"/>
-          <w:szCs w:val="20"/>
-        </w:rPr>
-        <w:t xml:space="preserve">Schrepel, T. (2025). Decoding the AI Act: Implications for competition law and computational antitrust. </w:t>
+        <w:t xml:space="preserve">. Cambridge University Press. </w:t>
+      </w:r>
+      <w:hyperlink w:history="1" r:id="rIdw4srfa8er9ybylxf8cbye">
+        <w:r>
+          <w:rPr>
+            <w:rStyle w:val="Hyperlink"/>
+            <w:rFonts w:ascii="Georgia" w:cs="Georgia" w:eastAsia="Georgia" w:hAnsi="Georgia"/>
+            <w:sz w:val="20"/>
+            <w:szCs w:val="20"/>
+          </w:rPr>
+          <w:t xml:space="preserve">https://doi.org/10.1017/9781009303538</w:t>
+        </w:r>
+      </w:hyperlink>
+    </w:p>
+    <w:p>
+      <w:pPr>
+        <w:pStyle w:val="ListParagraph"/>
+        <w:numPr>
+          <w:ilvl w:val="0"/>
+          <w:numId w:val="4"/>
+        </w:numPr>
+        <w:spacing w:after="60" w:before="0" w:line="240" w:lineRule="auto"/>
+      </w:pPr>
+      <w:r>
+        <w:rPr>
+          <w:rFonts w:ascii="Georgia" w:cs="Georgia" w:eastAsia="Georgia" w:hAnsi="Georgia"/>
+          <w:sz w:val="20"/>
+          <w:szCs w:val="20"/>
+        </w:rPr>
+        <w:t xml:space="preserve">Schrepel, T. (2025). Decoding the AI Act: Implications for competition law and market dynamics. </w:t>
       </w:r>
       <w:r>
         <w:rPr>
@@ -7657,17 +7432,17 @@
           <w:sz w:val="20"/>
           <w:szCs w:val="20"/>
         </w:rPr>
-        <w:t xml:space="preserve">(3), 374-412. </w:t>
-      </w:r>
-      <w:hyperlink w:history="1" r:id="rIdnm8vj_g0nvlizr06yt4vl">
-        <w:r>
-          <w:rPr>
-            <w:rStyle w:val="Hyperlink"/>
-            <w:rFonts w:ascii="Georgia" w:cs="Georgia" w:eastAsia="Georgia" w:hAnsi="Georgia"/>
-            <w:sz w:val="20"/>
-            <w:szCs w:val="20"/>
-          </w:rPr>
-          <w:t xml:space="preserve">https://doi.org/10.1093/jcle/qhae024</w:t>
+        <w:t xml:space="preserve">(3), 374-389. </w:t>
+      </w:r>
+      <w:hyperlink w:history="1" r:id="rIdidts3hnium5c_nf5ufmns">
+        <w:r>
+          <w:rPr>
+            <w:rStyle w:val="Hyperlink"/>
+            <w:rFonts w:ascii="Georgia" w:cs="Georgia" w:eastAsia="Georgia" w:hAnsi="Georgia"/>
+            <w:sz w:val="20"/>
+            <w:szCs w:val="20"/>
+          </w:rPr>
+          <w:t xml:space="preserve">https://doi.org/10.1093/joclec/nhaf007</w:t>
         </w:r>
       </w:hyperlink>
     </w:p>
@@ -7740,6 +7515,53 @@
           <w:sz w:val="20"/>
           <w:szCs w:val="20"/>
         </w:rPr>
+        <w:t xml:space="preserve">Skitka, L. J., Mosier, K. L., &amp; Burdick, M. (1999). Does automation bias decision-making? </w:t>
+      </w:r>
+      <w:r>
+        <w:rPr>
+          <w:rFonts w:ascii="Georgia" w:cs="Georgia" w:eastAsia="Georgia" w:hAnsi="Georgia"/>
+          <w:i/>
+          <w:iCs/>
+          <w:sz w:val="20"/>
+          <w:szCs w:val="20"/>
+        </w:rPr>
+        <w:t xml:space="preserve">International Journal of Human-Computer Studies, 51</w:t>
+      </w:r>
+      <w:r>
+        <w:rPr>
+          <w:rFonts w:ascii="Georgia" w:cs="Georgia" w:eastAsia="Georgia" w:hAnsi="Georgia"/>
+          <w:sz w:val="20"/>
+          <w:szCs w:val="20"/>
+        </w:rPr>
+        <w:t xml:space="preserve">(5), 991-1006. </w:t>
+      </w:r>
+      <w:hyperlink w:history="1" r:id="rId4fuw2nvqgpvxyotthjz2h">
+        <w:r>
+          <w:rPr>
+            <w:rStyle w:val="Hyperlink"/>
+            <w:rFonts w:ascii="Georgia" w:cs="Georgia" w:eastAsia="Georgia" w:hAnsi="Georgia"/>
+            <w:sz w:val="20"/>
+            <w:szCs w:val="20"/>
+          </w:rPr>
+          <w:t xml:space="preserve">https://doi.org/10.1006/ijhc.1999.0252</w:t>
+        </w:r>
+      </w:hyperlink>
+    </w:p>
+    <w:p>
+      <w:pPr>
+        <w:pStyle w:val="ListParagraph"/>
+        <w:numPr>
+          <w:ilvl w:val="0"/>
+          <w:numId w:val="4"/>
+        </w:numPr>
+        <w:spacing w:after="60" w:before="0" w:line="240" w:lineRule="auto"/>
+      </w:pPr>
+      <w:r>
+        <w:rPr>
+          <w:rFonts w:ascii="Georgia" w:cs="Georgia" w:eastAsia="Georgia" w:hAnsi="Georgia"/>
+          <w:sz w:val="20"/>
+          <w:szCs w:val="20"/>
+        </w:rPr>
         <w:t xml:space="preserve">Sonate. (n.d.). </w:t>
       </w:r>
       <w:r>
@@ -7796,7 +7618,7 @@
         </w:rPr>
         <w:t xml:space="preserve">(9), pgae346. </w:t>
       </w:r>
-      <w:hyperlink w:history="1" r:id="rIdnx4c-iw9y57-0chu9kyzd">
+      <w:hyperlink w:history="1" r:id="rIdtmqm0k_8f-exmfn15njbo">
         <w:r>
           <w:rPr>
             <w:rStyle w:val="Hyperlink"/>
@@ -7967,35 +7789,35 @@
           <w:sz w:val="20"/>
           <w:szCs w:val="20"/>
         </w:rPr>
-        <w:t xml:space="preserve">Zheng, K. (2025). Antitrust in artificial intelligence infrastructure. </w:t>
-      </w:r>
-      <w:r>
-        <w:rPr>
-          <w:rFonts w:ascii="Georgia" w:cs="Georgia" w:eastAsia="Georgia" w:hAnsi="Georgia"/>
-          <w:i/>
-          <w:iCs/>
-          <w:sz w:val="20"/>
-          <w:szCs w:val="20"/>
-        </w:rPr>
-        <w:t xml:space="preserve">Neurocomputing</w:t>
-      </w:r>
-      <w:r>
-        <w:rPr>
-          <w:rFonts w:ascii="Georgia" w:cs="Georgia" w:eastAsia="Georgia" w:hAnsi="Georgia"/>
-          <w:sz w:val="20"/>
-          <w:szCs w:val="20"/>
-        </w:rPr>
-        <w:t xml:space="preserve">. </w:t>
-      </w:r>
-      <w:hyperlink w:history="1" r:id="rIdti3mwgzbptfaswcssmx9y">
-        <w:r>
-          <w:rPr>
-            <w:rStyle w:val="Hyperlink"/>
-            <w:rFonts w:ascii="Georgia" w:cs="Georgia" w:eastAsia="Georgia" w:hAnsi="Georgia"/>
-            <w:sz w:val="20"/>
-            <w:szCs w:val="20"/>
-          </w:rPr>
-          <w:t xml:space="preserve">https://doi.org/10.1016/j.neucom.2025.127235</w:t>
+        <w:t xml:space="preserve">Zheng, K. (2025). Antitrust in artificial intelligence infrastructure: Between regulation and innovation in the EU, the US, and China. </w:t>
+      </w:r>
+      <w:r>
+        <w:rPr>
+          <w:rFonts w:ascii="Georgia" w:cs="Georgia" w:eastAsia="Georgia" w:hAnsi="Georgia"/>
+          <w:i/>
+          <w:iCs/>
+          <w:sz w:val="20"/>
+          <w:szCs w:val="20"/>
+        </w:rPr>
+        <w:t xml:space="preserve">Computer Law &amp; Security Review, 59</w:t>
+      </w:r>
+      <w:r>
+        <w:rPr>
+          <w:rFonts w:ascii="Georgia" w:cs="Georgia" w:eastAsia="Georgia" w:hAnsi="Georgia"/>
+          <w:sz w:val="20"/>
+          <w:szCs w:val="20"/>
+        </w:rPr>
+        <w:t xml:space="preserve">, 106211. </w:t>
+      </w:r>
+      <w:hyperlink w:history="1" r:id="rIdjmnwqyteops7qvnwewzua">
+        <w:r>
+          <w:rPr>
+            <w:rStyle w:val="Hyperlink"/>
+            <w:rFonts w:ascii="Georgia" w:cs="Georgia" w:eastAsia="Georgia" w:hAnsi="Georgia"/>
+            <w:sz w:val="20"/>
+            <w:szCs w:val="20"/>
+          </w:rPr>
+          <w:t xml:space="preserve">https://doi.org/10.1016/j.clsr.2025.106211</w:t>
         </w:r>
       </w:hyperlink>
     </w:p>
@@ -8067,7 +7889,7 @@
         </w:rPr>
         <w:t xml:space="preserve">. basilpuglisi.com. </w:t>
       </w:r>
-      <w:hyperlink w:history="1" r:id="rIdwqx-2yenierilzugvhclf">
+      <w:hyperlink w:history="1" r:id="rIduspe9qt5yxaddzf6etlnh">
         <w:r>
           <w:rPr>
             <w:rStyle w:val="Hyperlink"/>
@@ -8114,7 +7936,7 @@
         </w:rPr>
         <w:t xml:space="preserve">. Google. </w:t>
       </w:r>
-      <w:hyperlink w:history="1" r:id="rIdzozknwh66q89llmtykgwk">
+      <w:hyperlink w:history="1" r:id="rIdkprp_rzmhwhnnstfudrg_">
         <w:r>
           <w:rPr>
             <w:rStyle w:val="Hyperlink"/>
@@ -8158,7 +7980,7 @@
         </w:rPr>
         <w:t xml:space="preserve">. basilpuglisi.com. </w:t>
       </w:r>
-      <w:hyperlink w:history="1" r:id="rIdqcktw3bbk0ny6j9edvpbq">
+      <w:hyperlink w:history="1" r:id="rIds3ykdl1krcvuobdqjztyf">
         <w:r>
           <w:rPr>
             <w:rStyle w:val="Hyperlink"/>
@@ -8205,7 +8027,7 @@
         </w:rPr>
         <w:t xml:space="preserve"> (arXiv:2605.29800). </w:t>
       </w:r>
-      <w:hyperlink w:history="1" r:id="rIdjkqsd-hq5spx2pepa3qlr">
+      <w:hyperlink w:history="1" r:id="rId7w2u3j62gpn1y8al5snyl">
         <w:r>
           <w:rPr>
             <w:rStyle w:val="Hyperlink"/>
@@ -8252,7 +8074,7 @@
         </w:rPr>
         <w:t xml:space="preserve"> (arXiv:2605.00844). </w:t>
       </w:r>
-      <w:hyperlink w:history="1" r:id="rIdxie8km9b9oqarcg4aapsr">
+      <w:hyperlink w:history="1" r:id="rIdj_gip4wfp1bapfdiw7raj">
         <w:r>
           <w:rPr>
             <w:rStyle w:val="Hyperlink"/>
@@ -8296,7 +8118,7 @@
         </w:rPr>
         <w:t xml:space="preserve">. basilpuglisi.com. </w:t>
       </w:r>
-      <w:hyperlink w:history="1" r:id="rIdkgro2tg8ks5puf_4ki3lx">
+      <w:hyperlink w:history="1" r:id="rId9zofdm4jezwki8o8tdsuy">
         <w:r>
           <w:rPr>
             <w:rStyle w:val="Hyperlink"/>
@@ -8340,7 +8162,7 @@
         </w:rPr>
         <w:t xml:space="preserve">. basilpuglisi.com. </w:t>
       </w:r>
-      <w:hyperlink w:history="1" r:id="rIdjzryla0wfsjo62gswfo3f">
+      <w:hyperlink w:history="1" r:id="rIdudwvk3hzuluqmoscffm0s">
         <w:r>
           <w:rPr>
             <w:rStyle w:val="Hyperlink"/>
@@ -8387,7 +8209,7 @@
         </w:rPr>
         <w:t xml:space="preserve">. arXiv. </w:t>
       </w:r>
-      <w:hyperlink w:history="1" r:id="rIdiomtmfxgw8gz5vjxwd2rm">
+      <w:hyperlink w:history="1" r:id="rIdspo3yijozkab9gps7bhvd">
         <w:r>
           <w:rPr>
             <w:rStyle w:val="Hyperlink"/>
@@ -8434,7 +8256,7 @@
         </w:rPr>
         <w:t xml:space="preserve">. </w:t>
       </w:r>
-      <w:hyperlink w:history="1" r:id="rIdlxf8mbttul04qcjhw_zyi">
+      <w:hyperlink w:history="1" r:id="rIdvpkk8jsj9e0-m6jarbjba">
         <w:r>
           <w:rPr>
             <w:rStyle w:val="Hyperlink"/>
@@ -8481,7 +8303,7 @@
         </w:rPr>
         <w:t xml:space="preserve">. </w:t>
       </w:r>
-      <w:hyperlink w:history="1" r:id="rIdclnuc3cfeo4w5pqom-7xu">
+      <w:hyperlink w:history="1" r:id="rIdlmnm4lw6wa729ctjl5k2o">
         <w:r>
           <w:rPr>
             <w:rStyle w:val="Hyperlink"/>
@@ -8528,7 +8350,7 @@
         </w:rPr>
         <w:t xml:space="preserve"> (pp. 1-15). Springer. </w:t>
       </w:r>
-      <w:hyperlink w:history="1" r:id="rIdi0m_2mwmu8ccmftzzpyp3">
+      <w:hyperlink w:history="1" r:id="rIdqgbz1ri0rf28yx32lqhwo">
         <w:r>
           <w:rPr>
             <w:rStyle w:val="Hyperlink"/>
@@ -8575,15 +8397,15 @@
         </w:rPr>
         <w:t xml:space="preserve">. High-Level Expert Group on Artificial Intelligence. </w:t>
       </w:r>
-      <w:hyperlink w:history="1" r:id="rId_u9ywn4kel0c4uwsna_mz">
-        <w:r>
-          <w:rPr>
-            <w:rStyle w:val="Hyperlink"/>
-            <w:rFonts w:ascii="Georgia" w:cs="Georgia" w:eastAsia="Georgia" w:hAnsi="Georgia"/>
-            <w:sz w:val="20"/>
-            <w:szCs w:val="20"/>
-          </w:rPr>
-          <w:t xml:space="preserve">https://www.europarl.europa.eu/cmsdata/196377/AI%20HLEG_Ethics%20Guidelines%20for%20Trustworthy%20AI.pdf</w:t>
+      <w:hyperlink w:history="1" r:id="rIducsrlvzlmdwxbct0ylmwe">
+        <w:r>
+          <w:rPr>
+            <w:rStyle w:val="Hyperlink"/>
+            <w:rFonts w:ascii="Georgia" w:cs="Georgia" w:eastAsia="Georgia" w:hAnsi="Georgia"/>
+            <w:sz w:val="20"/>
+            <w:szCs w:val="20"/>
+          </w:rPr>
+          <w:t xml:space="preserve">https://digital-strategy.ec.europa.eu/en/library/ethics-guidelines-trustworthy-ai</w:t>
         </w:r>
       </w:hyperlink>
     </w:p>
@@ -8622,7 +8444,7 @@
         </w:rPr>
         <w:t xml:space="preserve">. Official Journal of the European Union. </w:t>
       </w:r>
-      <w:hyperlink w:history="1" r:id="rIdpsaavszlxc0mxlsqhd8mg">
+      <w:hyperlink w:history="1" r:id="rId6pd8lnkei0rw07vj-a3wy">
         <w:r>
           <w:rPr>
             <w:rStyle w:val="Hyperlink"/>
@@ -8669,7 +8491,7 @@
         </w:rPr>
         <w:t xml:space="preserve">. </w:t>
       </w:r>
-      <w:hyperlink w:history="1" r:id="rIdqxovhuslqsb8g7vg19omy">
+      <w:hyperlink w:history="1" r:id="rIdme6w40vearwoliizd8yyp">
         <w:r>
           <w:rPr>
             <w:rStyle w:val="Hyperlink"/>
@@ -8716,7 +8538,7 @@
         </w:rPr>
         <w:t xml:space="preserve">(2-3), 61-83. </w:t>
       </w:r>
-      <w:hyperlink w:history="1" r:id="rIdngff-eg3y_pcgbdndwcmw">
+      <w:hyperlink w:history="1" r:id="rIdqqubfsrwascivgtut-tdg">
         <w:r>
           <w:rPr>
             <w:rStyle w:val="Hyperlink"/>
@@ -8763,7 +8585,7 @@
         </w:rPr>
         <w:t xml:space="preserve">. IBM Think. </w:t>
       </w:r>
-      <w:hyperlink w:history="1" r:id="rId4q0utg3k8z847sea1crny">
+      <w:hyperlink w:history="1" r:id="rIdqhf7oscx2a8ieabs0wp4x">
         <w:r>
           <w:rPr>
             <w:rStyle w:val="Hyperlink"/>
@@ -8810,7 +8632,7 @@
         </w:rPr>
         <w:t xml:space="preserve">. </w:t>
       </w:r>
-      <w:hyperlink w:history="1" r:id="rIdmab7qbdi49ranzlj2ivyx">
+      <w:hyperlink w:history="1" r:id="rIdotqziebqgteabuwrk8j6t">
         <w:r>
           <w:rPr>
             <w:rStyle w:val="Hyperlink"/>
@@ -8857,7 +8679,7 @@
         </w:rPr>
         <w:t xml:space="preserve">. </w:t>
       </w:r>
-      <w:hyperlink w:history="1" r:id="rId7gfqnduuw0hbmnt8vzkdo">
+      <w:hyperlink w:history="1" r:id="rIdkc2vtnx2jy06zyufcmdei">
         <w:r>
           <w:rPr>
             <w:rStyle w:val="Hyperlink"/>
@@ -8904,7 +8726,7 @@
         </w:rPr>
         <w:t xml:space="preserve">. arXiv. </w:t>
       </w:r>
-      <w:hyperlink w:history="1" r:id="rId5jl_xhaeysjyxcsosquez">
+      <w:hyperlink w:history="1" r:id="rId2vfxuxp02rrz6dwinbyvd">
         <w:r>
           <w:rPr>
             <w:rStyle w:val="Hyperlink"/>
@@ -8951,7 +8773,7 @@
         </w:rPr>
         <w:t xml:space="preserve">. </w:t>
       </w:r>
-      <w:hyperlink w:history="1" r:id="rId6kcm8gdjoflto1mdlydws">
+      <w:hyperlink w:history="1" r:id="rIdvhkwfe7tmwmdk1f7cahyt">
         <w:r>
           <w:rPr>
             <w:rStyle w:val="Hyperlink"/>
@@ -8998,7 +8820,7 @@
         </w:rPr>
         <w:t xml:space="preserve">. </w:t>
       </w:r>
-      <w:hyperlink w:history="1" r:id="rId-wtbuzyd_ey41dbcu5g2p">
+      <w:hyperlink w:history="1" r:id="rIdhvl7mzbw71eutmuqhzyjh">
         <w:r>
           <w:rPr>
             <w:rStyle w:val="Hyperlink"/>
@@ -9045,7 +8867,7 @@
         </w:rPr>
         <w:t xml:space="preserve">. </w:t>
       </w:r>
-      <w:hyperlink w:history="1" r:id="rId1zmlpesuiselswivm6aep">
+      <w:hyperlink w:history="1" r:id="rIdp4vw2wsbsmaqx2dnci4vc">
         <w:r>
           <w:rPr>
             <w:rStyle w:val="Hyperlink"/>
@@ -9092,7 +8914,7 @@
         </w:rPr>
         <w:t xml:space="preserve">. </w:t>
       </w:r>
-      <w:hyperlink w:history="1" r:id="rIdrtfezfbsdsvwviiorsh33">
+      <w:hyperlink w:history="1" r:id="rIdnosrhthchqaltn8fd2j6b">
         <w:r>
           <w:rPr>
             <w:rStyle w:val="Hyperlink"/>
@@ -9139,7 +8961,7 @@
         </w:rPr>
         <w:t xml:space="preserve">. U.S. Department of Commerce. </w:t>
       </w:r>
-      <w:hyperlink w:history="1" r:id="rIdvyf_sroymte4qwh02khwv">
+      <w:hyperlink w:history="1" r:id="rIdno3xdxfsqbcjix-oqclnh">
         <w:r>
           <w:rPr>
             <w:rStyle w:val="Hyperlink"/>
@@ -9186,7 +9008,7 @@
         </w:rPr>
         <w:t xml:space="preserve">. U.S. Department of Commerce. </w:t>
       </w:r>
-      <w:hyperlink w:history="1" r:id="rId7mejfqhxhihyobsbrux1t">
+      <w:hyperlink w:history="1" r:id="rIdhp0pmq40capstjbkpylbd">
         <w:r>
           <w:rPr>
             <w:rStyle w:val="Hyperlink"/>
@@ -9233,7 +9055,7 @@
         </w:rPr>
         <w:t xml:space="preserve">. </w:t>
       </w:r>
-      <w:hyperlink w:history="1" r:id="rIdr6djjwmu2cs1s5rruwh5n">
+      <w:hyperlink w:history="1" r:id="rIdfm5p-_ovz9kyif9bmhvrn">
         <w:r>
           <w:rPr>
             <w:rStyle w:val="Hyperlink"/>
@@ -9280,7 +9102,7 @@
         </w:rPr>
         <w:t xml:space="preserve">. </w:t>
       </w:r>
-      <w:hyperlink w:history="1" r:id="rIdjcoipshvebrdvlaoqcul-">
+      <w:hyperlink w:history="1" r:id="rId7i-rxrlbisytdkhtzp_p5">
         <w:r>
           <w:rPr>
             <w:rStyle w:val="Hyperlink"/>
@@ -9327,7 +9149,7 @@
         </w:rPr>
         <w:t xml:space="preserve">. Oxford University Press. </w:t>
       </w:r>
-      <w:hyperlink w:history="1" r:id="rIdtuese8du40bwpmaiszmcm">
+      <w:hyperlink w:history="1" r:id="rIdwbwaq84xzbxtdx4wnyiya">
         <w:r>
           <w:rPr>
             <w:rStyle w:val="Hyperlink"/>
@@ -9374,7 +9196,7 @@
         </w:rPr>
         <w:t xml:space="preserve">. Amanpour and Company. </w:t>
       </w:r>
-      <w:hyperlink w:history="1" r:id="rId_tfeckvpqbqrtwu98bo8w">
+      <w:hyperlink w:history="1" r:id="rIdqz_ku81ud1qegmanap86a">
         <w:r>
           <w:rPr>
             <w:rStyle w:val="Hyperlink"/>
@@ -9421,7 +9243,7 @@
         </w:rPr>
         <w:t xml:space="preserve">(9), pgae346. </w:t>
       </w:r>
-      <w:hyperlink w:history="1" r:id="rIdygfeujur9zxuf-2t6o2gc">
+      <w:hyperlink w:history="1" r:id="rIdqk040xprdw3ssv4_5a3ya">
         <w:r>
           <w:rPr>
             <w:rStyle w:val="Hyperlink"/>
@@ -9468,15 +9290,15 @@
         </w:rPr>
         <w:t xml:space="preserve">. </w:t>
       </w:r>
-      <w:hyperlink w:history="1" r:id="rIdonnipfgn7mzy_ah5qnmto">
-        <w:r>
-          <w:rPr>
-            <w:rStyle w:val="Hyperlink"/>
-            <w:rFonts w:ascii="Georgia" w:cs="Georgia" w:eastAsia="Georgia" w:hAnsi="Georgia"/>
-            <w:sz w:val="20"/>
-            <w:szCs w:val="20"/>
-          </w:rPr>
-          <w:t xml:space="preserve">https://unesdoc.unesco.org/ark:/48223/pf0000380455</w:t>
+      <w:hyperlink w:history="1" r:id="rId4a1vnxmyy7t6etvtm3e-2">
+        <w:r>
+          <w:rPr>
+            <w:rStyle w:val="Hyperlink"/>
+            <w:rFonts w:ascii="Georgia" w:cs="Georgia" w:eastAsia="Georgia" w:hAnsi="Georgia"/>
+            <w:sz w:val="20"/>
+            <w:szCs w:val="20"/>
+          </w:rPr>
+          <w:t xml:space="preserve">https://www.unesco.org/en/legal-affairs/recommendation-ethics-artificial-intelligence</w:t>
         </w:r>
       </w:hyperlink>
     </w:p>

</xml_diff>